<commit_message>
Single appendix, figure captions, defect circles, fix wait + messages
- Single 'Appendix: Site Photographs' section (removed A/B split)
- Figure captions: 'Figure 1: user comment' in italic below each photo
- Auto-draw red defect circle using Claude Vision + Pillow when photo has caption
- Fix wait: use 'wait' in content (not exact match) so partial phrases work
- Updated done/wait/success messages per spec

Co-Authored-By: Claude Sonnet 4.6 <noreply@anthropic.com>
</commit_message>
<xml_diff>
--- a/casad_template.docx
+++ b/casad_template.docx
@@ -7281,7 +7281,7 @@
           <w:color w:val="1F3864"/>
           <w:sz w:val="24"/>
         </w:rPr>
-        <w:t>Appendix: (A) — Site Photographs (General)</w:t>
+        <w:t>Appendix: Site Photographs</w:t>
       </w:r>
     </w:p>
     <w:p>
@@ -7294,38 +7294,7 @@
           <w:color w:val="AAAAAA"/>
           <w:sz w:val="18"/>
         </w:rPr>
-        <w:t>[[PHOTO_APPENDIX_A]]</w:t>
-      </w:r>
-    </w:p>
-    <w:p>
-      <w:r>
-        <w:br w:type="page"/>
-      </w:r>
-    </w:p>
-    <w:p>
-      <w:pPr>
-        <w:jc w:val="center"/>
-      </w:pPr>
-      <w:r>
-        <w:rPr>
-          <w:b/>
-          <w:color w:val="1F3864"/>
-          <w:sz w:val="24"/>
-        </w:rPr>
-        <w:t>Appendix: (B) — Damage / Distressing Photographs</w:t>
-      </w:r>
-    </w:p>
-    <w:p>
-      <w:pPr>
-        <w:jc w:val="center"/>
-      </w:pPr>
-      <w:r>
-        <w:rPr>
-          <w:i/>
-          <w:color w:val="AAAAAA"/>
-          <w:sz w:val="18"/>
-        </w:rPr>
-        <w:t>[[PHOTO_APPENDIX_B]]</w:t>
+        <w:t>[[PHOTO_APPENDIX]]</w:t>
       </w:r>
     </w:p>
     <w:sectPr>

</xml_diff>

<commit_message>
Add two-section appendix, photo titles/categories, updated welcome message
- create_template.py: split Appendix into A (General Site Pictures) and B (Damage/Distressing)
- report_gen.py: route photos to APPENDIX_A/B via category; use photo_titles for figure captions
- ai_parse.py: add photo_categories ('general'/'damage') classification by Claude; add photo_titles/photo_categories to SCHEMA
- server.py: update welcome message to mention general vs damage photo distinction

Co-Authored-By: Claude Sonnet 4.6 <noreply@anthropic.com>
</commit_message>
<xml_diff>
--- a/casad_template.docx
+++ b/casad_template.docx
@@ -7281,7 +7281,7 @@
           <w:color w:val="1F3864"/>
           <w:sz w:val="24"/>
         </w:rPr>
-        <w:t>Appendix: Site Photographs</w:t>
+        <w:t>Appendix A: General Site Pictures</w:t>
       </w:r>
     </w:p>
     <w:p>
@@ -7294,7 +7294,38 @@
           <w:color w:val="AAAAAA"/>
           <w:sz w:val="18"/>
         </w:rPr>
-        <w:t>[[PHOTO_APPENDIX]]</w:t>
+        <w:t>[[PHOTO_APPENDIX_A]]</w:t>
+      </w:r>
+    </w:p>
+    <w:p>
+      <w:r>
+        <w:br w:type="page"/>
+      </w:r>
+    </w:p>
+    <w:p>
+      <w:pPr>
+        <w:jc w:val="center"/>
+      </w:pPr>
+      <w:r>
+        <w:rPr>
+          <w:b/>
+          <w:color w:val="1F3864"/>
+          <w:sz w:val="24"/>
+        </w:rPr>
+        <w:t>Appendix B: Damage / Distressing Photographs</w:t>
+      </w:r>
+    </w:p>
+    <w:p>
+      <w:pPr>
+        <w:jc w:val="center"/>
+      </w:pPr>
+      <w:r>
+        <w:rPr>
+          <w:i/>
+          <w:color w:val="AAAAAA"/>
+          <w:sz w:val="18"/>
+        </w:rPr>
+        <w:t>[[PHOTO_APPENDIX_B]]</w:t>
       </w:r>
     </w:p>
     <w:sectPr>

</xml_diff>

<commit_message>
Narrow SR column; add bridge details form appendix
</commit_message>
<xml_diff>
--- a/casad_template.docx
+++ b/casad_template.docx
@@ -44,7 +44,7 @@
       <w:tr>
         <w:tc>
           <w:tcPr>
-            <w:tcW w:type="dxa" w:w="680"/>
+            <w:tcW w:type="dxa" w:w="397"/>
             <w:shd w:val="clear" w:color="auto" w:fill="1F3864"/>
             <w:tcBorders>
               <w:top w:val="single" w:sz="4" w:space="0" w:color="FFFFFF"/>
@@ -72,7 +72,7 @@
         </w:tc>
         <w:tc>
           <w:tcPr>
-            <w:tcW w:type="dxa" w:w="4139"/>
+            <w:tcW w:type="dxa" w:w="4252"/>
             <w:shd w:val="clear" w:color="auto" w:fill="1F3864"/>
             <w:tcBorders>
               <w:top w:val="single" w:sz="4" w:space="0" w:color="FFFFFF"/>
@@ -98,7 +98,7 @@
         </w:tc>
         <w:tc>
           <w:tcPr>
-            <w:tcW w:type="dxa" w:w="4819"/>
+            <w:tcW w:type="dxa" w:w="4989"/>
             <w:shd w:val="clear" w:color="auto" w:fill="1F3864"/>
             <w:tcBorders>
               <w:top w:val="single" w:sz="4" w:space="0" w:color="FFFFFF"/>
@@ -126,7 +126,7 @@
       <w:tr>
         <w:tc>
           <w:tcPr>
-            <w:tcW w:type="dxa" w:w="4819"/>
+            <w:tcW w:type="dxa" w:w="4989"/>
             <w:gridSpan w:val="3"/>
             <w:shd w:val="clear" w:color="auto" w:fill="1F3864"/>
             <w:tcBorders>
@@ -155,7 +155,7 @@
       <w:tr>
         <w:tc>
           <w:tcPr>
-            <w:tcW w:type="dxa" w:w="680"/>
+            <w:tcW w:type="dxa" w:w="397"/>
             <w:shd w:val="clear" w:color="auto" w:fill="FFFFFF"/>
             <w:tcBorders>
               <w:top w:val="single" w:sz="4" w:space="0" w:color="AAAAAA"/>
@@ -181,7 +181,7 @@
         </w:tc>
         <w:tc>
           <w:tcPr>
-            <w:tcW w:type="dxa" w:w="4139"/>
+            <w:tcW w:type="dxa" w:w="4252"/>
             <w:shd w:val="clear" w:color="auto" w:fill="FFFFFF"/>
             <w:tcBorders>
               <w:top w:val="single" w:sz="4" w:space="0" w:color="AAAAAA"/>
@@ -207,7 +207,7 @@
         </w:tc>
         <w:tc>
           <w:tcPr>
-            <w:tcW w:type="dxa" w:w="4819"/>
+            <w:tcW w:type="dxa" w:w="4989"/>
             <w:shd w:val="clear" w:color="auto" w:fill="FFFFFF"/>
             <w:tcBorders>
               <w:top w:val="single" w:sz="4" w:space="0" w:color="AAAAAA"/>
@@ -235,7 +235,7 @@
       <w:tr>
         <w:tc>
           <w:tcPr>
-            <w:tcW w:type="dxa" w:w="680"/>
+            <w:tcW w:type="dxa" w:w="397"/>
             <w:shd w:val="clear" w:color="auto" w:fill="FFFFFF"/>
             <w:tcBorders>
               <w:top w:val="single" w:sz="4" w:space="0" w:color="AAAAAA"/>
@@ -261,7 +261,7 @@
         </w:tc>
         <w:tc>
           <w:tcPr>
-            <w:tcW w:type="dxa" w:w="4139"/>
+            <w:tcW w:type="dxa" w:w="4252"/>
             <w:shd w:val="clear" w:color="auto" w:fill="FFFFFF"/>
             <w:tcBorders>
               <w:top w:val="single" w:sz="4" w:space="0" w:color="AAAAAA"/>
@@ -287,7 +287,7 @@
         </w:tc>
         <w:tc>
           <w:tcPr>
-            <w:tcW w:type="dxa" w:w="4819"/>
+            <w:tcW w:type="dxa" w:w="4989"/>
             <w:shd w:val="clear" w:color="auto" w:fill="FFFFFF"/>
             <w:tcBorders>
               <w:top w:val="single" w:sz="4" w:space="0" w:color="AAAAAA"/>
@@ -315,7 +315,7 @@
       <w:tr>
         <w:tc>
           <w:tcPr>
-            <w:tcW w:type="dxa" w:w="680"/>
+            <w:tcW w:type="dxa" w:w="397"/>
             <w:shd w:val="clear" w:color="auto" w:fill="FFFFFF"/>
             <w:tcBorders>
               <w:top w:val="single" w:sz="4" w:space="0" w:color="AAAAAA"/>
@@ -341,7 +341,7 @@
         </w:tc>
         <w:tc>
           <w:tcPr>
-            <w:tcW w:type="dxa" w:w="4139"/>
+            <w:tcW w:type="dxa" w:w="4252"/>
             <w:shd w:val="clear" w:color="auto" w:fill="FFFFFF"/>
             <w:tcBorders>
               <w:top w:val="single" w:sz="4" w:space="0" w:color="AAAAAA"/>
@@ -371,7 +371,7 @@
         </w:tc>
         <w:tc>
           <w:tcPr>
-            <w:tcW w:type="dxa" w:w="4819"/>
+            <w:tcW w:type="dxa" w:w="4989"/>
             <w:shd w:val="clear" w:color="auto" w:fill="FFFFFF"/>
             <w:tcBorders>
               <w:top w:val="single" w:sz="4" w:space="0" w:color="AAAAAA"/>
@@ -403,7 +403,7 @@
       <w:tr>
         <w:tc>
           <w:tcPr>
-            <w:tcW w:type="dxa" w:w="680"/>
+            <w:tcW w:type="dxa" w:w="397"/>
             <w:shd w:val="clear" w:color="auto" w:fill="FFFFFF"/>
             <w:tcBorders>
               <w:top w:val="single" w:sz="4" w:space="0" w:color="AAAAAA"/>
@@ -429,7 +429,7 @@
         </w:tc>
         <w:tc>
           <w:tcPr>
-            <w:tcW w:type="dxa" w:w="4139"/>
+            <w:tcW w:type="dxa" w:w="4252"/>
             <w:shd w:val="clear" w:color="auto" w:fill="FFFFFF"/>
             <w:tcBorders>
               <w:top w:val="single" w:sz="4" w:space="0" w:color="AAAAAA"/>
@@ -459,7 +459,7 @@
         </w:tc>
         <w:tc>
           <w:tcPr>
-            <w:tcW w:type="dxa" w:w="4819"/>
+            <w:tcW w:type="dxa" w:w="4989"/>
             <w:shd w:val="clear" w:color="auto" w:fill="FFFFFF"/>
             <w:tcBorders>
               <w:top w:val="single" w:sz="4" w:space="0" w:color="AAAAAA"/>
@@ -491,7 +491,7 @@
       <w:tr>
         <w:tc>
           <w:tcPr>
-            <w:tcW w:type="dxa" w:w="680"/>
+            <w:tcW w:type="dxa" w:w="397"/>
             <w:shd w:val="clear" w:color="auto" w:fill="FFFFFF"/>
             <w:tcBorders>
               <w:top w:val="single" w:sz="4" w:space="0" w:color="AAAAAA"/>
@@ -517,7 +517,7 @@
         </w:tc>
         <w:tc>
           <w:tcPr>
-            <w:tcW w:type="dxa" w:w="4139"/>
+            <w:tcW w:type="dxa" w:w="4252"/>
             <w:shd w:val="clear" w:color="auto" w:fill="FFFFFF"/>
             <w:tcBorders>
               <w:top w:val="single" w:sz="4" w:space="0" w:color="AAAAAA"/>
@@ -543,7 +543,7 @@
         </w:tc>
         <w:tc>
           <w:tcPr>
-            <w:tcW w:type="dxa" w:w="4819"/>
+            <w:tcW w:type="dxa" w:w="4989"/>
             <w:shd w:val="clear" w:color="auto" w:fill="FFFFFF"/>
             <w:tcBorders>
               <w:top w:val="single" w:sz="4" w:space="0" w:color="AAAAAA"/>
@@ -571,7 +571,7 @@
       <w:tr>
         <w:tc>
           <w:tcPr>
-            <w:tcW w:type="dxa" w:w="680"/>
+            <w:tcW w:type="dxa" w:w="397"/>
             <w:shd w:val="clear" w:color="auto" w:fill="FFFFFF"/>
             <w:tcBorders>
               <w:top w:val="single" w:sz="4" w:space="0" w:color="AAAAAA"/>
@@ -597,7 +597,7 @@
         </w:tc>
         <w:tc>
           <w:tcPr>
-            <w:tcW w:type="dxa" w:w="4139"/>
+            <w:tcW w:type="dxa" w:w="4252"/>
             <w:shd w:val="clear" w:color="auto" w:fill="FFFFFF"/>
             <w:tcBorders>
               <w:top w:val="single" w:sz="4" w:space="0" w:color="AAAAAA"/>
@@ -623,7 +623,7 @@
         </w:tc>
         <w:tc>
           <w:tcPr>
-            <w:tcW w:type="dxa" w:w="4819"/>
+            <w:tcW w:type="dxa" w:w="4989"/>
             <w:shd w:val="clear" w:color="auto" w:fill="FFFFFF"/>
             <w:tcBorders>
               <w:top w:val="single" w:sz="4" w:space="0" w:color="AAAAAA"/>
@@ -651,7 +651,7 @@
       <w:tr>
         <w:tc>
           <w:tcPr>
-            <w:tcW w:type="dxa" w:w="680"/>
+            <w:tcW w:type="dxa" w:w="397"/>
             <w:shd w:val="clear" w:color="auto" w:fill="FFFFFF"/>
             <w:tcBorders>
               <w:top w:val="single" w:sz="4" w:space="0" w:color="AAAAAA"/>
@@ -677,7 +677,7 @@
         </w:tc>
         <w:tc>
           <w:tcPr>
-            <w:tcW w:type="dxa" w:w="4139"/>
+            <w:tcW w:type="dxa" w:w="4252"/>
             <w:shd w:val="clear" w:color="auto" w:fill="FFFFFF"/>
             <w:tcBorders>
               <w:top w:val="single" w:sz="4" w:space="0" w:color="AAAAAA"/>
@@ -705,7 +705,7 @@
         </w:tc>
         <w:tc>
           <w:tcPr>
-            <w:tcW w:type="dxa" w:w="4819"/>
+            <w:tcW w:type="dxa" w:w="4989"/>
             <w:shd w:val="clear" w:color="auto" w:fill="FFFFFF"/>
             <w:tcBorders>
               <w:top w:val="single" w:sz="4" w:space="0" w:color="AAAAAA"/>
@@ -733,7 +733,7 @@
       <w:tr>
         <w:tc>
           <w:tcPr>
-            <w:tcW w:type="dxa" w:w="680"/>
+            <w:tcW w:type="dxa" w:w="397"/>
             <w:shd w:val="clear" w:color="auto" w:fill="FFFFFF"/>
             <w:tcBorders>
               <w:top w:val="single" w:sz="4" w:space="0" w:color="AAAAAA"/>
@@ -759,7 +759,7 @@
         </w:tc>
         <w:tc>
           <w:tcPr>
-            <w:tcW w:type="dxa" w:w="4139"/>
+            <w:tcW w:type="dxa" w:w="4252"/>
             <w:shd w:val="clear" w:color="auto" w:fill="FFFFFF"/>
             <w:tcBorders>
               <w:top w:val="single" w:sz="4" w:space="0" w:color="AAAAAA"/>
@@ -785,7 +785,7 @@
         </w:tc>
         <w:tc>
           <w:tcPr>
-            <w:tcW w:type="dxa" w:w="4819"/>
+            <w:tcW w:type="dxa" w:w="4989"/>
             <w:shd w:val="clear" w:color="auto" w:fill="FFFFFF"/>
             <w:tcBorders>
               <w:top w:val="single" w:sz="4" w:space="0" w:color="AAAAAA"/>
@@ -813,7 +813,7 @@
       <w:tr>
         <w:tc>
           <w:tcPr>
-            <w:tcW w:type="dxa" w:w="680"/>
+            <w:tcW w:type="dxa" w:w="397"/>
             <w:shd w:val="clear" w:color="auto" w:fill="FFFFFF"/>
             <w:tcBorders>
               <w:top w:val="single" w:sz="4" w:space="0" w:color="AAAAAA"/>
@@ -839,7 +839,7 @@
         </w:tc>
         <w:tc>
           <w:tcPr>
-            <w:tcW w:type="dxa" w:w="4139"/>
+            <w:tcW w:type="dxa" w:w="4252"/>
             <w:shd w:val="clear" w:color="auto" w:fill="FFFFFF"/>
             <w:tcBorders>
               <w:top w:val="single" w:sz="4" w:space="0" w:color="AAAAAA"/>
@@ -865,7 +865,7 @@
         </w:tc>
         <w:tc>
           <w:tcPr>
-            <w:tcW w:type="dxa" w:w="4819"/>
+            <w:tcW w:type="dxa" w:w="4989"/>
             <w:shd w:val="clear" w:color="auto" w:fill="FFFFFF"/>
             <w:tcBorders>
               <w:top w:val="single" w:sz="4" w:space="0" w:color="AAAAAA"/>
@@ -893,7 +893,7 @@
       <w:tr>
         <w:tc>
           <w:tcPr>
-            <w:tcW w:type="dxa" w:w="680"/>
+            <w:tcW w:type="dxa" w:w="397"/>
             <w:shd w:val="clear" w:color="auto" w:fill="FFFFFF"/>
             <w:tcBorders>
               <w:top w:val="single" w:sz="4" w:space="0" w:color="AAAAAA"/>
@@ -919,7 +919,7 @@
         </w:tc>
         <w:tc>
           <w:tcPr>
-            <w:tcW w:type="dxa" w:w="4139"/>
+            <w:tcW w:type="dxa" w:w="4252"/>
             <w:shd w:val="clear" w:color="auto" w:fill="FFFFFF"/>
             <w:tcBorders>
               <w:top w:val="single" w:sz="4" w:space="0" w:color="AAAAAA"/>
@@ -945,7 +945,7 @@
         </w:tc>
         <w:tc>
           <w:tcPr>
-            <w:tcW w:type="dxa" w:w="4819"/>
+            <w:tcW w:type="dxa" w:w="4989"/>
             <w:shd w:val="clear" w:color="auto" w:fill="FFFFFF"/>
             <w:tcBorders>
               <w:top w:val="single" w:sz="4" w:space="0" w:color="AAAAAA"/>
@@ -973,7 +973,7 @@
       <w:tr>
         <w:tc>
           <w:tcPr>
-            <w:tcW w:type="dxa" w:w="680"/>
+            <w:tcW w:type="dxa" w:w="397"/>
             <w:shd w:val="clear" w:color="auto" w:fill="FFFFFF"/>
             <w:tcBorders>
               <w:top w:val="single" w:sz="4" w:space="0" w:color="AAAAAA"/>
@@ -999,7 +999,7 @@
         </w:tc>
         <w:tc>
           <w:tcPr>
-            <w:tcW w:type="dxa" w:w="4139"/>
+            <w:tcW w:type="dxa" w:w="4252"/>
             <w:shd w:val="clear" w:color="auto" w:fill="FFFFFF"/>
             <w:tcBorders>
               <w:top w:val="single" w:sz="4" w:space="0" w:color="AAAAAA"/>
@@ -1025,7 +1025,7 @@
         </w:tc>
         <w:tc>
           <w:tcPr>
-            <w:tcW w:type="dxa" w:w="4819"/>
+            <w:tcW w:type="dxa" w:w="4989"/>
             <w:shd w:val="clear" w:color="auto" w:fill="FFFFFF"/>
             <w:tcBorders>
               <w:top w:val="single" w:sz="4" w:space="0" w:color="AAAAAA"/>
@@ -1053,7 +1053,7 @@
       <w:tr>
         <w:tc>
           <w:tcPr>
-            <w:tcW w:type="dxa" w:w="680"/>
+            <w:tcW w:type="dxa" w:w="397"/>
             <w:shd w:val="clear" w:color="auto" w:fill="FFFFFF"/>
             <w:tcBorders>
               <w:top w:val="single" w:sz="4" w:space="0" w:color="AAAAAA"/>
@@ -1079,7 +1079,7 @@
         </w:tc>
         <w:tc>
           <w:tcPr>
-            <w:tcW w:type="dxa" w:w="4139"/>
+            <w:tcW w:type="dxa" w:w="4252"/>
             <w:shd w:val="clear" w:color="auto" w:fill="FFFFFF"/>
             <w:tcBorders>
               <w:top w:val="single" w:sz="4" w:space="0" w:color="AAAAAA"/>
@@ -1105,7 +1105,7 @@
         </w:tc>
         <w:tc>
           <w:tcPr>
-            <w:tcW w:type="dxa" w:w="4819"/>
+            <w:tcW w:type="dxa" w:w="4989"/>
             <w:shd w:val="clear" w:color="auto" w:fill="FFFFFF"/>
             <w:tcBorders>
               <w:top w:val="single" w:sz="4" w:space="0" w:color="AAAAAA"/>
@@ -1133,7 +1133,7 @@
       <w:tr>
         <w:tc>
           <w:tcPr>
-            <w:tcW w:type="dxa" w:w="680"/>
+            <w:tcW w:type="dxa" w:w="397"/>
             <w:shd w:val="clear" w:color="auto" w:fill="FFFFFF"/>
             <w:tcBorders>
               <w:top w:val="single" w:sz="4" w:space="0" w:color="AAAAAA"/>
@@ -1159,7 +1159,7 @@
         </w:tc>
         <w:tc>
           <w:tcPr>
-            <w:tcW w:type="dxa" w:w="4139"/>
+            <w:tcW w:type="dxa" w:w="4252"/>
             <w:shd w:val="clear" w:color="auto" w:fill="FFFFFF"/>
             <w:tcBorders>
               <w:top w:val="single" w:sz="4" w:space="0" w:color="AAAAAA"/>
@@ -1185,7 +1185,7 @@
         </w:tc>
         <w:tc>
           <w:tcPr>
-            <w:tcW w:type="dxa" w:w="4819"/>
+            <w:tcW w:type="dxa" w:w="4989"/>
             <w:shd w:val="clear" w:color="auto" w:fill="FFFFFF"/>
             <w:tcBorders>
               <w:top w:val="single" w:sz="4" w:space="0" w:color="AAAAAA"/>
@@ -1213,7 +1213,7 @@
       <w:tr>
         <w:tc>
           <w:tcPr>
-            <w:tcW w:type="dxa" w:w="680"/>
+            <w:tcW w:type="dxa" w:w="397"/>
             <w:shd w:val="clear" w:color="auto" w:fill="FFFFFF"/>
             <w:tcBorders>
               <w:top w:val="single" w:sz="4" w:space="0" w:color="AAAAAA"/>
@@ -1239,7 +1239,7 @@
         </w:tc>
         <w:tc>
           <w:tcPr>
-            <w:tcW w:type="dxa" w:w="4139"/>
+            <w:tcW w:type="dxa" w:w="4252"/>
             <w:shd w:val="clear" w:color="auto" w:fill="FFFFFF"/>
             <w:tcBorders>
               <w:top w:val="single" w:sz="4" w:space="0" w:color="AAAAAA"/>
@@ -1267,7 +1267,7 @@
         </w:tc>
         <w:tc>
           <w:tcPr>
-            <w:tcW w:type="dxa" w:w="4819"/>
+            <w:tcW w:type="dxa" w:w="4989"/>
             <w:shd w:val="clear" w:color="auto" w:fill="FFFFFF"/>
             <w:tcBorders>
               <w:top w:val="single" w:sz="4" w:space="0" w:color="AAAAAA"/>
@@ -1295,7 +1295,7 @@
       <w:tr>
         <w:tc>
           <w:tcPr>
-            <w:tcW w:type="dxa" w:w="680"/>
+            <w:tcW w:type="dxa" w:w="397"/>
             <w:shd w:val="clear" w:color="auto" w:fill="FFFFFF"/>
             <w:tcBorders>
               <w:top w:val="single" w:sz="4" w:space="0" w:color="AAAAAA"/>
@@ -1321,7 +1321,7 @@
         </w:tc>
         <w:tc>
           <w:tcPr>
-            <w:tcW w:type="dxa" w:w="4139"/>
+            <w:tcW w:type="dxa" w:w="4252"/>
             <w:shd w:val="clear" w:color="auto" w:fill="FFFFFF"/>
             <w:tcBorders>
               <w:top w:val="single" w:sz="4" w:space="0" w:color="AAAAAA"/>
@@ -1347,7 +1347,7 @@
         </w:tc>
         <w:tc>
           <w:tcPr>
-            <w:tcW w:type="dxa" w:w="4819"/>
+            <w:tcW w:type="dxa" w:w="4989"/>
             <w:shd w:val="clear" w:color="auto" w:fill="FFFFFF"/>
             <w:tcBorders>
               <w:top w:val="single" w:sz="4" w:space="0" w:color="AAAAAA"/>
@@ -1375,7 +1375,7 @@
       <w:tr>
         <w:tc>
           <w:tcPr>
-            <w:tcW w:type="dxa" w:w="680"/>
+            <w:tcW w:type="dxa" w:w="397"/>
             <w:shd w:val="clear" w:color="auto" w:fill="FFFFFF"/>
             <w:tcBorders>
               <w:top w:val="single" w:sz="4" w:space="0" w:color="AAAAAA"/>
@@ -1401,7 +1401,7 @@
         </w:tc>
         <w:tc>
           <w:tcPr>
-            <w:tcW w:type="dxa" w:w="4139"/>
+            <w:tcW w:type="dxa" w:w="4252"/>
             <w:shd w:val="clear" w:color="auto" w:fill="FFFFFF"/>
             <w:tcBorders>
               <w:top w:val="single" w:sz="4" w:space="0" w:color="AAAAAA"/>
@@ -1427,7 +1427,7 @@
         </w:tc>
         <w:tc>
           <w:tcPr>
-            <w:tcW w:type="dxa" w:w="4819"/>
+            <w:tcW w:type="dxa" w:w="4989"/>
             <w:shd w:val="clear" w:color="auto" w:fill="FFFFFF"/>
             <w:tcBorders>
               <w:top w:val="single" w:sz="4" w:space="0" w:color="AAAAAA"/>
@@ -1455,7 +1455,7 @@
       <w:tr>
         <w:tc>
           <w:tcPr>
-            <w:tcW w:type="dxa" w:w="680"/>
+            <w:tcW w:type="dxa" w:w="397"/>
             <w:shd w:val="clear" w:color="auto" w:fill="FFFFFF"/>
             <w:tcBorders>
               <w:top w:val="single" w:sz="4" w:space="0" w:color="AAAAAA"/>
@@ -1481,7 +1481,7 @@
         </w:tc>
         <w:tc>
           <w:tcPr>
-            <w:tcW w:type="dxa" w:w="4139"/>
+            <w:tcW w:type="dxa" w:w="4252"/>
             <w:shd w:val="clear" w:color="auto" w:fill="FFFFFF"/>
             <w:tcBorders>
               <w:top w:val="single" w:sz="4" w:space="0" w:color="AAAAAA"/>
@@ -1507,7 +1507,7 @@
         </w:tc>
         <w:tc>
           <w:tcPr>
-            <w:tcW w:type="dxa" w:w="4819"/>
+            <w:tcW w:type="dxa" w:w="4989"/>
             <w:shd w:val="clear" w:color="auto" w:fill="FFFFFF"/>
             <w:tcBorders>
               <w:top w:val="single" w:sz="4" w:space="0" w:color="AAAAAA"/>
@@ -1535,7 +1535,7 @@
       <w:tr>
         <w:tc>
           <w:tcPr>
-            <w:tcW w:type="dxa" w:w="680"/>
+            <w:tcW w:type="dxa" w:w="397"/>
             <w:shd w:val="clear" w:color="auto" w:fill="FFFFFF"/>
             <w:tcBorders>
               <w:top w:val="single" w:sz="4" w:space="0" w:color="AAAAAA"/>
@@ -1561,7 +1561,7 @@
         </w:tc>
         <w:tc>
           <w:tcPr>
-            <w:tcW w:type="dxa" w:w="4139"/>
+            <w:tcW w:type="dxa" w:w="4252"/>
             <w:shd w:val="clear" w:color="auto" w:fill="FFFFFF"/>
             <w:tcBorders>
               <w:top w:val="single" w:sz="4" w:space="0" w:color="AAAAAA"/>
@@ -1587,7 +1587,7 @@
         </w:tc>
         <w:tc>
           <w:tcPr>
-            <w:tcW w:type="dxa" w:w="4819"/>
+            <w:tcW w:type="dxa" w:w="4989"/>
             <w:shd w:val="clear" w:color="auto" w:fill="FFFFFF"/>
             <w:tcBorders>
               <w:top w:val="single" w:sz="4" w:space="0" w:color="AAAAAA"/>
@@ -1615,7 +1615,7 @@
       <w:tr>
         <w:tc>
           <w:tcPr>
-            <w:tcW w:type="dxa" w:w="680"/>
+            <w:tcW w:type="dxa" w:w="397"/>
             <w:shd w:val="clear" w:color="auto" w:fill="FFFFFF"/>
             <w:tcBorders>
               <w:top w:val="single" w:sz="4" w:space="0" w:color="AAAAAA"/>
@@ -1641,7 +1641,7 @@
         </w:tc>
         <w:tc>
           <w:tcPr>
-            <w:tcW w:type="dxa" w:w="4139"/>
+            <w:tcW w:type="dxa" w:w="4252"/>
             <w:shd w:val="clear" w:color="auto" w:fill="FFFFFF"/>
             <w:tcBorders>
               <w:top w:val="single" w:sz="4" w:space="0" w:color="AAAAAA"/>
@@ -1667,7 +1667,7 @@
         </w:tc>
         <w:tc>
           <w:tcPr>
-            <w:tcW w:type="dxa" w:w="4819"/>
+            <w:tcW w:type="dxa" w:w="4989"/>
             <w:shd w:val="clear" w:color="auto" w:fill="FFFFFF"/>
             <w:tcBorders>
               <w:top w:val="single" w:sz="4" w:space="0" w:color="AAAAAA"/>
@@ -1695,7 +1695,7 @@
       <w:tr>
         <w:tc>
           <w:tcPr>
-            <w:tcW w:type="dxa" w:w="680"/>
+            <w:tcW w:type="dxa" w:w="397"/>
             <w:shd w:val="clear" w:color="auto" w:fill="FFFFFF"/>
             <w:tcBorders>
               <w:top w:val="single" w:sz="4" w:space="0" w:color="AAAAAA"/>
@@ -1721,7 +1721,7 @@
         </w:tc>
         <w:tc>
           <w:tcPr>
-            <w:tcW w:type="dxa" w:w="4139"/>
+            <w:tcW w:type="dxa" w:w="4252"/>
             <w:shd w:val="clear" w:color="auto" w:fill="FFFFFF"/>
             <w:tcBorders>
               <w:top w:val="single" w:sz="4" w:space="0" w:color="AAAAAA"/>
@@ -1747,7 +1747,7 @@
         </w:tc>
         <w:tc>
           <w:tcPr>
-            <w:tcW w:type="dxa" w:w="4819"/>
+            <w:tcW w:type="dxa" w:w="4989"/>
             <w:shd w:val="clear" w:color="auto" w:fill="FFFFFF"/>
             <w:tcBorders>
               <w:top w:val="single" w:sz="4" w:space="0" w:color="AAAAAA"/>
@@ -1775,7 +1775,7 @@
       <w:tr>
         <w:tc>
           <w:tcPr>
-            <w:tcW w:type="dxa" w:w="4819"/>
+            <w:tcW w:type="dxa" w:w="4989"/>
             <w:gridSpan w:val="3"/>
             <w:shd w:val="clear" w:color="auto" w:fill="1F3864"/>
             <w:tcBorders>
@@ -1804,7 +1804,7 @@
       <w:tr>
         <w:tc>
           <w:tcPr>
-            <w:tcW w:type="dxa" w:w="680"/>
+            <w:tcW w:type="dxa" w:w="397"/>
             <w:shd w:val="clear" w:color="auto" w:fill="FFFFFF"/>
             <w:tcBorders>
               <w:top w:val="single" w:sz="4" w:space="0" w:color="AAAAAA"/>
@@ -1830,7 +1830,7 @@
         </w:tc>
         <w:tc>
           <w:tcPr>
-            <w:tcW w:type="dxa" w:w="4139"/>
+            <w:tcW w:type="dxa" w:w="4252"/>
             <w:shd w:val="clear" w:color="auto" w:fill="FFFFFF"/>
             <w:tcBorders>
               <w:top w:val="single" w:sz="4" w:space="0" w:color="AAAAAA"/>
@@ -1856,7 +1856,7 @@
         </w:tc>
         <w:tc>
           <w:tcPr>
-            <w:tcW w:type="dxa" w:w="4819"/>
+            <w:tcW w:type="dxa" w:w="4989"/>
             <w:shd w:val="clear" w:color="auto" w:fill="FFFFFF"/>
             <w:tcBorders>
               <w:top w:val="single" w:sz="4" w:space="0" w:color="AAAAAA"/>
@@ -1884,7 +1884,7 @@
       <w:tr>
         <w:tc>
           <w:tcPr>
-            <w:tcW w:type="dxa" w:w="680"/>
+            <w:tcW w:type="dxa" w:w="397"/>
             <w:shd w:val="clear" w:color="auto" w:fill="FFFFFF"/>
             <w:tcBorders>
               <w:top w:val="single" w:sz="4" w:space="0" w:color="AAAAAA"/>
@@ -1910,7 +1910,7 @@
         </w:tc>
         <w:tc>
           <w:tcPr>
-            <w:tcW w:type="dxa" w:w="4139"/>
+            <w:tcW w:type="dxa" w:w="4252"/>
             <w:shd w:val="clear" w:color="auto" w:fill="FFFFFF"/>
             <w:tcBorders>
               <w:top w:val="single" w:sz="4" w:space="0" w:color="AAAAAA"/>
@@ -1936,7 +1936,7 @@
         </w:tc>
         <w:tc>
           <w:tcPr>
-            <w:tcW w:type="dxa" w:w="4819"/>
+            <w:tcW w:type="dxa" w:w="4989"/>
             <w:shd w:val="clear" w:color="auto" w:fill="FFFFFF"/>
             <w:tcBorders>
               <w:top w:val="single" w:sz="4" w:space="0" w:color="AAAAAA"/>
@@ -1963,7 +1963,7 @@
       <w:tr>
         <w:tc>
           <w:tcPr>
-            <w:tcW w:type="dxa" w:w="680"/>
+            <w:tcW w:type="dxa" w:w="397"/>
             <w:shd w:val="clear" w:color="auto" w:fill="FFFFFF"/>
             <w:tcBorders>
               <w:top w:val="single" w:sz="4" w:space="0" w:color="AAAAAA"/>
@@ -1989,7 +1989,7 @@
         </w:tc>
         <w:tc>
           <w:tcPr>
-            <w:tcW w:type="dxa" w:w="4139"/>
+            <w:tcW w:type="dxa" w:w="4252"/>
             <w:shd w:val="clear" w:color="auto" w:fill="FFFFFF"/>
             <w:tcBorders>
               <w:top w:val="single" w:sz="4" w:space="0" w:color="AAAAAA"/>
@@ -2015,7 +2015,7 @@
         </w:tc>
         <w:tc>
           <w:tcPr>
-            <w:tcW w:type="dxa" w:w="4819"/>
+            <w:tcW w:type="dxa" w:w="4989"/>
             <w:shd w:val="clear" w:color="auto" w:fill="FFFFFF"/>
             <w:tcBorders>
               <w:top w:val="single" w:sz="4" w:space="0" w:color="AAAAAA"/>
@@ -2043,7 +2043,7 @@
       <w:tr>
         <w:tc>
           <w:tcPr>
-            <w:tcW w:type="dxa" w:w="680"/>
+            <w:tcW w:type="dxa" w:w="397"/>
             <w:shd w:val="clear" w:color="auto" w:fill="FFFFFF"/>
             <w:tcBorders>
               <w:top w:val="single" w:sz="4" w:space="0" w:color="AAAAAA"/>
@@ -2069,7 +2069,7 @@
         </w:tc>
         <w:tc>
           <w:tcPr>
-            <w:tcW w:type="dxa" w:w="4139"/>
+            <w:tcW w:type="dxa" w:w="4252"/>
             <w:shd w:val="clear" w:color="auto" w:fill="FFFFFF"/>
             <w:tcBorders>
               <w:top w:val="single" w:sz="4" w:space="0" w:color="AAAAAA"/>
@@ -2095,7 +2095,7 @@
         </w:tc>
         <w:tc>
           <w:tcPr>
-            <w:tcW w:type="dxa" w:w="4819"/>
+            <w:tcW w:type="dxa" w:w="4989"/>
             <w:shd w:val="clear" w:color="auto" w:fill="FFFFFF"/>
             <w:tcBorders>
               <w:top w:val="single" w:sz="4" w:space="0" w:color="AAAAAA"/>
@@ -2123,7 +2123,7 @@
       <w:tr>
         <w:tc>
           <w:tcPr>
-            <w:tcW w:type="dxa" w:w="680"/>
+            <w:tcW w:type="dxa" w:w="397"/>
             <w:shd w:val="clear" w:color="auto" w:fill="FFFFFF"/>
             <w:tcBorders>
               <w:top w:val="single" w:sz="4" w:space="0" w:color="AAAAAA"/>
@@ -2149,7 +2149,7 @@
         </w:tc>
         <w:tc>
           <w:tcPr>
-            <w:tcW w:type="dxa" w:w="4139"/>
+            <w:tcW w:type="dxa" w:w="4252"/>
             <w:shd w:val="clear" w:color="auto" w:fill="FFFFFF"/>
             <w:tcBorders>
               <w:top w:val="single" w:sz="4" w:space="0" w:color="AAAAAA"/>
@@ -2175,7 +2175,7 @@
         </w:tc>
         <w:tc>
           <w:tcPr>
-            <w:tcW w:type="dxa" w:w="4819"/>
+            <w:tcW w:type="dxa" w:w="4989"/>
             <w:shd w:val="clear" w:color="auto" w:fill="FFFFFF"/>
             <w:tcBorders>
               <w:top w:val="single" w:sz="4" w:space="0" w:color="AAAAAA"/>
@@ -2203,7 +2203,7 @@
       <w:tr>
         <w:tc>
           <w:tcPr>
-            <w:tcW w:type="dxa" w:w="680"/>
+            <w:tcW w:type="dxa" w:w="397"/>
             <w:shd w:val="clear" w:color="auto" w:fill="FFFFFF"/>
             <w:tcBorders>
               <w:top w:val="single" w:sz="4" w:space="0" w:color="AAAAAA"/>
@@ -2229,7 +2229,7 @@
         </w:tc>
         <w:tc>
           <w:tcPr>
-            <w:tcW w:type="dxa" w:w="4139"/>
+            <w:tcW w:type="dxa" w:w="4252"/>
             <w:shd w:val="clear" w:color="auto" w:fill="FFFFFF"/>
             <w:tcBorders>
               <w:top w:val="single" w:sz="4" w:space="0" w:color="AAAAAA"/>
@@ -2255,7 +2255,7 @@
         </w:tc>
         <w:tc>
           <w:tcPr>
-            <w:tcW w:type="dxa" w:w="4819"/>
+            <w:tcW w:type="dxa" w:w="4989"/>
             <w:shd w:val="clear" w:color="auto" w:fill="FFFFFF"/>
             <w:tcBorders>
               <w:top w:val="single" w:sz="4" w:space="0" w:color="AAAAAA"/>
@@ -2283,7 +2283,7 @@
       <w:tr>
         <w:tc>
           <w:tcPr>
-            <w:tcW w:type="dxa" w:w="680"/>
+            <w:tcW w:type="dxa" w:w="397"/>
             <w:shd w:val="clear" w:color="auto" w:fill="FFFFFF"/>
             <w:tcBorders>
               <w:top w:val="single" w:sz="4" w:space="0" w:color="AAAAAA"/>
@@ -2309,7 +2309,7 @@
         </w:tc>
         <w:tc>
           <w:tcPr>
-            <w:tcW w:type="dxa" w:w="4139"/>
+            <w:tcW w:type="dxa" w:w="4252"/>
             <w:shd w:val="clear" w:color="auto" w:fill="FFFFFF"/>
             <w:tcBorders>
               <w:top w:val="single" w:sz="4" w:space="0" w:color="AAAAAA"/>
@@ -2335,7 +2335,7 @@
         </w:tc>
         <w:tc>
           <w:tcPr>
-            <w:tcW w:type="dxa" w:w="4819"/>
+            <w:tcW w:type="dxa" w:w="4989"/>
             <w:shd w:val="clear" w:color="auto" w:fill="FFFFFF"/>
             <w:tcBorders>
               <w:top w:val="single" w:sz="4" w:space="0" w:color="AAAAAA"/>
@@ -2363,7 +2363,7 @@
       <w:tr>
         <w:tc>
           <w:tcPr>
-            <w:tcW w:type="dxa" w:w="680"/>
+            <w:tcW w:type="dxa" w:w="397"/>
             <w:shd w:val="clear" w:color="auto" w:fill="FFFFFF"/>
             <w:tcBorders>
               <w:top w:val="single" w:sz="4" w:space="0" w:color="AAAAAA"/>
@@ -2389,7 +2389,7 @@
         </w:tc>
         <w:tc>
           <w:tcPr>
-            <w:tcW w:type="dxa" w:w="4139"/>
+            <w:tcW w:type="dxa" w:w="4252"/>
             <w:shd w:val="clear" w:color="auto" w:fill="FFFFFF"/>
             <w:tcBorders>
               <w:top w:val="single" w:sz="4" w:space="0" w:color="AAAAAA"/>
@@ -2415,7 +2415,7 @@
         </w:tc>
         <w:tc>
           <w:tcPr>
-            <w:tcW w:type="dxa" w:w="4819"/>
+            <w:tcW w:type="dxa" w:w="4989"/>
             <w:shd w:val="clear" w:color="auto" w:fill="FFFFFF"/>
             <w:tcBorders>
               <w:top w:val="single" w:sz="4" w:space="0" w:color="AAAAAA"/>
@@ -2443,7 +2443,7 @@
       <w:tr>
         <w:tc>
           <w:tcPr>
-            <w:tcW w:type="dxa" w:w="680"/>
+            <w:tcW w:type="dxa" w:w="397"/>
             <w:shd w:val="clear" w:color="auto" w:fill="FFFFFF"/>
             <w:tcBorders>
               <w:top w:val="single" w:sz="4" w:space="0" w:color="AAAAAA"/>
@@ -2469,7 +2469,7 @@
         </w:tc>
         <w:tc>
           <w:tcPr>
-            <w:tcW w:type="dxa" w:w="4139"/>
+            <w:tcW w:type="dxa" w:w="4252"/>
             <w:shd w:val="clear" w:color="auto" w:fill="FFFFFF"/>
             <w:tcBorders>
               <w:top w:val="single" w:sz="4" w:space="0" w:color="AAAAAA"/>
@@ -2495,7 +2495,7 @@
         </w:tc>
         <w:tc>
           <w:tcPr>
-            <w:tcW w:type="dxa" w:w="4819"/>
+            <w:tcW w:type="dxa" w:w="4989"/>
             <w:shd w:val="clear" w:color="auto" w:fill="FFFFFF"/>
             <w:tcBorders>
               <w:top w:val="single" w:sz="4" w:space="0" w:color="AAAAAA"/>
@@ -2523,7 +2523,7 @@
       <w:tr>
         <w:tc>
           <w:tcPr>
-            <w:tcW w:type="dxa" w:w="680"/>
+            <w:tcW w:type="dxa" w:w="397"/>
             <w:shd w:val="clear" w:color="auto" w:fill="FFFFFF"/>
             <w:tcBorders>
               <w:top w:val="single" w:sz="4" w:space="0" w:color="AAAAAA"/>
@@ -2549,7 +2549,7 @@
         </w:tc>
         <w:tc>
           <w:tcPr>
-            <w:tcW w:type="dxa" w:w="4139"/>
+            <w:tcW w:type="dxa" w:w="4252"/>
             <w:shd w:val="clear" w:color="auto" w:fill="FFFFFF"/>
             <w:tcBorders>
               <w:top w:val="single" w:sz="4" w:space="0" w:color="AAAAAA"/>
@@ -2575,7 +2575,7 @@
         </w:tc>
         <w:tc>
           <w:tcPr>
-            <w:tcW w:type="dxa" w:w="4819"/>
+            <w:tcW w:type="dxa" w:w="4989"/>
             <w:shd w:val="clear" w:color="auto" w:fill="FFFFFF"/>
             <w:tcBorders>
               <w:top w:val="single" w:sz="4" w:space="0" w:color="AAAAAA"/>
@@ -2603,7 +2603,7 @@
       <w:tr>
         <w:tc>
           <w:tcPr>
-            <w:tcW w:type="dxa" w:w="680"/>
+            <w:tcW w:type="dxa" w:w="397"/>
             <w:shd w:val="clear" w:color="auto" w:fill="FFFFFF"/>
             <w:tcBorders>
               <w:top w:val="single" w:sz="4" w:space="0" w:color="AAAAAA"/>
@@ -2629,7 +2629,7 @@
         </w:tc>
         <w:tc>
           <w:tcPr>
-            <w:tcW w:type="dxa" w:w="4139"/>
+            <w:tcW w:type="dxa" w:w="4252"/>
             <w:shd w:val="clear" w:color="auto" w:fill="FFFFFF"/>
             <w:tcBorders>
               <w:top w:val="single" w:sz="4" w:space="0" w:color="AAAAAA"/>
@@ -2655,7 +2655,7 @@
         </w:tc>
         <w:tc>
           <w:tcPr>
-            <w:tcW w:type="dxa" w:w="4819"/>
+            <w:tcW w:type="dxa" w:w="4989"/>
             <w:shd w:val="clear" w:color="auto" w:fill="FFFFFF"/>
             <w:tcBorders>
               <w:top w:val="single" w:sz="4" w:space="0" w:color="AAAAAA"/>
@@ -2683,7 +2683,7 @@
       <w:tr>
         <w:tc>
           <w:tcPr>
-            <w:tcW w:type="dxa" w:w="680"/>
+            <w:tcW w:type="dxa" w:w="397"/>
             <w:shd w:val="clear" w:color="auto" w:fill="FFFFFF"/>
             <w:tcBorders>
               <w:top w:val="single" w:sz="4" w:space="0" w:color="AAAAAA"/>
@@ -2709,7 +2709,7 @@
         </w:tc>
         <w:tc>
           <w:tcPr>
-            <w:tcW w:type="dxa" w:w="4139"/>
+            <w:tcW w:type="dxa" w:w="4252"/>
             <w:shd w:val="clear" w:color="auto" w:fill="FFFFFF"/>
             <w:tcBorders>
               <w:top w:val="single" w:sz="4" w:space="0" w:color="AAAAAA"/>
@@ -2735,7 +2735,7 @@
         </w:tc>
         <w:tc>
           <w:tcPr>
-            <w:tcW w:type="dxa" w:w="4819"/>
+            <w:tcW w:type="dxa" w:w="4989"/>
             <w:shd w:val="clear" w:color="auto" w:fill="FFFFFF"/>
             <w:tcBorders>
               <w:top w:val="single" w:sz="4" w:space="0" w:color="AAAAAA"/>
@@ -2763,7 +2763,7 @@
       <w:tr>
         <w:tc>
           <w:tcPr>
-            <w:tcW w:type="dxa" w:w="680"/>
+            <w:tcW w:type="dxa" w:w="397"/>
             <w:shd w:val="clear" w:color="auto" w:fill="FFFFFF"/>
             <w:tcBorders>
               <w:top w:val="single" w:sz="4" w:space="0" w:color="AAAAAA"/>
@@ -2789,7 +2789,7 @@
         </w:tc>
         <w:tc>
           <w:tcPr>
-            <w:tcW w:type="dxa" w:w="4139"/>
+            <w:tcW w:type="dxa" w:w="4252"/>
             <w:shd w:val="clear" w:color="auto" w:fill="FFFFFF"/>
             <w:tcBorders>
               <w:top w:val="single" w:sz="4" w:space="0" w:color="AAAAAA"/>
@@ -2815,7 +2815,7 @@
         </w:tc>
         <w:tc>
           <w:tcPr>
-            <w:tcW w:type="dxa" w:w="4819"/>
+            <w:tcW w:type="dxa" w:w="4989"/>
             <w:shd w:val="clear" w:color="auto" w:fill="FFFFFF"/>
             <w:tcBorders>
               <w:top w:val="single" w:sz="4" w:space="0" w:color="AAAAAA"/>
@@ -2842,7 +2842,7 @@
       <w:tr>
         <w:tc>
           <w:tcPr>
-            <w:tcW w:type="dxa" w:w="680"/>
+            <w:tcW w:type="dxa" w:w="397"/>
             <w:shd w:val="clear" w:color="auto" w:fill="FFFFFF"/>
             <w:tcBorders>
               <w:top w:val="single" w:sz="4" w:space="0" w:color="AAAAAA"/>
@@ -2868,7 +2868,7 @@
         </w:tc>
         <w:tc>
           <w:tcPr>
-            <w:tcW w:type="dxa" w:w="4139"/>
+            <w:tcW w:type="dxa" w:w="4252"/>
             <w:shd w:val="clear" w:color="auto" w:fill="FFFFFF"/>
             <w:tcBorders>
               <w:top w:val="single" w:sz="4" w:space="0" w:color="AAAAAA"/>
@@ -2894,7 +2894,7 @@
         </w:tc>
         <w:tc>
           <w:tcPr>
-            <w:tcW w:type="dxa" w:w="4819"/>
+            <w:tcW w:type="dxa" w:w="4989"/>
             <w:shd w:val="clear" w:color="auto" w:fill="FFFFFF"/>
             <w:tcBorders>
               <w:top w:val="single" w:sz="4" w:space="0" w:color="AAAAAA"/>
@@ -2922,7 +2922,7 @@
       <w:tr>
         <w:tc>
           <w:tcPr>
-            <w:tcW w:type="dxa" w:w="680"/>
+            <w:tcW w:type="dxa" w:w="397"/>
             <w:shd w:val="clear" w:color="auto" w:fill="FFFFFF"/>
             <w:tcBorders>
               <w:top w:val="single" w:sz="4" w:space="0" w:color="AAAAAA"/>
@@ -2948,7 +2948,7 @@
         </w:tc>
         <w:tc>
           <w:tcPr>
-            <w:tcW w:type="dxa" w:w="4139"/>
+            <w:tcW w:type="dxa" w:w="4252"/>
             <w:shd w:val="clear" w:color="auto" w:fill="FFFFFF"/>
             <w:tcBorders>
               <w:top w:val="single" w:sz="4" w:space="0" w:color="AAAAAA"/>
@@ -2974,7 +2974,7 @@
         </w:tc>
         <w:tc>
           <w:tcPr>
-            <w:tcW w:type="dxa" w:w="4819"/>
+            <w:tcW w:type="dxa" w:w="4989"/>
             <w:shd w:val="clear" w:color="auto" w:fill="FFFFFF"/>
             <w:tcBorders>
               <w:top w:val="single" w:sz="4" w:space="0" w:color="AAAAAA"/>
@@ -3002,7 +3002,7 @@
       <w:tr>
         <w:tc>
           <w:tcPr>
-            <w:tcW w:type="dxa" w:w="680"/>
+            <w:tcW w:type="dxa" w:w="397"/>
             <w:shd w:val="clear" w:color="auto" w:fill="FFFFFF"/>
             <w:tcBorders>
               <w:top w:val="single" w:sz="4" w:space="0" w:color="AAAAAA"/>
@@ -3028,7 +3028,7 @@
         </w:tc>
         <w:tc>
           <w:tcPr>
-            <w:tcW w:type="dxa" w:w="4139"/>
+            <w:tcW w:type="dxa" w:w="4252"/>
             <w:shd w:val="clear" w:color="auto" w:fill="FFFFFF"/>
             <w:tcBorders>
               <w:top w:val="single" w:sz="4" w:space="0" w:color="AAAAAA"/>
@@ -3054,7 +3054,7 @@
         </w:tc>
         <w:tc>
           <w:tcPr>
-            <w:tcW w:type="dxa" w:w="4819"/>
+            <w:tcW w:type="dxa" w:w="4989"/>
             <w:shd w:val="clear" w:color="auto" w:fill="FFFFFF"/>
             <w:tcBorders>
               <w:top w:val="single" w:sz="4" w:space="0" w:color="AAAAAA"/>
@@ -3082,7 +3082,7 @@
       <w:tr>
         <w:tc>
           <w:tcPr>
-            <w:tcW w:type="dxa" w:w="680"/>
+            <w:tcW w:type="dxa" w:w="397"/>
             <w:shd w:val="clear" w:color="auto" w:fill="FFFFFF"/>
             <w:tcBorders>
               <w:top w:val="single" w:sz="4" w:space="0" w:color="AAAAAA"/>
@@ -3108,7 +3108,7 @@
         </w:tc>
         <w:tc>
           <w:tcPr>
-            <w:tcW w:type="dxa" w:w="4139"/>
+            <w:tcW w:type="dxa" w:w="4252"/>
             <w:shd w:val="clear" w:color="auto" w:fill="FFFFFF"/>
             <w:tcBorders>
               <w:top w:val="single" w:sz="4" w:space="0" w:color="AAAAAA"/>
@@ -3134,7 +3134,7 @@
         </w:tc>
         <w:tc>
           <w:tcPr>
-            <w:tcW w:type="dxa" w:w="4819"/>
+            <w:tcW w:type="dxa" w:w="4989"/>
             <w:shd w:val="clear" w:color="auto" w:fill="FFFFFF"/>
             <w:tcBorders>
               <w:top w:val="single" w:sz="4" w:space="0" w:color="AAAAAA"/>
@@ -3162,7 +3162,7 @@
       <w:tr>
         <w:tc>
           <w:tcPr>
-            <w:tcW w:type="dxa" w:w="680"/>
+            <w:tcW w:type="dxa" w:w="397"/>
             <w:shd w:val="clear" w:color="auto" w:fill="FFFFFF"/>
             <w:tcBorders>
               <w:top w:val="single" w:sz="4" w:space="0" w:color="AAAAAA"/>
@@ -3188,7 +3188,7 @@
         </w:tc>
         <w:tc>
           <w:tcPr>
-            <w:tcW w:type="dxa" w:w="4139"/>
+            <w:tcW w:type="dxa" w:w="4252"/>
             <w:shd w:val="clear" w:color="auto" w:fill="FFFFFF"/>
             <w:tcBorders>
               <w:top w:val="single" w:sz="4" w:space="0" w:color="AAAAAA"/>
@@ -3214,7 +3214,7 @@
         </w:tc>
         <w:tc>
           <w:tcPr>
-            <w:tcW w:type="dxa" w:w="4819"/>
+            <w:tcW w:type="dxa" w:w="4989"/>
             <w:shd w:val="clear" w:color="auto" w:fill="FFFFFF"/>
             <w:tcBorders>
               <w:top w:val="single" w:sz="4" w:space="0" w:color="AAAAAA"/>
@@ -3242,7 +3242,7 @@
       <w:tr>
         <w:tc>
           <w:tcPr>
-            <w:tcW w:type="dxa" w:w="680"/>
+            <w:tcW w:type="dxa" w:w="397"/>
             <w:shd w:val="clear" w:color="auto" w:fill="FFFFFF"/>
             <w:tcBorders>
               <w:top w:val="single" w:sz="4" w:space="0" w:color="AAAAAA"/>
@@ -3268,7 +3268,7 @@
         </w:tc>
         <w:tc>
           <w:tcPr>
-            <w:tcW w:type="dxa" w:w="4139"/>
+            <w:tcW w:type="dxa" w:w="4252"/>
             <w:shd w:val="clear" w:color="auto" w:fill="FFFFFF"/>
             <w:tcBorders>
               <w:top w:val="single" w:sz="4" w:space="0" w:color="AAAAAA"/>
@@ -3294,7 +3294,7 @@
         </w:tc>
         <w:tc>
           <w:tcPr>
-            <w:tcW w:type="dxa" w:w="4819"/>
+            <w:tcW w:type="dxa" w:w="4989"/>
             <w:shd w:val="clear" w:color="auto" w:fill="FFFFFF"/>
             <w:tcBorders>
               <w:top w:val="single" w:sz="4" w:space="0" w:color="AAAAAA"/>
@@ -3322,7 +3322,7 @@
       <w:tr>
         <w:tc>
           <w:tcPr>
-            <w:tcW w:type="dxa" w:w="680"/>
+            <w:tcW w:type="dxa" w:w="397"/>
             <w:shd w:val="clear" w:color="auto" w:fill="FFFFFF"/>
             <w:tcBorders>
               <w:top w:val="single" w:sz="4" w:space="0" w:color="AAAAAA"/>
@@ -3348,7 +3348,7 @@
         </w:tc>
         <w:tc>
           <w:tcPr>
-            <w:tcW w:type="dxa" w:w="4139"/>
+            <w:tcW w:type="dxa" w:w="4252"/>
             <w:shd w:val="clear" w:color="auto" w:fill="FFFFFF"/>
             <w:tcBorders>
               <w:top w:val="single" w:sz="4" w:space="0" w:color="AAAAAA"/>
@@ -3374,7 +3374,7 @@
         </w:tc>
         <w:tc>
           <w:tcPr>
-            <w:tcW w:type="dxa" w:w="4819"/>
+            <w:tcW w:type="dxa" w:w="4989"/>
             <w:shd w:val="clear" w:color="auto" w:fill="FFFFFF"/>
             <w:tcBorders>
               <w:top w:val="single" w:sz="4" w:space="0" w:color="AAAAAA"/>
@@ -3402,7 +3402,7 @@
       <w:tr>
         <w:tc>
           <w:tcPr>
-            <w:tcW w:type="dxa" w:w="680"/>
+            <w:tcW w:type="dxa" w:w="397"/>
             <w:shd w:val="clear" w:color="auto" w:fill="FFFFFF"/>
             <w:tcBorders>
               <w:top w:val="single" w:sz="4" w:space="0" w:color="AAAAAA"/>
@@ -3428,7 +3428,7 @@
         </w:tc>
         <w:tc>
           <w:tcPr>
-            <w:tcW w:type="dxa" w:w="4139"/>
+            <w:tcW w:type="dxa" w:w="4252"/>
             <w:shd w:val="clear" w:color="auto" w:fill="FFFFFF"/>
             <w:tcBorders>
               <w:top w:val="single" w:sz="4" w:space="0" w:color="AAAAAA"/>
@@ -3454,7 +3454,7 @@
         </w:tc>
         <w:tc>
           <w:tcPr>
-            <w:tcW w:type="dxa" w:w="4819"/>
+            <w:tcW w:type="dxa" w:w="4989"/>
             <w:shd w:val="clear" w:color="auto" w:fill="FFFFFF"/>
             <w:tcBorders>
               <w:top w:val="single" w:sz="4" w:space="0" w:color="AAAAAA"/>
@@ -3482,7 +3482,7 @@
       <w:tr>
         <w:tc>
           <w:tcPr>
-            <w:tcW w:type="dxa" w:w="680"/>
+            <w:tcW w:type="dxa" w:w="397"/>
             <w:shd w:val="clear" w:color="auto" w:fill="FFFFFF"/>
             <w:tcBorders>
               <w:top w:val="single" w:sz="4" w:space="0" w:color="AAAAAA"/>
@@ -3508,7 +3508,7 @@
         </w:tc>
         <w:tc>
           <w:tcPr>
-            <w:tcW w:type="dxa" w:w="4139"/>
+            <w:tcW w:type="dxa" w:w="4252"/>
             <w:shd w:val="clear" w:color="auto" w:fill="FFFFFF"/>
             <w:tcBorders>
               <w:top w:val="single" w:sz="4" w:space="0" w:color="AAAAAA"/>
@@ -3534,7 +3534,7 @@
         </w:tc>
         <w:tc>
           <w:tcPr>
-            <w:tcW w:type="dxa" w:w="4819"/>
+            <w:tcW w:type="dxa" w:w="4989"/>
             <w:shd w:val="clear" w:color="auto" w:fill="FFFFFF"/>
             <w:tcBorders>
               <w:top w:val="single" w:sz="4" w:space="0" w:color="AAAAAA"/>
@@ -3562,7 +3562,7 @@
       <w:tr>
         <w:tc>
           <w:tcPr>
-            <w:tcW w:type="dxa" w:w="680"/>
+            <w:tcW w:type="dxa" w:w="397"/>
             <w:shd w:val="clear" w:color="auto" w:fill="FFFFFF"/>
             <w:tcBorders>
               <w:top w:val="single" w:sz="4" w:space="0" w:color="AAAAAA"/>
@@ -3588,7 +3588,7 @@
         </w:tc>
         <w:tc>
           <w:tcPr>
-            <w:tcW w:type="dxa" w:w="4139"/>
+            <w:tcW w:type="dxa" w:w="4252"/>
             <w:shd w:val="clear" w:color="auto" w:fill="FFFFFF"/>
             <w:tcBorders>
               <w:top w:val="single" w:sz="4" w:space="0" w:color="AAAAAA"/>
@@ -3614,7 +3614,7 @@
         </w:tc>
         <w:tc>
           <w:tcPr>
-            <w:tcW w:type="dxa" w:w="4819"/>
+            <w:tcW w:type="dxa" w:w="4989"/>
             <w:shd w:val="clear" w:color="auto" w:fill="FFFFFF"/>
             <w:tcBorders>
               <w:top w:val="single" w:sz="4" w:space="0" w:color="AAAAAA"/>
@@ -3642,7 +3642,7 @@
       <w:tr>
         <w:tc>
           <w:tcPr>
-            <w:tcW w:type="dxa" w:w="680"/>
+            <w:tcW w:type="dxa" w:w="397"/>
             <w:shd w:val="clear" w:color="auto" w:fill="FFFFFF"/>
             <w:tcBorders>
               <w:top w:val="single" w:sz="4" w:space="0" w:color="AAAAAA"/>
@@ -3668,7 +3668,7 @@
         </w:tc>
         <w:tc>
           <w:tcPr>
-            <w:tcW w:type="dxa" w:w="4139"/>
+            <w:tcW w:type="dxa" w:w="4252"/>
             <w:shd w:val="clear" w:color="auto" w:fill="FFFFFF"/>
             <w:tcBorders>
               <w:top w:val="single" w:sz="4" w:space="0" w:color="AAAAAA"/>
@@ -3694,7 +3694,7 @@
         </w:tc>
         <w:tc>
           <w:tcPr>
-            <w:tcW w:type="dxa" w:w="4819"/>
+            <w:tcW w:type="dxa" w:w="4989"/>
             <w:shd w:val="clear" w:color="auto" w:fill="FFFFFF"/>
             <w:tcBorders>
               <w:top w:val="single" w:sz="4" w:space="0" w:color="AAAAAA"/>
@@ -3721,7 +3721,7 @@
       <w:tr>
         <w:tc>
           <w:tcPr>
-            <w:tcW w:type="dxa" w:w="680"/>
+            <w:tcW w:type="dxa" w:w="397"/>
             <w:shd w:val="clear" w:color="auto" w:fill="FFFFFF"/>
             <w:tcBorders>
               <w:top w:val="single" w:sz="4" w:space="0" w:color="AAAAAA"/>
@@ -3747,7 +3747,7 @@
         </w:tc>
         <w:tc>
           <w:tcPr>
-            <w:tcW w:type="dxa" w:w="4139"/>
+            <w:tcW w:type="dxa" w:w="4252"/>
             <w:shd w:val="clear" w:color="auto" w:fill="FFFFFF"/>
             <w:tcBorders>
               <w:top w:val="single" w:sz="4" w:space="0" w:color="AAAAAA"/>
@@ -3773,7 +3773,7 @@
         </w:tc>
         <w:tc>
           <w:tcPr>
-            <w:tcW w:type="dxa" w:w="4819"/>
+            <w:tcW w:type="dxa" w:w="4989"/>
             <w:shd w:val="clear" w:color="auto" w:fill="FFFFFF"/>
             <w:tcBorders>
               <w:top w:val="single" w:sz="4" w:space="0" w:color="AAAAAA"/>
@@ -3801,7 +3801,7 @@
       <w:tr>
         <w:tc>
           <w:tcPr>
-            <w:tcW w:type="dxa" w:w="680"/>
+            <w:tcW w:type="dxa" w:w="397"/>
             <w:shd w:val="clear" w:color="auto" w:fill="FFFFFF"/>
             <w:tcBorders>
               <w:top w:val="single" w:sz="4" w:space="0" w:color="AAAAAA"/>
@@ -3827,7 +3827,7 @@
         </w:tc>
         <w:tc>
           <w:tcPr>
-            <w:tcW w:type="dxa" w:w="4139"/>
+            <w:tcW w:type="dxa" w:w="4252"/>
             <w:shd w:val="clear" w:color="auto" w:fill="FFFFFF"/>
             <w:tcBorders>
               <w:top w:val="single" w:sz="4" w:space="0" w:color="AAAAAA"/>
@@ -3853,7 +3853,7 @@
         </w:tc>
         <w:tc>
           <w:tcPr>
-            <w:tcW w:type="dxa" w:w="4819"/>
+            <w:tcW w:type="dxa" w:w="4989"/>
             <w:shd w:val="clear" w:color="auto" w:fill="FFFFFF"/>
             <w:tcBorders>
               <w:top w:val="single" w:sz="4" w:space="0" w:color="AAAAAA"/>
@@ -3881,7 +3881,7 @@
       <w:tr>
         <w:tc>
           <w:tcPr>
-            <w:tcW w:type="dxa" w:w="680"/>
+            <w:tcW w:type="dxa" w:w="397"/>
             <w:shd w:val="clear" w:color="auto" w:fill="FFFFFF"/>
             <w:tcBorders>
               <w:top w:val="single" w:sz="4" w:space="0" w:color="AAAAAA"/>
@@ -3907,7 +3907,7 @@
         </w:tc>
         <w:tc>
           <w:tcPr>
-            <w:tcW w:type="dxa" w:w="4139"/>
+            <w:tcW w:type="dxa" w:w="4252"/>
             <w:shd w:val="clear" w:color="auto" w:fill="FFFFFF"/>
             <w:tcBorders>
               <w:top w:val="single" w:sz="4" w:space="0" w:color="AAAAAA"/>
@@ -3933,7 +3933,7 @@
         </w:tc>
         <w:tc>
           <w:tcPr>
-            <w:tcW w:type="dxa" w:w="4819"/>
+            <w:tcW w:type="dxa" w:w="4989"/>
             <w:shd w:val="clear" w:color="auto" w:fill="FFFFFF"/>
             <w:tcBorders>
               <w:top w:val="single" w:sz="4" w:space="0" w:color="AAAAAA"/>
@@ -3961,7 +3961,7 @@
       <w:tr>
         <w:tc>
           <w:tcPr>
-            <w:tcW w:type="dxa" w:w="680"/>
+            <w:tcW w:type="dxa" w:w="397"/>
             <w:shd w:val="clear" w:color="auto" w:fill="FFFFFF"/>
             <w:tcBorders>
               <w:top w:val="single" w:sz="4" w:space="0" w:color="AAAAAA"/>
@@ -3987,7 +3987,7 @@
         </w:tc>
         <w:tc>
           <w:tcPr>
-            <w:tcW w:type="dxa" w:w="4139"/>
+            <w:tcW w:type="dxa" w:w="4252"/>
             <w:shd w:val="clear" w:color="auto" w:fill="FFFFFF"/>
             <w:tcBorders>
               <w:top w:val="single" w:sz="4" w:space="0" w:color="AAAAAA"/>
@@ -4013,7 +4013,7 @@
         </w:tc>
         <w:tc>
           <w:tcPr>
-            <w:tcW w:type="dxa" w:w="4819"/>
+            <w:tcW w:type="dxa" w:w="4989"/>
             <w:shd w:val="clear" w:color="auto" w:fill="FFFFFF"/>
             <w:tcBorders>
               <w:top w:val="single" w:sz="4" w:space="0" w:color="AAAAAA"/>
@@ -4041,7 +4041,7 @@
       <w:tr>
         <w:tc>
           <w:tcPr>
-            <w:tcW w:type="dxa" w:w="680"/>
+            <w:tcW w:type="dxa" w:w="397"/>
             <w:shd w:val="clear" w:color="auto" w:fill="FFFFFF"/>
             <w:tcBorders>
               <w:top w:val="single" w:sz="4" w:space="0" w:color="AAAAAA"/>
@@ -4067,7 +4067,7 @@
         </w:tc>
         <w:tc>
           <w:tcPr>
-            <w:tcW w:type="dxa" w:w="4139"/>
+            <w:tcW w:type="dxa" w:w="4252"/>
             <w:shd w:val="clear" w:color="auto" w:fill="FFFFFF"/>
             <w:tcBorders>
               <w:top w:val="single" w:sz="4" w:space="0" w:color="AAAAAA"/>
@@ -4093,7 +4093,7 @@
         </w:tc>
         <w:tc>
           <w:tcPr>
-            <w:tcW w:type="dxa" w:w="4819"/>
+            <w:tcW w:type="dxa" w:w="4989"/>
             <w:shd w:val="clear" w:color="auto" w:fill="FFFFFF"/>
             <w:tcBorders>
               <w:top w:val="single" w:sz="4" w:space="0" w:color="AAAAAA"/>
@@ -4121,7 +4121,7 @@
       <w:tr>
         <w:tc>
           <w:tcPr>
-            <w:tcW w:type="dxa" w:w="680"/>
+            <w:tcW w:type="dxa" w:w="397"/>
             <w:shd w:val="clear" w:color="auto" w:fill="FFFFFF"/>
             <w:tcBorders>
               <w:top w:val="single" w:sz="4" w:space="0" w:color="AAAAAA"/>
@@ -4147,7 +4147,7 @@
         </w:tc>
         <w:tc>
           <w:tcPr>
-            <w:tcW w:type="dxa" w:w="4139"/>
+            <w:tcW w:type="dxa" w:w="4252"/>
             <w:shd w:val="clear" w:color="auto" w:fill="FFFFFF"/>
             <w:tcBorders>
               <w:top w:val="single" w:sz="4" w:space="0" w:color="AAAAAA"/>
@@ -4173,7 +4173,7 @@
         </w:tc>
         <w:tc>
           <w:tcPr>
-            <w:tcW w:type="dxa" w:w="4819"/>
+            <w:tcW w:type="dxa" w:w="4989"/>
             <w:shd w:val="clear" w:color="auto" w:fill="FFFFFF"/>
             <w:tcBorders>
               <w:top w:val="single" w:sz="4" w:space="0" w:color="AAAAAA"/>
@@ -4201,7 +4201,7 @@
       <w:tr>
         <w:tc>
           <w:tcPr>
-            <w:tcW w:type="dxa" w:w="680"/>
+            <w:tcW w:type="dxa" w:w="397"/>
             <w:shd w:val="clear" w:color="auto" w:fill="FFFFFF"/>
             <w:tcBorders>
               <w:top w:val="single" w:sz="4" w:space="0" w:color="AAAAAA"/>
@@ -4227,7 +4227,7 @@
         </w:tc>
         <w:tc>
           <w:tcPr>
-            <w:tcW w:type="dxa" w:w="4139"/>
+            <w:tcW w:type="dxa" w:w="4252"/>
             <w:shd w:val="clear" w:color="auto" w:fill="FFFFFF"/>
             <w:tcBorders>
               <w:top w:val="single" w:sz="4" w:space="0" w:color="AAAAAA"/>
@@ -4253,7 +4253,7 @@
         </w:tc>
         <w:tc>
           <w:tcPr>
-            <w:tcW w:type="dxa" w:w="4819"/>
+            <w:tcW w:type="dxa" w:w="4989"/>
             <w:shd w:val="clear" w:color="auto" w:fill="FFFFFF"/>
             <w:tcBorders>
               <w:top w:val="single" w:sz="4" w:space="0" w:color="AAAAAA"/>
@@ -4281,7 +4281,7 @@
       <w:tr>
         <w:tc>
           <w:tcPr>
-            <w:tcW w:type="dxa" w:w="680"/>
+            <w:tcW w:type="dxa" w:w="397"/>
             <w:shd w:val="clear" w:color="auto" w:fill="FFFFFF"/>
             <w:tcBorders>
               <w:top w:val="single" w:sz="4" w:space="0" w:color="AAAAAA"/>
@@ -4307,7 +4307,7 @@
         </w:tc>
         <w:tc>
           <w:tcPr>
-            <w:tcW w:type="dxa" w:w="4139"/>
+            <w:tcW w:type="dxa" w:w="4252"/>
             <w:shd w:val="clear" w:color="auto" w:fill="FFFFFF"/>
             <w:tcBorders>
               <w:top w:val="single" w:sz="4" w:space="0" w:color="AAAAAA"/>
@@ -4333,7 +4333,7 @@
         </w:tc>
         <w:tc>
           <w:tcPr>
-            <w:tcW w:type="dxa" w:w="4819"/>
+            <w:tcW w:type="dxa" w:w="4989"/>
             <w:shd w:val="clear" w:color="auto" w:fill="FFFFFF"/>
             <w:tcBorders>
               <w:top w:val="single" w:sz="4" w:space="0" w:color="AAAAAA"/>
@@ -4361,7 +4361,7 @@
       <w:tr>
         <w:tc>
           <w:tcPr>
-            <w:tcW w:type="dxa" w:w="680"/>
+            <w:tcW w:type="dxa" w:w="397"/>
             <w:shd w:val="clear" w:color="auto" w:fill="FFFFFF"/>
             <w:tcBorders>
               <w:top w:val="single" w:sz="4" w:space="0" w:color="AAAAAA"/>
@@ -4387,7 +4387,7 @@
         </w:tc>
         <w:tc>
           <w:tcPr>
-            <w:tcW w:type="dxa" w:w="4139"/>
+            <w:tcW w:type="dxa" w:w="4252"/>
             <w:shd w:val="clear" w:color="auto" w:fill="FFFFFF"/>
             <w:tcBorders>
               <w:top w:val="single" w:sz="4" w:space="0" w:color="AAAAAA"/>
@@ -4413,7 +4413,7 @@
         </w:tc>
         <w:tc>
           <w:tcPr>
-            <w:tcW w:type="dxa" w:w="4819"/>
+            <w:tcW w:type="dxa" w:w="4989"/>
             <w:shd w:val="clear" w:color="auto" w:fill="FFFFFF"/>
             <w:tcBorders>
               <w:top w:val="single" w:sz="4" w:space="0" w:color="AAAAAA"/>
@@ -4441,7 +4441,7 @@
       <w:tr>
         <w:tc>
           <w:tcPr>
-            <w:tcW w:type="dxa" w:w="680"/>
+            <w:tcW w:type="dxa" w:w="397"/>
             <w:shd w:val="clear" w:color="auto" w:fill="FFFFFF"/>
             <w:tcBorders>
               <w:top w:val="single" w:sz="4" w:space="0" w:color="AAAAAA"/>
@@ -4467,7 +4467,7 @@
         </w:tc>
         <w:tc>
           <w:tcPr>
-            <w:tcW w:type="dxa" w:w="4139"/>
+            <w:tcW w:type="dxa" w:w="4252"/>
             <w:shd w:val="clear" w:color="auto" w:fill="FFFFFF"/>
             <w:tcBorders>
               <w:top w:val="single" w:sz="4" w:space="0" w:color="AAAAAA"/>
@@ -4493,7 +4493,7 @@
         </w:tc>
         <w:tc>
           <w:tcPr>
-            <w:tcW w:type="dxa" w:w="4819"/>
+            <w:tcW w:type="dxa" w:w="4989"/>
             <w:shd w:val="clear" w:color="auto" w:fill="FFFFFF"/>
             <w:tcBorders>
               <w:top w:val="single" w:sz="4" w:space="0" w:color="AAAAAA"/>
@@ -4521,7 +4521,7 @@
       <w:tr>
         <w:tc>
           <w:tcPr>
-            <w:tcW w:type="dxa" w:w="680"/>
+            <w:tcW w:type="dxa" w:w="397"/>
             <w:shd w:val="clear" w:color="auto" w:fill="FFFFFF"/>
             <w:tcBorders>
               <w:top w:val="single" w:sz="4" w:space="0" w:color="AAAAAA"/>
@@ -4547,7 +4547,7 @@
         </w:tc>
         <w:tc>
           <w:tcPr>
-            <w:tcW w:type="dxa" w:w="4139"/>
+            <w:tcW w:type="dxa" w:w="4252"/>
             <w:shd w:val="clear" w:color="auto" w:fill="FFFFFF"/>
             <w:tcBorders>
               <w:top w:val="single" w:sz="4" w:space="0" w:color="AAAAAA"/>
@@ -4573,7 +4573,7 @@
         </w:tc>
         <w:tc>
           <w:tcPr>
-            <w:tcW w:type="dxa" w:w="4819"/>
+            <w:tcW w:type="dxa" w:w="4989"/>
             <w:shd w:val="clear" w:color="auto" w:fill="FFFFFF"/>
             <w:tcBorders>
               <w:top w:val="single" w:sz="4" w:space="0" w:color="AAAAAA"/>
@@ -4601,7 +4601,7 @@
       <w:tr>
         <w:tc>
           <w:tcPr>
-            <w:tcW w:type="dxa" w:w="680"/>
+            <w:tcW w:type="dxa" w:w="397"/>
             <w:shd w:val="clear" w:color="auto" w:fill="FFFFFF"/>
             <w:tcBorders>
               <w:top w:val="single" w:sz="4" w:space="0" w:color="AAAAAA"/>
@@ -4627,7 +4627,7 @@
         </w:tc>
         <w:tc>
           <w:tcPr>
-            <w:tcW w:type="dxa" w:w="4139"/>
+            <w:tcW w:type="dxa" w:w="4252"/>
             <w:shd w:val="clear" w:color="auto" w:fill="FFFFFF"/>
             <w:tcBorders>
               <w:top w:val="single" w:sz="4" w:space="0" w:color="AAAAAA"/>
@@ -4653,7 +4653,7 @@
         </w:tc>
         <w:tc>
           <w:tcPr>
-            <w:tcW w:type="dxa" w:w="4819"/>
+            <w:tcW w:type="dxa" w:w="4989"/>
             <w:shd w:val="clear" w:color="auto" w:fill="FFFFFF"/>
             <w:tcBorders>
               <w:top w:val="single" w:sz="4" w:space="0" w:color="AAAAAA"/>
@@ -4681,7 +4681,7 @@
       <w:tr>
         <w:tc>
           <w:tcPr>
-            <w:tcW w:type="dxa" w:w="680"/>
+            <w:tcW w:type="dxa" w:w="397"/>
             <w:shd w:val="clear" w:color="auto" w:fill="FFFFFF"/>
             <w:tcBorders>
               <w:top w:val="single" w:sz="4" w:space="0" w:color="AAAAAA"/>
@@ -4707,7 +4707,7 @@
         </w:tc>
         <w:tc>
           <w:tcPr>
-            <w:tcW w:type="dxa" w:w="4139"/>
+            <w:tcW w:type="dxa" w:w="4252"/>
             <w:shd w:val="clear" w:color="auto" w:fill="FFFFFF"/>
             <w:tcBorders>
               <w:top w:val="single" w:sz="4" w:space="0" w:color="AAAAAA"/>
@@ -4733,7 +4733,7 @@
         </w:tc>
         <w:tc>
           <w:tcPr>
-            <w:tcW w:type="dxa" w:w="4819"/>
+            <w:tcW w:type="dxa" w:w="4989"/>
             <w:shd w:val="clear" w:color="auto" w:fill="FFFFFF"/>
             <w:tcBorders>
               <w:top w:val="single" w:sz="4" w:space="0" w:color="AAAAAA"/>
@@ -4760,7 +4760,7 @@
       <w:tr>
         <w:tc>
           <w:tcPr>
-            <w:tcW w:type="dxa" w:w="680"/>
+            <w:tcW w:type="dxa" w:w="397"/>
             <w:shd w:val="clear" w:color="auto" w:fill="FFFFFF"/>
             <w:tcBorders>
               <w:top w:val="single" w:sz="4" w:space="0" w:color="AAAAAA"/>
@@ -4786,7 +4786,7 @@
         </w:tc>
         <w:tc>
           <w:tcPr>
-            <w:tcW w:type="dxa" w:w="4139"/>
+            <w:tcW w:type="dxa" w:w="4252"/>
             <w:shd w:val="clear" w:color="auto" w:fill="FFFFFF"/>
             <w:tcBorders>
               <w:top w:val="single" w:sz="4" w:space="0" w:color="AAAAAA"/>
@@ -4812,7 +4812,7 @@
         </w:tc>
         <w:tc>
           <w:tcPr>
-            <w:tcW w:type="dxa" w:w="4819"/>
+            <w:tcW w:type="dxa" w:w="4989"/>
             <w:shd w:val="clear" w:color="auto" w:fill="FFFFFF"/>
             <w:tcBorders>
               <w:top w:val="single" w:sz="4" w:space="0" w:color="AAAAAA"/>
@@ -4840,7 +4840,7 @@
       <w:tr>
         <w:tc>
           <w:tcPr>
-            <w:tcW w:type="dxa" w:w="680"/>
+            <w:tcW w:type="dxa" w:w="397"/>
             <w:shd w:val="clear" w:color="auto" w:fill="FFFFFF"/>
             <w:tcBorders>
               <w:top w:val="single" w:sz="4" w:space="0" w:color="AAAAAA"/>
@@ -4866,7 +4866,7 @@
         </w:tc>
         <w:tc>
           <w:tcPr>
-            <w:tcW w:type="dxa" w:w="4139"/>
+            <w:tcW w:type="dxa" w:w="4252"/>
             <w:shd w:val="clear" w:color="auto" w:fill="FFFFFF"/>
             <w:tcBorders>
               <w:top w:val="single" w:sz="4" w:space="0" w:color="AAAAAA"/>
@@ -4892,7 +4892,7 @@
         </w:tc>
         <w:tc>
           <w:tcPr>
-            <w:tcW w:type="dxa" w:w="4819"/>
+            <w:tcW w:type="dxa" w:w="4989"/>
             <w:shd w:val="clear" w:color="auto" w:fill="FFFFFF"/>
             <w:tcBorders>
               <w:top w:val="single" w:sz="4" w:space="0" w:color="AAAAAA"/>
@@ -4920,7 +4920,7 @@
       <w:tr>
         <w:tc>
           <w:tcPr>
-            <w:tcW w:type="dxa" w:w="680"/>
+            <w:tcW w:type="dxa" w:w="397"/>
             <w:shd w:val="clear" w:color="auto" w:fill="FFFFFF"/>
             <w:tcBorders>
               <w:top w:val="single" w:sz="4" w:space="0" w:color="AAAAAA"/>
@@ -4946,7 +4946,7 @@
         </w:tc>
         <w:tc>
           <w:tcPr>
-            <w:tcW w:type="dxa" w:w="4139"/>
+            <w:tcW w:type="dxa" w:w="4252"/>
             <w:shd w:val="clear" w:color="auto" w:fill="FFFFFF"/>
             <w:tcBorders>
               <w:top w:val="single" w:sz="4" w:space="0" w:color="AAAAAA"/>
@@ -4972,7 +4972,7 @@
         </w:tc>
         <w:tc>
           <w:tcPr>
-            <w:tcW w:type="dxa" w:w="4819"/>
+            <w:tcW w:type="dxa" w:w="4989"/>
             <w:shd w:val="clear" w:color="auto" w:fill="FFFFFF"/>
             <w:tcBorders>
               <w:top w:val="single" w:sz="4" w:space="0" w:color="AAAAAA"/>
@@ -5000,7 +5000,7 @@
       <w:tr>
         <w:tc>
           <w:tcPr>
-            <w:tcW w:type="dxa" w:w="680"/>
+            <w:tcW w:type="dxa" w:w="397"/>
             <w:shd w:val="clear" w:color="auto" w:fill="FFFFFF"/>
             <w:tcBorders>
               <w:top w:val="single" w:sz="4" w:space="0" w:color="AAAAAA"/>
@@ -5026,7 +5026,7 @@
         </w:tc>
         <w:tc>
           <w:tcPr>
-            <w:tcW w:type="dxa" w:w="4139"/>
+            <w:tcW w:type="dxa" w:w="4252"/>
             <w:shd w:val="clear" w:color="auto" w:fill="FFFFFF"/>
             <w:tcBorders>
               <w:top w:val="single" w:sz="4" w:space="0" w:color="AAAAAA"/>
@@ -5052,7 +5052,7 @@
         </w:tc>
         <w:tc>
           <w:tcPr>
-            <w:tcW w:type="dxa" w:w="4819"/>
+            <w:tcW w:type="dxa" w:w="4989"/>
             <w:shd w:val="clear" w:color="auto" w:fill="FFFFFF"/>
             <w:tcBorders>
               <w:top w:val="single" w:sz="4" w:space="0" w:color="AAAAAA"/>
@@ -5079,7 +5079,7 @@
       <w:tr>
         <w:tc>
           <w:tcPr>
-            <w:tcW w:type="dxa" w:w="680"/>
+            <w:tcW w:type="dxa" w:w="397"/>
             <w:shd w:val="clear" w:color="auto" w:fill="FFFFFF"/>
             <w:tcBorders>
               <w:top w:val="single" w:sz="4" w:space="0" w:color="AAAAAA"/>
@@ -5105,7 +5105,7 @@
         </w:tc>
         <w:tc>
           <w:tcPr>
-            <w:tcW w:type="dxa" w:w="4139"/>
+            <w:tcW w:type="dxa" w:w="4252"/>
             <w:shd w:val="clear" w:color="auto" w:fill="FFFFFF"/>
             <w:tcBorders>
               <w:top w:val="single" w:sz="4" w:space="0" w:color="AAAAAA"/>
@@ -5131,7 +5131,7 @@
         </w:tc>
         <w:tc>
           <w:tcPr>
-            <w:tcW w:type="dxa" w:w="4819"/>
+            <w:tcW w:type="dxa" w:w="4989"/>
             <w:shd w:val="clear" w:color="auto" w:fill="FFFFFF"/>
             <w:tcBorders>
               <w:top w:val="single" w:sz="4" w:space="0" w:color="AAAAAA"/>
@@ -5159,7 +5159,7 @@
       <w:tr>
         <w:tc>
           <w:tcPr>
-            <w:tcW w:type="dxa" w:w="680"/>
+            <w:tcW w:type="dxa" w:w="397"/>
             <w:shd w:val="clear" w:color="auto" w:fill="FFFFFF"/>
             <w:tcBorders>
               <w:top w:val="single" w:sz="4" w:space="0" w:color="AAAAAA"/>
@@ -5185,7 +5185,7 @@
         </w:tc>
         <w:tc>
           <w:tcPr>
-            <w:tcW w:type="dxa" w:w="4139"/>
+            <w:tcW w:type="dxa" w:w="4252"/>
             <w:shd w:val="clear" w:color="auto" w:fill="FFFFFF"/>
             <w:tcBorders>
               <w:top w:val="single" w:sz="4" w:space="0" w:color="AAAAAA"/>
@@ -5211,7 +5211,7 @@
         </w:tc>
         <w:tc>
           <w:tcPr>
-            <w:tcW w:type="dxa" w:w="4819"/>
+            <w:tcW w:type="dxa" w:w="4989"/>
             <w:shd w:val="clear" w:color="auto" w:fill="FFFFFF"/>
             <w:tcBorders>
               <w:top w:val="single" w:sz="4" w:space="0" w:color="AAAAAA"/>
@@ -5239,7 +5239,7 @@
       <w:tr>
         <w:tc>
           <w:tcPr>
-            <w:tcW w:type="dxa" w:w="680"/>
+            <w:tcW w:type="dxa" w:w="397"/>
             <w:shd w:val="clear" w:color="auto" w:fill="FFFFFF"/>
             <w:tcBorders>
               <w:top w:val="single" w:sz="4" w:space="0" w:color="AAAAAA"/>
@@ -5265,7 +5265,7 @@
         </w:tc>
         <w:tc>
           <w:tcPr>
-            <w:tcW w:type="dxa" w:w="4139"/>
+            <w:tcW w:type="dxa" w:w="4252"/>
             <w:shd w:val="clear" w:color="auto" w:fill="FFFFFF"/>
             <w:tcBorders>
               <w:top w:val="single" w:sz="4" w:space="0" w:color="AAAAAA"/>
@@ -5291,7 +5291,7 @@
         </w:tc>
         <w:tc>
           <w:tcPr>
-            <w:tcW w:type="dxa" w:w="4819"/>
+            <w:tcW w:type="dxa" w:w="4989"/>
             <w:shd w:val="clear" w:color="auto" w:fill="FFFFFF"/>
             <w:tcBorders>
               <w:top w:val="single" w:sz="4" w:space="0" w:color="AAAAAA"/>
@@ -5319,7 +5319,7 @@
       <w:tr>
         <w:tc>
           <w:tcPr>
-            <w:tcW w:type="dxa" w:w="680"/>
+            <w:tcW w:type="dxa" w:w="397"/>
             <w:shd w:val="clear" w:color="auto" w:fill="FFFFFF"/>
             <w:tcBorders>
               <w:top w:val="single" w:sz="4" w:space="0" w:color="AAAAAA"/>
@@ -5345,7 +5345,7 @@
         </w:tc>
         <w:tc>
           <w:tcPr>
-            <w:tcW w:type="dxa" w:w="4139"/>
+            <w:tcW w:type="dxa" w:w="4252"/>
             <w:shd w:val="clear" w:color="auto" w:fill="FFFFFF"/>
             <w:tcBorders>
               <w:top w:val="single" w:sz="4" w:space="0" w:color="AAAAAA"/>
@@ -5371,7 +5371,7 @@
         </w:tc>
         <w:tc>
           <w:tcPr>
-            <w:tcW w:type="dxa" w:w="4819"/>
+            <w:tcW w:type="dxa" w:w="4989"/>
             <w:shd w:val="clear" w:color="auto" w:fill="FFFFFF"/>
             <w:tcBorders>
               <w:top w:val="single" w:sz="4" w:space="0" w:color="AAAAAA"/>
@@ -5399,7 +5399,7 @@
       <w:tr>
         <w:tc>
           <w:tcPr>
-            <w:tcW w:type="dxa" w:w="680"/>
+            <w:tcW w:type="dxa" w:w="397"/>
             <w:shd w:val="clear" w:color="auto" w:fill="FFFFFF"/>
             <w:tcBorders>
               <w:top w:val="single" w:sz="4" w:space="0" w:color="AAAAAA"/>
@@ -5425,7 +5425,7 @@
         </w:tc>
         <w:tc>
           <w:tcPr>
-            <w:tcW w:type="dxa" w:w="4139"/>
+            <w:tcW w:type="dxa" w:w="4252"/>
             <w:shd w:val="clear" w:color="auto" w:fill="FFFFFF"/>
             <w:tcBorders>
               <w:top w:val="single" w:sz="4" w:space="0" w:color="AAAAAA"/>
@@ -5451,7 +5451,7 @@
         </w:tc>
         <w:tc>
           <w:tcPr>
-            <w:tcW w:type="dxa" w:w="4819"/>
+            <w:tcW w:type="dxa" w:w="4989"/>
             <w:shd w:val="clear" w:color="auto" w:fill="FFFFFF"/>
             <w:tcBorders>
               <w:top w:val="single" w:sz="4" w:space="0" w:color="AAAAAA"/>
@@ -5479,7 +5479,7 @@
       <w:tr>
         <w:tc>
           <w:tcPr>
-            <w:tcW w:type="dxa" w:w="680"/>
+            <w:tcW w:type="dxa" w:w="397"/>
             <w:shd w:val="clear" w:color="auto" w:fill="FFFFFF"/>
             <w:tcBorders>
               <w:top w:val="single" w:sz="4" w:space="0" w:color="AAAAAA"/>
@@ -5505,7 +5505,7 @@
         </w:tc>
         <w:tc>
           <w:tcPr>
-            <w:tcW w:type="dxa" w:w="4139"/>
+            <w:tcW w:type="dxa" w:w="4252"/>
             <w:shd w:val="clear" w:color="auto" w:fill="FFFFFF"/>
             <w:tcBorders>
               <w:top w:val="single" w:sz="4" w:space="0" w:color="AAAAAA"/>
@@ -5531,7 +5531,7 @@
         </w:tc>
         <w:tc>
           <w:tcPr>
-            <w:tcW w:type="dxa" w:w="4819"/>
+            <w:tcW w:type="dxa" w:w="4989"/>
             <w:shd w:val="clear" w:color="auto" w:fill="FFFFFF"/>
             <w:tcBorders>
               <w:top w:val="single" w:sz="4" w:space="0" w:color="AAAAAA"/>
@@ -5558,7 +5558,7 @@
       <w:tr>
         <w:tc>
           <w:tcPr>
-            <w:tcW w:type="dxa" w:w="680"/>
+            <w:tcW w:type="dxa" w:w="397"/>
             <w:shd w:val="clear" w:color="auto" w:fill="FFFFFF"/>
             <w:tcBorders>
               <w:top w:val="single" w:sz="4" w:space="0" w:color="AAAAAA"/>
@@ -5584,7 +5584,7 @@
         </w:tc>
         <w:tc>
           <w:tcPr>
-            <w:tcW w:type="dxa" w:w="4139"/>
+            <w:tcW w:type="dxa" w:w="4252"/>
             <w:shd w:val="clear" w:color="auto" w:fill="FFFFFF"/>
             <w:tcBorders>
               <w:top w:val="single" w:sz="4" w:space="0" w:color="AAAAAA"/>
@@ -5610,7 +5610,7 @@
         </w:tc>
         <w:tc>
           <w:tcPr>
-            <w:tcW w:type="dxa" w:w="4819"/>
+            <w:tcW w:type="dxa" w:w="4989"/>
             <w:shd w:val="clear" w:color="auto" w:fill="FFFFFF"/>
             <w:tcBorders>
               <w:top w:val="single" w:sz="4" w:space="0" w:color="AAAAAA"/>
@@ -5638,7 +5638,7 @@
       <w:tr>
         <w:tc>
           <w:tcPr>
-            <w:tcW w:type="dxa" w:w="680"/>
+            <w:tcW w:type="dxa" w:w="397"/>
             <w:shd w:val="clear" w:color="auto" w:fill="FFFFFF"/>
             <w:tcBorders>
               <w:top w:val="single" w:sz="4" w:space="0" w:color="AAAAAA"/>
@@ -5664,7 +5664,7 @@
         </w:tc>
         <w:tc>
           <w:tcPr>
-            <w:tcW w:type="dxa" w:w="4139"/>
+            <w:tcW w:type="dxa" w:w="4252"/>
             <w:shd w:val="clear" w:color="auto" w:fill="FFFFFF"/>
             <w:tcBorders>
               <w:top w:val="single" w:sz="4" w:space="0" w:color="AAAAAA"/>
@@ -5690,7 +5690,7 @@
         </w:tc>
         <w:tc>
           <w:tcPr>
-            <w:tcW w:type="dxa" w:w="4819"/>
+            <w:tcW w:type="dxa" w:w="4989"/>
             <w:shd w:val="clear" w:color="auto" w:fill="FFFFFF"/>
             <w:tcBorders>
               <w:top w:val="single" w:sz="4" w:space="0" w:color="AAAAAA"/>
@@ -5718,7 +5718,7 @@
       <w:tr>
         <w:tc>
           <w:tcPr>
-            <w:tcW w:type="dxa" w:w="680"/>
+            <w:tcW w:type="dxa" w:w="397"/>
             <w:shd w:val="clear" w:color="auto" w:fill="FFFFFF"/>
             <w:tcBorders>
               <w:top w:val="single" w:sz="4" w:space="0" w:color="AAAAAA"/>
@@ -5744,7 +5744,7 @@
         </w:tc>
         <w:tc>
           <w:tcPr>
-            <w:tcW w:type="dxa" w:w="4139"/>
+            <w:tcW w:type="dxa" w:w="4252"/>
             <w:shd w:val="clear" w:color="auto" w:fill="FFFFFF"/>
             <w:tcBorders>
               <w:top w:val="single" w:sz="4" w:space="0" w:color="AAAAAA"/>
@@ -5770,7 +5770,7 @@
         </w:tc>
         <w:tc>
           <w:tcPr>
-            <w:tcW w:type="dxa" w:w="4819"/>
+            <w:tcW w:type="dxa" w:w="4989"/>
             <w:shd w:val="clear" w:color="auto" w:fill="FFFFFF"/>
             <w:tcBorders>
               <w:top w:val="single" w:sz="4" w:space="0" w:color="AAAAAA"/>
@@ -5798,7 +5798,7 @@
       <w:tr>
         <w:tc>
           <w:tcPr>
-            <w:tcW w:type="dxa" w:w="4819"/>
+            <w:tcW w:type="dxa" w:w="4989"/>
             <w:gridSpan w:val="3"/>
             <w:shd w:val="clear" w:color="auto" w:fill="1F3864"/>
             <w:tcBorders>
@@ -5827,7 +5827,7 @@
       <w:tr>
         <w:tc>
           <w:tcPr>
-            <w:tcW w:type="dxa" w:w="680"/>
+            <w:tcW w:type="dxa" w:w="397"/>
             <w:shd w:val="clear" w:color="auto" w:fill="FFFFFF"/>
             <w:tcBorders>
               <w:top w:val="single" w:sz="4" w:space="0" w:color="AAAAAA"/>
@@ -5853,7 +5853,7 @@
         </w:tc>
         <w:tc>
           <w:tcPr>
-            <w:tcW w:type="dxa" w:w="4139"/>
+            <w:tcW w:type="dxa" w:w="4252"/>
             <w:shd w:val="clear" w:color="auto" w:fill="FFFFFF"/>
             <w:tcBorders>
               <w:top w:val="single" w:sz="4" w:space="0" w:color="AAAAAA"/>
@@ -5881,7 +5881,7 @@
         </w:tc>
         <w:tc>
           <w:tcPr>
-            <w:tcW w:type="dxa" w:w="4819"/>
+            <w:tcW w:type="dxa" w:w="4989"/>
             <w:shd w:val="clear" w:color="auto" w:fill="FFFFFF"/>
             <w:tcBorders>
               <w:top w:val="single" w:sz="4" w:space="0" w:color="AAAAAA"/>
@@ -5909,7 +5909,7 @@
       <w:tr>
         <w:tc>
           <w:tcPr>
-            <w:tcW w:type="dxa" w:w="4819"/>
+            <w:tcW w:type="dxa" w:w="4989"/>
             <w:gridSpan w:val="3"/>
             <w:shd w:val="clear" w:color="auto" w:fill="1F3864"/>
             <w:tcBorders>
@@ -5940,7 +5940,7 @@
       <w:tr>
         <w:tc>
           <w:tcPr>
-            <w:tcW w:type="dxa" w:w="4819"/>
+            <w:tcW w:type="dxa" w:w="4989"/>
             <w:gridSpan w:val="3"/>
             <w:shd w:val="clear" w:color="auto" w:fill="D6E4F0"/>
             <w:tcBorders>
@@ -5968,7 +5968,7 @@
       <w:tr>
         <w:tc>
           <w:tcPr>
-            <w:tcW w:type="dxa" w:w="680"/>
+            <w:tcW w:type="dxa" w:w="397"/>
             <w:shd w:val="clear" w:color="auto" w:fill="FFFFFF"/>
             <w:tcBorders>
               <w:top w:val="single" w:sz="4" w:space="0" w:color="AAAAAA"/>
@@ -5994,7 +5994,7 @@
         </w:tc>
         <w:tc>
           <w:tcPr>
-            <w:tcW w:type="dxa" w:w="4139"/>
+            <w:tcW w:type="dxa" w:w="4252"/>
             <w:shd w:val="clear" w:color="auto" w:fill="FFFFFF"/>
             <w:tcBorders>
               <w:top w:val="single" w:sz="4" w:space="0" w:color="AAAAAA"/>
@@ -6020,7 +6020,7 @@
         </w:tc>
         <w:tc>
           <w:tcPr>
-            <w:tcW w:type="dxa" w:w="4819"/>
+            <w:tcW w:type="dxa" w:w="4989"/>
             <w:shd w:val="clear" w:color="auto" w:fill="FFFFFF"/>
             <w:tcBorders>
               <w:top w:val="single" w:sz="4" w:space="0" w:color="AAAAAA"/>
@@ -6048,7 +6048,7 @@
       <w:tr>
         <w:tc>
           <w:tcPr>
-            <w:tcW w:type="dxa" w:w="680"/>
+            <w:tcW w:type="dxa" w:w="397"/>
             <w:shd w:val="clear" w:color="auto" w:fill="FFFFFF"/>
             <w:tcBorders>
               <w:top w:val="single" w:sz="4" w:space="0" w:color="AAAAAA"/>
@@ -6074,7 +6074,7 @@
         </w:tc>
         <w:tc>
           <w:tcPr>
-            <w:tcW w:type="dxa" w:w="4139"/>
+            <w:tcW w:type="dxa" w:w="4252"/>
             <w:shd w:val="clear" w:color="auto" w:fill="FFFFFF"/>
             <w:tcBorders>
               <w:top w:val="single" w:sz="4" w:space="0" w:color="AAAAAA"/>
@@ -6100,7 +6100,7 @@
         </w:tc>
         <w:tc>
           <w:tcPr>
-            <w:tcW w:type="dxa" w:w="4819"/>
+            <w:tcW w:type="dxa" w:w="4989"/>
             <w:shd w:val="clear" w:color="auto" w:fill="FFFFFF"/>
             <w:tcBorders>
               <w:top w:val="single" w:sz="4" w:space="0" w:color="AAAAAA"/>
@@ -6128,7 +6128,7 @@
       <w:tr>
         <w:tc>
           <w:tcPr>
-            <w:tcW w:type="dxa" w:w="680"/>
+            <w:tcW w:type="dxa" w:w="397"/>
             <w:shd w:val="clear" w:color="auto" w:fill="FFFFFF"/>
             <w:tcBorders>
               <w:top w:val="single" w:sz="4" w:space="0" w:color="AAAAAA"/>
@@ -6154,7 +6154,7 @@
         </w:tc>
         <w:tc>
           <w:tcPr>
-            <w:tcW w:type="dxa" w:w="4139"/>
+            <w:tcW w:type="dxa" w:w="4252"/>
             <w:shd w:val="clear" w:color="auto" w:fill="FFFFFF"/>
             <w:tcBorders>
               <w:top w:val="single" w:sz="4" w:space="0" w:color="AAAAAA"/>
@@ -6180,7 +6180,7 @@
         </w:tc>
         <w:tc>
           <w:tcPr>
-            <w:tcW w:type="dxa" w:w="4819"/>
+            <w:tcW w:type="dxa" w:w="4989"/>
             <w:shd w:val="clear" w:color="auto" w:fill="FFFFFF"/>
             <w:tcBorders>
               <w:top w:val="single" w:sz="4" w:space="0" w:color="AAAAAA"/>
@@ -6208,7 +6208,7 @@
       <w:tr>
         <w:tc>
           <w:tcPr>
-            <w:tcW w:type="dxa" w:w="680"/>
+            <w:tcW w:type="dxa" w:w="397"/>
             <w:shd w:val="clear" w:color="auto" w:fill="FFFFFF"/>
             <w:tcBorders>
               <w:top w:val="single" w:sz="4" w:space="0" w:color="AAAAAA"/>
@@ -6234,7 +6234,7 @@
         </w:tc>
         <w:tc>
           <w:tcPr>
-            <w:tcW w:type="dxa" w:w="4139"/>
+            <w:tcW w:type="dxa" w:w="4252"/>
             <w:shd w:val="clear" w:color="auto" w:fill="FFFFFF"/>
             <w:tcBorders>
               <w:top w:val="single" w:sz="4" w:space="0" w:color="AAAAAA"/>
@@ -6260,7 +6260,7 @@
         </w:tc>
         <w:tc>
           <w:tcPr>
-            <w:tcW w:type="dxa" w:w="4819"/>
+            <w:tcW w:type="dxa" w:w="4989"/>
             <w:shd w:val="clear" w:color="auto" w:fill="FFFFFF"/>
             <w:tcBorders>
               <w:top w:val="single" w:sz="4" w:space="0" w:color="AAAAAA"/>
@@ -6288,7 +6288,7 @@
       <w:tr>
         <w:tc>
           <w:tcPr>
-            <w:tcW w:type="dxa" w:w="680"/>
+            <w:tcW w:type="dxa" w:w="397"/>
             <w:shd w:val="clear" w:color="auto" w:fill="FFFFFF"/>
             <w:tcBorders>
               <w:top w:val="single" w:sz="4" w:space="0" w:color="AAAAAA"/>
@@ -6314,7 +6314,7 @@
         </w:tc>
         <w:tc>
           <w:tcPr>
-            <w:tcW w:type="dxa" w:w="4139"/>
+            <w:tcW w:type="dxa" w:w="4252"/>
             <w:shd w:val="clear" w:color="auto" w:fill="FFFFFF"/>
             <w:tcBorders>
               <w:top w:val="single" w:sz="4" w:space="0" w:color="AAAAAA"/>
@@ -6340,7 +6340,7 @@
         </w:tc>
         <w:tc>
           <w:tcPr>
-            <w:tcW w:type="dxa" w:w="4819"/>
+            <w:tcW w:type="dxa" w:w="4989"/>
             <w:shd w:val="clear" w:color="auto" w:fill="FFFFFF"/>
             <w:tcBorders>
               <w:top w:val="single" w:sz="4" w:space="0" w:color="AAAAAA"/>
@@ -6368,7 +6368,7 @@
       <w:tr>
         <w:tc>
           <w:tcPr>
-            <w:tcW w:type="dxa" w:w="680"/>
+            <w:tcW w:type="dxa" w:w="397"/>
             <w:shd w:val="clear" w:color="auto" w:fill="FFFFFF"/>
             <w:tcBorders>
               <w:top w:val="single" w:sz="4" w:space="0" w:color="AAAAAA"/>
@@ -6394,7 +6394,7 @@
         </w:tc>
         <w:tc>
           <w:tcPr>
-            <w:tcW w:type="dxa" w:w="4139"/>
+            <w:tcW w:type="dxa" w:w="4252"/>
             <w:shd w:val="clear" w:color="auto" w:fill="FFFFFF"/>
             <w:tcBorders>
               <w:top w:val="single" w:sz="4" w:space="0" w:color="AAAAAA"/>
@@ -6420,7 +6420,7 @@
         </w:tc>
         <w:tc>
           <w:tcPr>
-            <w:tcW w:type="dxa" w:w="4819"/>
+            <w:tcW w:type="dxa" w:w="4989"/>
             <w:shd w:val="clear" w:color="auto" w:fill="FFFFFF"/>
             <w:tcBorders>
               <w:top w:val="single" w:sz="4" w:space="0" w:color="AAAAAA"/>
@@ -6448,7 +6448,7 @@
       <w:tr>
         <w:tc>
           <w:tcPr>
-            <w:tcW w:type="dxa" w:w="680"/>
+            <w:tcW w:type="dxa" w:w="397"/>
             <w:shd w:val="clear" w:color="auto" w:fill="FFFFFF"/>
             <w:tcBorders>
               <w:top w:val="single" w:sz="4" w:space="0" w:color="AAAAAA"/>
@@ -6474,7 +6474,7 @@
         </w:tc>
         <w:tc>
           <w:tcPr>
-            <w:tcW w:type="dxa" w:w="4139"/>
+            <w:tcW w:type="dxa" w:w="4252"/>
             <w:shd w:val="clear" w:color="auto" w:fill="FFFFFF"/>
             <w:tcBorders>
               <w:top w:val="single" w:sz="4" w:space="0" w:color="AAAAAA"/>
@@ -6500,7 +6500,7 @@
         </w:tc>
         <w:tc>
           <w:tcPr>
-            <w:tcW w:type="dxa" w:w="4819"/>
+            <w:tcW w:type="dxa" w:w="4989"/>
             <w:shd w:val="clear" w:color="auto" w:fill="FFFFFF"/>
             <w:tcBorders>
               <w:top w:val="single" w:sz="4" w:space="0" w:color="AAAAAA"/>
@@ -6528,7 +6528,7 @@
       <w:tr>
         <w:tc>
           <w:tcPr>
-            <w:tcW w:type="dxa" w:w="4819"/>
+            <w:tcW w:type="dxa" w:w="4989"/>
             <w:gridSpan w:val="3"/>
             <w:shd w:val="clear" w:color="auto" w:fill="D6E4F0"/>
             <w:tcBorders>
@@ -6556,7 +6556,7 @@
       <w:tr>
         <w:tc>
           <w:tcPr>
-            <w:tcW w:type="dxa" w:w="680"/>
+            <w:tcW w:type="dxa" w:w="397"/>
             <w:shd w:val="clear" w:color="auto" w:fill="FFFFFF"/>
             <w:tcBorders>
               <w:top w:val="single" w:sz="4" w:space="0" w:color="AAAAAA"/>
@@ -6582,7 +6582,7 @@
         </w:tc>
         <w:tc>
           <w:tcPr>
-            <w:tcW w:type="dxa" w:w="4139"/>
+            <w:tcW w:type="dxa" w:w="4252"/>
             <w:shd w:val="clear" w:color="auto" w:fill="FFFFFF"/>
             <w:tcBorders>
               <w:top w:val="single" w:sz="4" w:space="0" w:color="AAAAAA"/>
@@ -6610,7 +6610,7 @@
         </w:tc>
         <w:tc>
           <w:tcPr>
-            <w:tcW w:type="dxa" w:w="4819"/>
+            <w:tcW w:type="dxa" w:w="4989"/>
             <w:shd w:val="clear" w:color="auto" w:fill="FFFFFF"/>
             <w:tcBorders>
               <w:top w:val="single" w:sz="4" w:space="0" w:color="AAAAAA"/>
@@ -6638,7 +6638,7 @@
       <w:tr>
         <w:tc>
           <w:tcPr>
-            <w:tcW w:type="dxa" w:w="680"/>
+            <w:tcW w:type="dxa" w:w="397"/>
             <w:shd w:val="clear" w:color="auto" w:fill="FFFFFF"/>
             <w:tcBorders>
               <w:top w:val="single" w:sz="4" w:space="0" w:color="AAAAAA"/>
@@ -6664,7 +6664,7 @@
         </w:tc>
         <w:tc>
           <w:tcPr>
-            <w:tcW w:type="dxa" w:w="4139"/>
+            <w:tcW w:type="dxa" w:w="4252"/>
             <w:shd w:val="clear" w:color="auto" w:fill="FFFFFF"/>
             <w:tcBorders>
               <w:top w:val="single" w:sz="4" w:space="0" w:color="AAAAAA"/>
@@ -6692,7 +6692,7 @@
         </w:tc>
         <w:tc>
           <w:tcPr>
-            <w:tcW w:type="dxa" w:w="4819"/>
+            <w:tcW w:type="dxa" w:w="4989"/>
             <w:shd w:val="clear" w:color="auto" w:fill="FFFFFF"/>
             <w:tcBorders>
               <w:top w:val="single" w:sz="4" w:space="0" w:color="AAAAAA"/>
@@ -6720,7 +6720,7 @@
       <w:tr>
         <w:tc>
           <w:tcPr>
-            <w:tcW w:type="dxa" w:w="680"/>
+            <w:tcW w:type="dxa" w:w="397"/>
             <w:shd w:val="clear" w:color="auto" w:fill="FFFFFF"/>
             <w:tcBorders>
               <w:top w:val="single" w:sz="4" w:space="0" w:color="AAAAAA"/>
@@ -6745,7 +6745,7 @@
         </w:tc>
         <w:tc>
           <w:tcPr>
-            <w:tcW w:type="dxa" w:w="4139"/>
+            <w:tcW w:type="dxa" w:w="4252"/>
             <w:shd w:val="clear" w:color="auto" w:fill="FFFFFF"/>
             <w:tcBorders>
               <w:top w:val="single" w:sz="4" w:space="0" w:color="AAAAAA"/>
@@ -6771,7 +6771,7 @@
         </w:tc>
         <w:tc>
           <w:tcPr>
-            <w:tcW w:type="dxa" w:w="4819"/>
+            <w:tcW w:type="dxa" w:w="4989"/>
             <w:shd w:val="clear" w:color="auto" w:fill="FFFFFF"/>
             <w:tcBorders>
               <w:top w:val="single" w:sz="4" w:space="0" w:color="AAAAAA"/>
@@ -6799,7 +6799,7 @@
       <w:tr>
         <w:tc>
           <w:tcPr>
-            <w:tcW w:type="dxa" w:w="680"/>
+            <w:tcW w:type="dxa" w:w="397"/>
             <w:shd w:val="clear" w:color="auto" w:fill="FFFFFF"/>
             <w:tcBorders>
               <w:top w:val="single" w:sz="4" w:space="0" w:color="AAAAAA"/>
@@ -6825,7 +6825,7 @@
         </w:tc>
         <w:tc>
           <w:tcPr>
-            <w:tcW w:type="dxa" w:w="4139"/>
+            <w:tcW w:type="dxa" w:w="4252"/>
             <w:shd w:val="clear" w:color="auto" w:fill="FFFFFF"/>
             <w:tcBorders>
               <w:top w:val="single" w:sz="4" w:space="0" w:color="AAAAAA"/>
@@ -6851,7 +6851,7 @@
         </w:tc>
         <w:tc>
           <w:tcPr>
-            <w:tcW w:type="dxa" w:w="4819"/>
+            <w:tcW w:type="dxa" w:w="4989"/>
             <w:shd w:val="clear" w:color="auto" w:fill="FFFFFF"/>
             <w:tcBorders>
               <w:top w:val="single" w:sz="4" w:space="0" w:color="AAAAAA"/>
@@ -6879,7 +6879,7 @@
       <w:tr>
         <w:tc>
           <w:tcPr>
-            <w:tcW w:type="dxa" w:w="680"/>
+            <w:tcW w:type="dxa" w:w="397"/>
             <w:shd w:val="clear" w:color="auto" w:fill="FFFFFF"/>
             <w:tcBorders>
               <w:top w:val="single" w:sz="4" w:space="0" w:color="AAAAAA"/>
@@ -6905,7 +6905,7 @@
         </w:tc>
         <w:tc>
           <w:tcPr>
-            <w:tcW w:type="dxa" w:w="4139"/>
+            <w:tcW w:type="dxa" w:w="4252"/>
             <w:shd w:val="clear" w:color="auto" w:fill="FFFFFF"/>
             <w:tcBorders>
               <w:top w:val="single" w:sz="4" w:space="0" w:color="AAAAAA"/>
@@ -6931,7 +6931,7 @@
         </w:tc>
         <w:tc>
           <w:tcPr>
-            <w:tcW w:type="dxa" w:w="4819"/>
+            <w:tcW w:type="dxa" w:w="4989"/>
             <w:shd w:val="clear" w:color="auto" w:fill="FFFFFF"/>
             <w:tcBorders>
               <w:top w:val="single" w:sz="4" w:space="0" w:color="AAAAAA"/>
@@ -6959,7 +6959,7 @@
       <w:tr>
         <w:tc>
           <w:tcPr>
-            <w:tcW w:type="dxa" w:w="4819"/>
+            <w:tcW w:type="dxa" w:w="4989"/>
             <w:gridSpan w:val="3"/>
             <w:shd w:val="clear" w:color="auto" w:fill="D6E4F0"/>
             <w:tcBorders>
@@ -6987,7 +6987,7 @@
       <w:tr>
         <w:tc>
           <w:tcPr>
-            <w:tcW w:type="dxa" w:w="680"/>
+            <w:tcW w:type="dxa" w:w="397"/>
             <w:shd w:val="clear" w:color="auto" w:fill="FFFFFF"/>
             <w:tcBorders>
               <w:top w:val="single" w:sz="4" w:space="0" w:color="AAAAAA"/>
@@ -7012,7 +7012,7 @@
         </w:tc>
         <w:tc>
           <w:tcPr>
-            <w:tcW w:type="dxa" w:w="4139"/>
+            <w:tcW w:type="dxa" w:w="4252"/>
             <w:shd w:val="clear" w:color="auto" w:fill="FFFFFF"/>
             <w:tcBorders>
               <w:top w:val="single" w:sz="4" w:space="0" w:color="AAAAAA"/>
@@ -7040,7 +7040,7 @@
         </w:tc>
         <w:tc>
           <w:tcPr>
-            <w:tcW w:type="dxa" w:w="4819"/>
+            <w:tcW w:type="dxa" w:w="4989"/>
             <w:shd w:val="clear" w:color="auto" w:fill="FFFFFF"/>
             <w:tcBorders>
               <w:top w:val="single" w:sz="4" w:space="0" w:color="AAAAAA"/>
@@ -7068,7 +7068,7 @@
       <w:tr>
         <w:tc>
           <w:tcPr>
-            <w:tcW w:type="dxa" w:w="680"/>
+            <w:tcW w:type="dxa" w:w="397"/>
             <w:shd w:val="clear" w:color="auto" w:fill="FFFFFF"/>
             <w:tcBorders>
               <w:top w:val="single" w:sz="4" w:space="0" w:color="AAAAAA"/>
@@ -7093,7 +7093,7 @@
         </w:tc>
         <w:tc>
           <w:tcPr>
-            <w:tcW w:type="dxa" w:w="4139"/>
+            <w:tcW w:type="dxa" w:w="4252"/>
             <w:shd w:val="clear" w:color="auto" w:fill="FFFFFF"/>
             <w:tcBorders>
               <w:top w:val="single" w:sz="4" w:space="0" w:color="AAAAAA"/>
@@ -7119,7 +7119,7 @@
         </w:tc>
         <w:tc>
           <w:tcPr>
-            <w:tcW w:type="dxa" w:w="4819"/>
+            <w:tcW w:type="dxa" w:w="4989"/>
             <w:shd w:val="clear" w:color="auto" w:fill="FFFFFF"/>
             <w:tcBorders>
               <w:top w:val="single" w:sz="4" w:space="0" w:color="AAAAAA"/>
@@ -7265,6 +7265,1409 @@
         <w:br/>
         <w:t>Accordingly, our firm and inspection team shall not be held liable for any future deterioration, distress, failure, or damage that may occur after the date of inspection, nor for any consequences arising from such future behavior of the the structure.</w:t>
       </w:r>
+    </w:p>
+    <w:p>
+      <w:r>
+        <w:br w:type="page"/>
+      </w:r>
+    </w:p>
+    <w:p>
+      <w:pPr>
+        <w:spacing w:after="80"/>
+        <w:jc w:val="center"/>
+      </w:pPr>
+      <w:r>
+        <w:rPr>
+          <w:b/>
+          <w:color w:val="1F3864"/>
+          <w:sz w:val="24"/>
+        </w:rPr>
+        <w:t>Appendix: Bridge Details — Field Data Collection Form</w:t>
+      </w:r>
+    </w:p>
+    <w:p>
+      <w:pPr>
+        <w:spacing w:after="160"/>
+        <w:jc w:val="center"/>
+      </w:pPr>
+      <w:r>
+        <w:rPr>
+          <w:i/>
+          <w:color w:val="555555"/>
+          <w:sz w:val="18"/>
+        </w:rPr>
+        <w:t>Fill this form at site before sending information on WhatsApp. All fields marked * are mandatory.</w:t>
+      </w:r>
+    </w:p>
+    <w:tbl>
+      <w:tblPr>
+        <w:tblStyle w:val="TableGrid"/>
+        <w:tblW w:type="auto" w:w="0"/>
+        <w:tblLook w:firstColumn="1" w:firstRow="1" w:lastColumn="0" w:lastRow="0" w:noHBand="0" w:noVBand="1" w:val="04A0"/>
+      </w:tblPr>
+      <w:tblGrid>
+        <w:gridCol w:w="4819"/>
+        <w:gridCol w:w="4819"/>
+      </w:tblGrid>
+      <w:tr>
+        <w:tc>
+          <w:tcPr>
+            <w:tcW w:type="dxa" w:w="3969"/>
+            <w:shd w:val="clear" w:color="auto" w:fill="EBF5FB"/>
+            <w:tcBorders>
+              <w:top w:val="single" w:sz="4" w:space="0" w:color="AAAAAA"/>
+              <w:left w:val="single" w:sz="4" w:space="0" w:color="AAAAAA"/>
+              <w:bottom w:val="single" w:sz="4" w:space="0" w:color="AAAAAA"/>
+              <w:right w:val="single" w:sz="4" w:space="0" w:color="AAAAAA"/>
+            </w:tcBorders>
+          </w:tcPr>
+          <w:p>
+            <w:pPr>
+              <w:spacing w:before="60" w:after="60"/>
+              <w:ind w:left="80"/>
+            </w:pPr>
+            <w:r>
+              <w:rPr>
+                <w:b/>
+                <w:color w:val="1F3864"/>
+                <w:sz w:val="18"/>
+              </w:rPr>
+              <w:t>Name of River / Bridge *</w:t>
+            </w:r>
+          </w:p>
+        </w:tc>
+        <w:tc>
+          <w:tcPr>
+            <w:tcW w:type="dxa" w:w="5669"/>
+            <w:shd w:val="clear" w:color="auto" w:fill="FFFFFF"/>
+            <w:tcBorders>
+              <w:top w:val="single" w:sz="4" w:space="0" w:color="AAAAAA"/>
+              <w:left w:val="single" w:sz="4" w:space="0" w:color="AAAAAA"/>
+              <w:bottom w:val="single" w:sz="4" w:space="0" w:color="AAAAAA"/>
+              <w:right w:val="single" w:sz="4" w:space="0" w:color="AAAAAA"/>
+            </w:tcBorders>
+          </w:tcPr>
+          <w:p>
+            <w:pPr>
+              <w:spacing w:before="40" w:after="160"/>
+              <w:ind w:left="80"/>
+            </w:pPr>
+            <w:r>
+              <w:rPr>
+                <w:sz w:val="18"/>
+              </w:rPr>
+            </w:r>
+          </w:p>
+        </w:tc>
+      </w:tr>
+      <w:tr>
+        <w:tc>
+          <w:tcPr>
+            <w:tcW w:type="dxa" w:w="3969"/>
+            <w:shd w:val="clear" w:color="auto" w:fill="EBF5FB"/>
+            <w:tcBorders>
+              <w:top w:val="single" w:sz="4" w:space="0" w:color="AAAAAA"/>
+              <w:left w:val="single" w:sz="4" w:space="0" w:color="AAAAAA"/>
+              <w:bottom w:val="single" w:sz="4" w:space="0" w:color="AAAAAA"/>
+              <w:right w:val="single" w:sz="4" w:space="0" w:color="AAAAAA"/>
+            </w:tcBorders>
+          </w:tcPr>
+          <w:p>
+            <w:pPr>
+              <w:spacing w:before="60" w:after="60"/>
+              <w:ind w:left="80"/>
+            </w:pPr>
+            <w:r>
+              <w:rPr>
+                <w:b/>
+                <w:color w:val="1F3864"/>
+                <w:sz w:val="18"/>
+              </w:rPr>
+              <w:t>Name of Road *</w:t>
+            </w:r>
+          </w:p>
+        </w:tc>
+        <w:tc>
+          <w:tcPr>
+            <w:tcW w:type="dxa" w:w="5669"/>
+            <w:shd w:val="clear" w:color="auto" w:fill="FFFFFF"/>
+            <w:tcBorders>
+              <w:top w:val="single" w:sz="4" w:space="0" w:color="AAAAAA"/>
+              <w:left w:val="single" w:sz="4" w:space="0" w:color="AAAAAA"/>
+              <w:bottom w:val="single" w:sz="4" w:space="0" w:color="AAAAAA"/>
+              <w:right w:val="single" w:sz="4" w:space="0" w:color="AAAAAA"/>
+            </w:tcBorders>
+          </w:tcPr>
+          <w:p>
+            <w:pPr>
+              <w:spacing w:before="40" w:after="160"/>
+              <w:ind w:left="80"/>
+            </w:pPr>
+            <w:r>
+              <w:rPr>
+                <w:sz w:val="18"/>
+              </w:rPr>
+            </w:r>
+          </w:p>
+        </w:tc>
+      </w:tr>
+      <w:tr>
+        <w:tc>
+          <w:tcPr>
+            <w:tcW w:type="dxa" w:w="3969"/>
+            <w:shd w:val="clear" w:color="auto" w:fill="EBF5FB"/>
+            <w:tcBorders>
+              <w:top w:val="single" w:sz="4" w:space="0" w:color="AAAAAA"/>
+              <w:left w:val="single" w:sz="4" w:space="0" w:color="AAAAAA"/>
+              <w:bottom w:val="single" w:sz="4" w:space="0" w:color="AAAAAA"/>
+              <w:right w:val="single" w:sz="4" w:space="0" w:color="AAAAAA"/>
+            </w:tcBorders>
+          </w:tcPr>
+          <w:p>
+            <w:pPr>
+              <w:spacing w:before="60" w:after="60"/>
+              <w:ind w:left="80"/>
+            </w:pPr>
+            <w:r>
+              <w:rPr>
+                <w:b/>
+                <w:color w:val="1F3864"/>
+                <w:sz w:val="18"/>
+              </w:rPr>
+              <w:t>Chainage *</w:t>
+            </w:r>
+          </w:p>
+        </w:tc>
+        <w:tc>
+          <w:tcPr>
+            <w:tcW w:type="dxa" w:w="5669"/>
+            <w:shd w:val="clear" w:color="auto" w:fill="FFFFFF"/>
+            <w:tcBorders>
+              <w:top w:val="single" w:sz="4" w:space="0" w:color="AAAAAA"/>
+              <w:left w:val="single" w:sz="4" w:space="0" w:color="AAAAAA"/>
+              <w:bottom w:val="single" w:sz="4" w:space="0" w:color="AAAAAA"/>
+              <w:right w:val="single" w:sz="4" w:space="0" w:color="AAAAAA"/>
+            </w:tcBorders>
+          </w:tcPr>
+          <w:p>
+            <w:pPr>
+              <w:spacing w:before="40" w:after="160"/>
+              <w:ind w:left="80"/>
+            </w:pPr>
+            <w:r>
+              <w:rPr>
+                <w:sz w:val="18"/>
+              </w:rPr>
+            </w:r>
+          </w:p>
+        </w:tc>
+      </w:tr>
+      <w:tr>
+        <w:tc>
+          <w:tcPr>
+            <w:tcW w:type="dxa" w:w="3969"/>
+            <w:shd w:val="clear" w:color="auto" w:fill="FAFAFA"/>
+            <w:tcBorders>
+              <w:top w:val="single" w:sz="4" w:space="0" w:color="AAAAAA"/>
+              <w:left w:val="single" w:sz="4" w:space="0" w:color="AAAAAA"/>
+              <w:bottom w:val="single" w:sz="4" w:space="0" w:color="AAAAAA"/>
+              <w:right w:val="single" w:sz="4" w:space="0" w:color="AAAAAA"/>
+            </w:tcBorders>
+          </w:tcPr>
+          <w:p>
+            <w:pPr>
+              <w:spacing w:before="60" w:after="60"/>
+              <w:ind w:left="80"/>
+            </w:pPr>
+            <w:r>
+              <w:rPr>
+                <w:b w:val="0"/>
+                <w:color w:val="444444"/>
+                <w:sz w:val="18"/>
+              </w:rPr>
+              <w:t>Latitude</w:t>
+            </w:r>
+          </w:p>
+        </w:tc>
+        <w:tc>
+          <w:tcPr>
+            <w:tcW w:type="dxa" w:w="5669"/>
+            <w:shd w:val="clear" w:color="auto" w:fill="FFFFFF"/>
+            <w:tcBorders>
+              <w:top w:val="single" w:sz="4" w:space="0" w:color="AAAAAA"/>
+              <w:left w:val="single" w:sz="4" w:space="0" w:color="AAAAAA"/>
+              <w:bottom w:val="single" w:sz="4" w:space="0" w:color="AAAAAA"/>
+              <w:right w:val="single" w:sz="4" w:space="0" w:color="AAAAAA"/>
+            </w:tcBorders>
+          </w:tcPr>
+          <w:p>
+            <w:pPr>
+              <w:spacing w:before="40" w:after="160"/>
+              <w:ind w:left="80"/>
+            </w:pPr>
+            <w:r>
+              <w:rPr>
+                <w:sz w:val="18"/>
+              </w:rPr>
+            </w:r>
+          </w:p>
+        </w:tc>
+      </w:tr>
+      <w:tr>
+        <w:tc>
+          <w:tcPr>
+            <w:tcW w:type="dxa" w:w="3969"/>
+            <w:shd w:val="clear" w:color="auto" w:fill="FAFAFA"/>
+            <w:tcBorders>
+              <w:top w:val="single" w:sz="4" w:space="0" w:color="AAAAAA"/>
+              <w:left w:val="single" w:sz="4" w:space="0" w:color="AAAAAA"/>
+              <w:bottom w:val="single" w:sz="4" w:space="0" w:color="AAAAAA"/>
+              <w:right w:val="single" w:sz="4" w:space="0" w:color="AAAAAA"/>
+            </w:tcBorders>
+          </w:tcPr>
+          <w:p>
+            <w:pPr>
+              <w:spacing w:before="60" w:after="60"/>
+              <w:ind w:left="80"/>
+            </w:pPr>
+            <w:r>
+              <w:rPr>
+                <w:b w:val="0"/>
+                <w:color w:val="444444"/>
+                <w:sz w:val="18"/>
+              </w:rPr>
+              <w:t>Longitude</w:t>
+            </w:r>
+          </w:p>
+        </w:tc>
+        <w:tc>
+          <w:tcPr>
+            <w:tcW w:type="dxa" w:w="5669"/>
+            <w:shd w:val="clear" w:color="auto" w:fill="FFFFFF"/>
+            <w:tcBorders>
+              <w:top w:val="single" w:sz="4" w:space="0" w:color="AAAAAA"/>
+              <w:left w:val="single" w:sz="4" w:space="0" w:color="AAAAAA"/>
+              <w:bottom w:val="single" w:sz="4" w:space="0" w:color="AAAAAA"/>
+              <w:right w:val="single" w:sz="4" w:space="0" w:color="AAAAAA"/>
+            </w:tcBorders>
+          </w:tcPr>
+          <w:p>
+            <w:pPr>
+              <w:spacing w:before="40" w:after="160"/>
+              <w:ind w:left="80"/>
+            </w:pPr>
+            <w:r>
+              <w:rPr>
+                <w:sz w:val="18"/>
+              </w:rPr>
+            </w:r>
+          </w:p>
+        </w:tc>
+      </w:tr>
+      <w:tr>
+        <w:tc>
+          <w:tcPr>
+            <w:tcW w:type="dxa" w:w="3969"/>
+            <w:shd w:val="clear" w:color="auto" w:fill="EBF5FB"/>
+            <w:tcBorders>
+              <w:top w:val="single" w:sz="4" w:space="0" w:color="AAAAAA"/>
+              <w:left w:val="single" w:sz="4" w:space="0" w:color="AAAAAA"/>
+              <w:bottom w:val="single" w:sz="4" w:space="0" w:color="AAAAAA"/>
+              <w:right w:val="single" w:sz="4" w:space="0" w:color="AAAAAA"/>
+            </w:tcBorders>
+          </w:tcPr>
+          <w:p>
+            <w:pPr>
+              <w:spacing w:before="60" w:after="60"/>
+              <w:ind w:left="80"/>
+            </w:pPr>
+            <w:r>
+              <w:rPr>
+                <w:b/>
+                <w:color w:val="1F3864"/>
+                <w:sz w:val="18"/>
+              </w:rPr>
+              <w:t>Circle / Division / Sub-Division *</w:t>
+            </w:r>
+          </w:p>
+        </w:tc>
+        <w:tc>
+          <w:tcPr>
+            <w:tcW w:type="dxa" w:w="5669"/>
+            <w:shd w:val="clear" w:color="auto" w:fill="FFFFFF"/>
+            <w:tcBorders>
+              <w:top w:val="single" w:sz="4" w:space="0" w:color="AAAAAA"/>
+              <w:left w:val="single" w:sz="4" w:space="0" w:color="AAAAAA"/>
+              <w:bottom w:val="single" w:sz="4" w:space="0" w:color="AAAAAA"/>
+              <w:right w:val="single" w:sz="4" w:space="0" w:color="AAAAAA"/>
+            </w:tcBorders>
+          </w:tcPr>
+          <w:p>
+            <w:pPr>
+              <w:spacing w:before="40" w:after="160"/>
+              <w:ind w:left="80"/>
+            </w:pPr>
+            <w:r>
+              <w:rPr>
+                <w:sz w:val="18"/>
+              </w:rPr>
+            </w:r>
+          </w:p>
+        </w:tc>
+      </w:tr>
+      <w:tr>
+        <w:tc>
+          <w:tcPr>
+            <w:tcW w:type="dxa" w:w="3969"/>
+            <w:shd w:val="clear" w:color="auto" w:fill="EBF5FB"/>
+            <w:tcBorders>
+              <w:top w:val="single" w:sz="4" w:space="0" w:color="AAAAAA"/>
+              <w:left w:val="single" w:sz="4" w:space="0" w:color="AAAAAA"/>
+              <w:bottom w:val="single" w:sz="4" w:space="0" w:color="AAAAAA"/>
+              <w:right w:val="single" w:sz="4" w:space="0" w:color="AAAAAA"/>
+            </w:tcBorders>
+          </w:tcPr>
+          <w:p>
+            <w:pPr>
+              <w:spacing w:before="60" w:after="60"/>
+              <w:ind w:left="80"/>
+            </w:pPr>
+            <w:r>
+              <w:rPr>
+                <w:b/>
+                <w:color w:val="1F3864"/>
+                <w:sz w:val="18"/>
+              </w:rPr>
+              <w:t>No. of Spans *</w:t>
+            </w:r>
+          </w:p>
+        </w:tc>
+        <w:tc>
+          <w:tcPr>
+            <w:tcW w:type="dxa" w:w="5669"/>
+            <w:shd w:val="clear" w:color="auto" w:fill="FFFFFF"/>
+            <w:tcBorders>
+              <w:top w:val="single" w:sz="4" w:space="0" w:color="AAAAAA"/>
+              <w:left w:val="single" w:sz="4" w:space="0" w:color="AAAAAA"/>
+              <w:bottom w:val="single" w:sz="4" w:space="0" w:color="AAAAAA"/>
+              <w:right w:val="single" w:sz="4" w:space="0" w:color="AAAAAA"/>
+            </w:tcBorders>
+          </w:tcPr>
+          <w:p>
+            <w:pPr>
+              <w:spacing w:before="40" w:after="160"/>
+              <w:ind w:left="80"/>
+            </w:pPr>
+            <w:r>
+              <w:rPr>
+                <w:sz w:val="18"/>
+              </w:rPr>
+            </w:r>
+          </w:p>
+        </w:tc>
+      </w:tr>
+      <w:tr>
+        <w:tc>
+          <w:tcPr>
+            <w:tcW w:type="dxa" w:w="3969"/>
+            <w:shd w:val="clear" w:color="auto" w:fill="EBF5FB"/>
+            <w:tcBorders>
+              <w:top w:val="single" w:sz="4" w:space="0" w:color="AAAAAA"/>
+              <w:left w:val="single" w:sz="4" w:space="0" w:color="AAAAAA"/>
+              <w:bottom w:val="single" w:sz="4" w:space="0" w:color="AAAAAA"/>
+              <w:right w:val="single" w:sz="4" w:space="0" w:color="AAAAAA"/>
+            </w:tcBorders>
+          </w:tcPr>
+          <w:p>
+            <w:pPr>
+              <w:spacing w:before="60" w:after="60"/>
+              <w:ind w:left="80"/>
+            </w:pPr>
+            <w:r>
+              <w:rPr>
+                <w:b/>
+                <w:color w:val="1F3864"/>
+                <w:sz w:val="18"/>
+              </w:rPr>
+              <w:t>Span Length &amp; Arrangement *</w:t>
+            </w:r>
+          </w:p>
+        </w:tc>
+        <w:tc>
+          <w:tcPr>
+            <w:tcW w:type="dxa" w:w="5669"/>
+            <w:shd w:val="clear" w:color="auto" w:fill="FFFFFF"/>
+            <w:tcBorders>
+              <w:top w:val="single" w:sz="4" w:space="0" w:color="AAAAAA"/>
+              <w:left w:val="single" w:sz="4" w:space="0" w:color="AAAAAA"/>
+              <w:bottom w:val="single" w:sz="4" w:space="0" w:color="AAAAAA"/>
+              <w:right w:val="single" w:sz="4" w:space="0" w:color="AAAAAA"/>
+            </w:tcBorders>
+          </w:tcPr>
+          <w:p>
+            <w:pPr>
+              <w:spacing w:before="40" w:after="160"/>
+              <w:ind w:left="80"/>
+            </w:pPr>
+            <w:r>
+              <w:rPr>
+                <w:sz w:val="18"/>
+              </w:rPr>
+            </w:r>
+          </w:p>
+        </w:tc>
+      </w:tr>
+      <w:tr>
+        <w:tc>
+          <w:tcPr>
+            <w:tcW w:type="dxa" w:w="3969"/>
+            <w:shd w:val="clear" w:color="auto" w:fill="EBF5FB"/>
+            <w:tcBorders>
+              <w:top w:val="single" w:sz="4" w:space="0" w:color="AAAAAA"/>
+              <w:left w:val="single" w:sz="4" w:space="0" w:color="AAAAAA"/>
+              <w:bottom w:val="single" w:sz="4" w:space="0" w:color="AAAAAA"/>
+              <w:right w:val="single" w:sz="4" w:space="0" w:color="AAAAAA"/>
+            </w:tcBorders>
+          </w:tcPr>
+          <w:p>
+            <w:pPr>
+              <w:spacing w:before="60" w:after="60"/>
+              <w:ind w:left="80"/>
+            </w:pPr>
+            <w:r>
+              <w:rPr>
+                <w:b/>
+                <w:color w:val="1F3864"/>
+                <w:sz w:val="18"/>
+              </w:rPr>
+              <w:t>Total Length of Bridge (m) *</w:t>
+            </w:r>
+          </w:p>
+        </w:tc>
+        <w:tc>
+          <w:tcPr>
+            <w:tcW w:type="dxa" w:w="5669"/>
+            <w:shd w:val="clear" w:color="auto" w:fill="FFFFFF"/>
+            <w:tcBorders>
+              <w:top w:val="single" w:sz="4" w:space="0" w:color="AAAAAA"/>
+              <w:left w:val="single" w:sz="4" w:space="0" w:color="AAAAAA"/>
+              <w:bottom w:val="single" w:sz="4" w:space="0" w:color="AAAAAA"/>
+              <w:right w:val="single" w:sz="4" w:space="0" w:color="AAAAAA"/>
+            </w:tcBorders>
+          </w:tcPr>
+          <w:p>
+            <w:pPr>
+              <w:spacing w:before="40" w:after="160"/>
+              <w:ind w:left="80"/>
+            </w:pPr>
+            <w:r>
+              <w:rPr>
+                <w:sz w:val="18"/>
+              </w:rPr>
+            </w:r>
+          </w:p>
+        </w:tc>
+      </w:tr>
+      <w:tr>
+        <w:tc>
+          <w:tcPr>
+            <w:tcW w:type="dxa" w:w="3969"/>
+            <w:shd w:val="clear" w:color="auto" w:fill="FAFAFA"/>
+            <w:tcBorders>
+              <w:top w:val="single" w:sz="4" w:space="0" w:color="AAAAAA"/>
+              <w:left w:val="single" w:sz="4" w:space="0" w:color="AAAAAA"/>
+              <w:bottom w:val="single" w:sz="4" w:space="0" w:color="AAAAAA"/>
+              <w:right w:val="single" w:sz="4" w:space="0" w:color="AAAAAA"/>
+            </w:tcBorders>
+          </w:tcPr>
+          <w:p>
+            <w:pPr>
+              <w:spacing w:before="60" w:after="60"/>
+              <w:ind w:left="80"/>
+            </w:pPr>
+            <w:r>
+              <w:rPr>
+                <w:b w:val="0"/>
+                <w:color w:val="444444"/>
+                <w:sz w:val="18"/>
+              </w:rPr>
+              <w:t>Total Length of Approach (m)</w:t>
+            </w:r>
+          </w:p>
+        </w:tc>
+        <w:tc>
+          <w:tcPr>
+            <w:tcW w:type="dxa" w:w="5669"/>
+            <w:shd w:val="clear" w:color="auto" w:fill="FFFFFF"/>
+            <w:tcBorders>
+              <w:top w:val="single" w:sz="4" w:space="0" w:color="AAAAAA"/>
+              <w:left w:val="single" w:sz="4" w:space="0" w:color="AAAAAA"/>
+              <w:bottom w:val="single" w:sz="4" w:space="0" w:color="AAAAAA"/>
+              <w:right w:val="single" w:sz="4" w:space="0" w:color="AAAAAA"/>
+            </w:tcBorders>
+          </w:tcPr>
+          <w:p>
+            <w:pPr>
+              <w:spacing w:before="40" w:after="160"/>
+              <w:ind w:left="80"/>
+            </w:pPr>
+            <w:r>
+              <w:rPr>
+                <w:sz w:val="18"/>
+              </w:rPr>
+            </w:r>
+          </w:p>
+        </w:tc>
+      </w:tr>
+      <w:tr>
+        <w:tc>
+          <w:tcPr>
+            <w:tcW w:type="dxa" w:w="3969"/>
+            <w:shd w:val="clear" w:color="auto" w:fill="EBF5FB"/>
+            <w:tcBorders>
+              <w:top w:val="single" w:sz="4" w:space="0" w:color="AAAAAA"/>
+              <w:left w:val="single" w:sz="4" w:space="0" w:color="AAAAAA"/>
+              <w:bottom w:val="single" w:sz="4" w:space="0" w:color="AAAAAA"/>
+              <w:right w:val="single" w:sz="4" w:space="0" w:color="AAAAAA"/>
+            </w:tcBorders>
+          </w:tcPr>
+          <w:p>
+            <w:pPr>
+              <w:spacing w:before="60" w:after="60"/>
+              <w:ind w:left="80"/>
+            </w:pPr>
+            <w:r>
+              <w:rPr>
+                <w:b/>
+                <w:color w:val="1F3864"/>
+                <w:sz w:val="18"/>
+              </w:rPr>
+              <w:t>Type of Bridge *</w:t>
+              <w:br/>
+              <w:t>(Simply Supported / Continuous / Arch / Other)</w:t>
+            </w:r>
+          </w:p>
+        </w:tc>
+        <w:tc>
+          <w:tcPr>
+            <w:tcW w:type="dxa" w:w="5669"/>
+            <w:shd w:val="clear" w:color="auto" w:fill="FFFFFF"/>
+            <w:tcBorders>
+              <w:top w:val="single" w:sz="4" w:space="0" w:color="AAAAAA"/>
+              <w:left w:val="single" w:sz="4" w:space="0" w:color="AAAAAA"/>
+              <w:bottom w:val="single" w:sz="4" w:space="0" w:color="AAAAAA"/>
+              <w:right w:val="single" w:sz="4" w:space="0" w:color="AAAAAA"/>
+            </w:tcBorders>
+          </w:tcPr>
+          <w:p>
+            <w:pPr>
+              <w:spacing w:before="40" w:after="160"/>
+              <w:ind w:left="80"/>
+            </w:pPr>
+            <w:r>
+              <w:rPr>
+                <w:sz w:val="18"/>
+              </w:rPr>
+            </w:r>
+          </w:p>
+        </w:tc>
+      </w:tr>
+      <w:tr>
+        <w:tc>
+          <w:tcPr>
+            <w:tcW w:type="dxa" w:w="3969"/>
+            <w:shd w:val="clear" w:color="auto" w:fill="EBF5FB"/>
+            <w:tcBorders>
+              <w:top w:val="single" w:sz="4" w:space="0" w:color="AAAAAA"/>
+              <w:left w:val="single" w:sz="4" w:space="0" w:color="AAAAAA"/>
+              <w:bottom w:val="single" w:sz="4" w:space="0" w:color="AAAAAA"/>
+              <w:right w:val="single" w:sz="4" w:space="0" w:color="AAAAAA"/>
+            </w:tcBorders>
+          </w:tcPr>
+          <w:p>
+            <w:pPr>
+              <w:spacing w:before="60" w:after="60"/>
+              <w:ind w:left="80"/>
+            </w:pPr>
+            <w:r>
+              <w:rPr>
+                <w:b/>
+                <w:color w:val="1F3864"/>
+                <w:sz w:val="18"/>
+              </w:rPr>
+              <w:t>Type of Superstructure *</w:t>
+            </w:r>
+          </w:p>
+        </w:tc>
+        <w:tc>
+          <w:tcPr>
+            <w:tcW w:type="dxa" w:w="5669"/>
+            <w:shd w:val="clear" w:color="auto" w:fill="FFFFFF"/>
+            <w:tcBorders>
+              <w:top w:val="single" w:sz="4" w:space="0" w:color="AAAAAA"/>
+              <w:left w:val="single" w:sz="4" w:space="0" w:color="AAAAAA"/>
+              <w:bottom w:val="single" w:sz="4" w:space="0" w:color="AAAAAA"/>
+              <w:right w:val="single" w:sz="4" w:space="0" w:color="AAAAAA"/>
+            </w:tcBorders>
+          </w:tcPr>
+          <w:p>
+            <w:pPr>
+              <w:spacing w:before="40" w:after="160"/>
+              <w:ind w:left="80"/>
+            </w:pPr>
+            <w:r>
+              <w:rPr>
+                <w:sz w:val="18"/>
+              </w:rPr>
+            </w:r>
+          </w:p>
+        </w:tc>
+      </w:tr>
+      <w:tr>
+        <w:tc>
+          <w:tcPr>
+            <w:tcW w:type="dxa" w:w="3969"/>
+            <w:shd w:val="clear" w:color="auto" w:fill="EBF5FB"/>
+            <w:tcBorders>
+              <w:top w:val="single" w:sz="4" w:space="0" w:color="AAAAAA"/>
+              <w:left w:val="single" w:sz="4" w:space="0" w:color="AAAAAA"/>
+              <w:bottom w:val="single" w:sz="4" w:space="0" w:color="AAAAAA"/>
+              <w:right w:val="single" w:sz="4" w:space="0" w:color="AAAAAA"/>
+            </w:tcBorders>
+          </w:tcPr>
+          <w:p>
+            <w:pPr>
+              <w:spacing w:before="60" w:after="60"/>
+              <w:ind w:left="80"/>
+            </w:pPr>
+            <w:r>
+              <w:rPr>
+                <w:b/>
+                <w:color w:val="1F3864"/>
+                <w:sz w:val="18"/>
+              </w:rPr>
+              <w:t>Type of Substructure *</w:t>
+            </w:r>
+          </w:p>
+        </w:tc>
+        <w:tc>
+          <w:tcPr>
+            <w:tcW w:type="dxa" w:w="5669"/>
+            <w:shd w:val="clear" w:color="auto" w:fill="FFFFFF"/>
+            <w:tcBorders>
+              <w:top w:val="single" w:sz="4" w:space="0" w:color="AAAAAA"/>
+              <w:left w:val="single" w:sz="4" w:space="0" w:color="AAAAAA"/>
+              <w:bottom w:val="single" w:sz="4" w:space="0" w:color="AAAAAA"/>
+              <w:right w:val="single" w:sz="4" w:space="0" w:color="AAAAAA"/>
+            </w:tcBorders>
+          </w:tcPr>
+          <w:p>
+            <w:pPr>
+              <w:spacing w:before="40" w:after="160"/>
+              <w:ind w:left="80"/>
+            </w:pPr>
+            <w:r>
+              <w:rPr>
+                <w:sz w:val="18"/>
+              </w:rPr>
+            </w:r>
+          </w:p>
+        </w:tc>
+      </w:tr>
+      <w:tr>
+        <w:tc>
+          <w:tcPr>
+            <w:tcW w:type="dxa" w:w="3969"/>
+            <w:shd w:val="clear" w:color="auto" w:fill="EBF5FB"/>
+            <w:tcBorders>
+              <w:top w:val="single" w:sz="4" w:space="0" w:color="AAAAAA"/>
+              <w:left w:val="single" w:sz="4" w:space="0" w:color="AAAAAA"/>
+              <w:bottom w:val="single" w:sz="4" w:space="0" w:color="AAAAAA"/>
+              <w:right w:val="single" w:sz="4" w:space="0" w:color="AAAAAA"/>
+            </w:tcBorders>
+          </w:tcPr>
+          <w:p>
+            <w:pPr>
+              <w:spacing w:before="60" w:after="60"/>
+              <w:ind w:left="80"/>
+            </w:pPr>
+            <w:r>
+              <w:rPr>
+                <w:b/>
+                <w:color w:val="1F3864"/>
+                <w:sz w:val="18"/>
+              </w:rPr>
+              <w:t>Type of Foundation *</w:t>
+            </w:r>
+          </w:p>
+        </w:tc>
+        <w:tc>
+          <w:tcPr>
+            <w:tcW w:type="dxa" w:w="5669"/>
+            <w:shd w:val="clear" w:color="auto" w:fill="FFFFFF"/>
+            <w:tcBorders>
+              <w:top w:val="single" w:sz="4" w:space="0" w:color="AAAAAA"/>
+              <w:left w:val="single" w:sz="4" w:space="0" w:color="AAAAAA"/>
+              <w:bottom w:val="single" w:sz="4" w:space="0" w:color="AAAAAA"/>
+              <w:right w:val="single" w:sz="4" w:space="0" w:color="AAAAAA"/>
+            </w:tcBorders>
+          </w:tcPr>
+          <w:p>
+            <w:pPr>
+              <w:spacing w:before="40" w:after="160"/>
+              <w:ind w:left="80"/>
+            </w:pPr>
+            <w:r>
+              <w:rPr>
+                <w:sz w:val="18"/>
+              </w:rPr>
+            </w:r>
+          </w:p>
+        </w:tc>
+      </w:tr>
+      <w:tr>
+        <w:tc>
+          <w:tcPr>
+            <w:tcW w:type="dxa" w:w="3969"/>
+            <w:shd w:val="clear" w:color="auto" w:fill="FAFAFA"/>
+            <w:tcBorders>
+              <w:top w:val="single" w:sz="4" w:space="0" w:color="AAAAAA"/>
+              <w:left w:val="single" w:sz="4" w:space="0" w:color="AAAAAA"/>
+              <w:bottom w:val="single" w:sz="4" w:space="0" w:color="AAAAAA"/>
+              <w:right w:val="single" w:sz="4" w:space="0" w:color="AAAAAA"/>
+            </w:tcBorders>
+          </w:tcPr>
+          <w:p>
+            <w:pPr>
+              <w:spacing w:before="60" w:after="60"/>
+              <w:ind w:left="80"/>
+            </w:pPr>
+            <w:r>
+              <w:rPr>
+                <w:b w:val="0"/>
+                <w:color w:val="444444"/>
+                <w:sz w:val="18"/>
+              </w:rPr>
+              <w:t>Type of Bearing</w:t>
+            </w:r>
+          </w:p>
+        </w:tc>
+        <w:tc>
+          <w:tcPr>
+            <w:tcW w:type="dxa" w:w="5669"/>
+            <w:shd w:val="clear" w:color="auto" w:fill="FFFFFF"/>
+            <w:tcBorders>
+              <w:top w:val="single" w:sz="4" w:space="0" w:color="AAAAAA"/>
+              <w:left w:val="single" w:sz="4" w:space="0" w:color="AAAAAA"/>
+              <w:bottom w:val="single" w:sz="4" w:space="0" w:color="AAAAAA"/>
+              <w:right w:val="single" w:sz="4" w:space="0" w:color="AAAAAA"/>
+            </w:tcBorders>
+          </w:tcPr>
+          <w:p>
+            <w:pPr>
+              <w:spacing w:before="40" w:after="160"/>
+              <w:ind w:left="80"/>
+            </w:pPr>
+            <w:r>
+              <w:rPr>
+                <w:sz w:val="18"/>
+              </w:rPr>
+            </w:r>
+          </w:p>
+        </w:tc>
+      </w:tr>
+      <w:tr>
+        <w:tc>
+          <w:tcPr>
+            <w:tcW w:type="dxa" w:w="3969"/>
+            <w:shd w:val="clear" w:color="auto" w:fill="EBF5FB"/>
+            <w:tcBorders>
+              <w:top w:val="single" w:sz="4" w:space="0" w:color="AAAAAA"/>
+              <w:left w:val="single" w:sz="4" w:space="0" w:color="AAAAAA"/>
+              <w:bottom w:val="single" w:sz="4" w:space="0" w:color="AAAAAA"/>
+              <w:right w:val="single" w:sz="4" w:space="0" w:color="AAAAAA"/>
+            </w:tcBorders>
+          </w:tcPr>
+          <w:p>
+            <w:pPr>
+              <w:spacing w:before="60" w:after="60"/>
+              <w:ind w:left="80"/>
+            </w:pPr>
+            <w:r>
+              <w:rPr>
+                <w:b/>
+                <w:color w:val="1F3864"/>
+                <w:sz w:val="18"/>
+              </w:rPr>
+              <w:t>Clear Carriageway Width (m) *</w:t>
+            </w:r>
+          </w:p>
+        </w:tc>
+        <w:tc>
+          <w:tcPr>
+            <w:tcW w:type="dxa" w:w="5669"/>
+            <w:shd w:val="clear" w:color="auto" w:fill="FFFFFF"/>
+            <w:tcBorders>
+              <w:top w:val="single" w:sz="4" w:space="0" w:color="AAAAAA"/>
+              <w:left w:val="single" w:sz="4" w:space="0" w:color="AAAAAA"/>
+              <w:bottom w:val="single" w:sz="4" w:space="0" w:color="AAAAAA"/>
+              <w:right w:val="single" w:sz="4" w:space="0" w:color="AAAAAA"/>
+            </w:tcBorders>
+          </w:tcPr>
+          <w:p>
+            <w:pPr>
+              <w:spacing w:before="40" w:after="160"/>
+              <w:ind w:left="80"/>
+            </w:pPr>
+            <w:r>
+              <w:rPr>
+                <w:sz w:val="18"/>
+              </w:rPr>
+            </w:r>
+          </w:p>
+        </w:tc>
+      </w:tr>
+      <w:tr>
+        <w:tc>
+          <w:tcPr>
+            <w:tcW w:type="dxa" w:w="3969"/>
+            <w:shd w:val="clear" w:color="auto" w:fill="FAFAFA"/>
+            <w:tcBorders>
+              <w:top w:val="single" w:sz="4" w:space="0" w:color="AAAAAA"/>
+              <w:left w:val="single" w:sz="4" w:space="0" w:color="AAAAAA"/>
+              <w:bottom w:val="single" w:sz="4" w:space="0" w:color="AAAAAA"/>
+              <w:right w:val="single" w:sz="4" w:space="0" w:color="AAAAAA"/>
+            </w:tcBorders>
+          </w:tcPr>
+          <w:p>
+            <w:pPr>
+              <w:spacing w:before="60" w:after="60"/>
+              <w:ind w:left="80"/>
+            </w:pPr>
+            <w:r>
+              <w:rPr>
+                <w:b w:val="0"/>
+                <w:color w:val="444444"/>
+                <w:sz w:val="18"/>
+              </w:rPr>
+              <w:t>Type of Railing</w:t>
+              <w:br/>
+              <w:t>(RCC Parapet / Pipe Railing / Crash Barrier)</w:t>
+            </w:r>
+          </w:p>
+        </w:tc>
+        <w:tc>
+          <w:tcPr>
+            <w:tcW w:type="dxa" w:w="5669"/>
+            <w:shd w:val="clear" w:color="auto" w:fill="FFFFFF"/>
+            <w:tcBorders>
+              <w:top w:val="single" w:sz="4" w:space="0" w:color="AAAAAA"/>
+              <w:left w:val="single" w:sz="4" w:space="0" w:color="AAAAAA"/>
+              <w:bottom w:val="single" w:sz="4" w:space="0" w:color="AAAAAA"/>
+              <w:right w:val="single" w:sz="4" w:space="0" w:color="AAAAAA"/>
+            </w:tcBorders>
+          </w:tcPr>
+          <w:p>
+            <w:pPr>
+              <w:spacing w:before="40" w:after="160"/>
+              <w:ind w:left="80"/>
+            </w:pPr>
+            <w:r>
+              <w:rPr>
+                <w:sz w:val="18"/>
+              </w:rPr>
+            </w:r>
+          </w:p>
+        </w:tc>
+      </w:tr>
+      <w:tr>
+        <w:tc>
+          <w:tcPr>
+            <w:tcW w:type="dxa" w:w="3969"/>
+            <w:shd w:val="clear" w:color="auto" w:fill="EBF5FB"/>
+            <w:tcBorders>
+              <w:top w:val="single" w:sz="4" w:space="0" w:color="AAAAAA"/>
+              <w:left w:val="single" w:sz="4" w:space="0" w:color="AAAAAA"/>
+              <w:bottom w:val="single" w:sz="4" w:space="0" w:color="AAAAAA"/>
+              <w:right w:val="single" w:sz="4" w:space="0" w:color="AAAAAA"/>
+            </w:tcBorders>
+          </w:tcPr>
+          <w:p>
+            <w:pPr>
+              <w:spacing w:before="60" w:after="60"/>
+              <w:ind w:left="80"/>
+            </w:pPr>
+            <w:r>
+              <w:rPr>
+                <w:b/>
+                <w:color w:val="1F3864"/>
+                <w:sz w:val="18"/>
+              </w:rPr>
+              <w:t>Year of Construction *</w:t>
+            </w:r>
+          </w:p>
+        </w:tc>
+        <w:tc>
+          <w:tcPr>
+            <w:tcW w:type="dxa" w:w="5669"/>
+            <w:shd w:val="clear" w:color="auto" w:fill="FFFFFF"/>
+            <w:tcBorders>
+              <w:top w:val="single" w:sz="4" w:space="0" w:color="AAAAAA"/>
+              <w:left w:val="single" w:sz="4" w:space="0" w:color="AAAAAA"/>
+              <w:bottom w:val="single" w:sz="4" w:space="0" w:color="AAAAAA"/>
+              <w:right w:val="single" w:sz="4" w:space="0" w:color="AAAAAA"/>
+            </w:tcBorders>
+          </w:tcPr>
+          <w:p>
+            <w:pPr>
+              <w:spacing w:before="40" w:after="160"/>
+              <w:ind w:left="80"/>
+            </w:pPr>
+            <w:r>
+              <w:rPr>
+                <w:sz w:val="18"/>
+              </w:rPr>
+            </w:r>
+          </w:p>
+        </w:tc>
+      </w:tr>
+      <w:tr>
+        <w:tc>
+          <w:tcPr>
+            <w:tcW w:type="dxa" w:w="3969"/>
+            <w:shd w:val="clear" w:color="auto" w:fill="EBF5FB"/>
+            <w:tcBorders>
+              <w:top w:val="single" w:sz="4" w:space="0" w:color="AAAAAA"/>
+              <w:left w:val="single" w:sz="4" w:space="0" w:color="AAAAAA"/>
+              <w:bottom w:val="single" w:sz="4" w:space="0" w:color="AAAAAA"/>
+              <w:right w:val="single" w:sz="4" w:space="0" w:color="AAAAAA"/>
+            </w:tcBorders>
+          </w:tcPr>
+          <w:p>
+            <w:pPr>
+              <w:spacing w:before="60" w:after="60"/>
+              <w:ind w:left="80"/>
+            </w:pPr>
+            <w:r>
+              <w:rPr>
+                <w:b/>
+                <w:color w:val="1F3864"/>
+                <w:sz w:val="18"/>
+              </w:rPr>
+              <w:t>High Level / Submersible *</w:t>
+            </w:r>
+          </w:p>
+        </w:tc>
+        <w:tc>
+          <w:tcPr>
+            <w:tcW w:type="dxa" w:w="5669"/>
+            <w:shd w:val="clear" w:color="auto" w:fill="FFFFFF"/>
+            <w:tcBorders>
+              <w:top w:val="single" w:sz="4" w:space="0" w:color="AAAAAA"/>
+              <w:left w:val="single" w:sz="4" w:space="0" w:color="AAAAAA"/>
+              <w:bottom w:val="single" w:sz="4" w:space="0" w:color="AAAAAA"/>
+              <w:right w:val="single" w:sz="4" w:space="0" w:color="AAAAAA"/>
+            </w:tcBorders>
+          </w:tcPr>
+          <w:p>
+            <w:pPr>
+              <w:spacing w:before="40" w:after="160"/>
+              <w:ind w:left="80"/>
+            </w:pPr>
+            <w:r>
+              <w:rPr>
+                <w:sz w:val="18"/>
+              </w:rPr>
+            </w:r>
+          </w:p>
+        </w:tc>
+      </w:tr>
+      <w:tr>
+        <w:tc>
+          <w:tcPr>
+            <w:tcW w:type="dxa" w:w="3969"/>
+            <w:shd w:val="clear" w:color="auto" w:fill="EBF5FB"/>
+            <w:tcBorders>
+              <w:top w:val="single" w:sz="4" w:space="0" w:color="AAAAAA"/>
+              <w:left w:val="single" w:sz="4" w:space="0" w:color="AAAAAA"/>
+              <w:bottom w:val="single" w:sz="4" w:space="0" w:color="AAAAAA"/>
+              <w:right w:val="single" w:sz="4" w:space="0" w:color="AAAAAA"/>
+            </w:tcBorders>
+          </w:tcPr>
+          <w:p>
+            <w:pPr>
+              <w:spacing w:before="60" w:after="60"/>
+              <w:ind w:left="80"/>
+            </w:pPr>
+            <w:r>
+              <w:rPr>
+                <w:b/>
+                <w:color w:val="1F3864"/>
+                <w:sz w:val="18"/>
+              </w:rPr>
+              <w:t>River Perennial / Non-Perennial *</w:t>
+            </w:r>
+          </w:p>
+        </w:tc>
+        <w:tc>
+          <w:tcPr>
+            <w:tcW w:type="dxa" w:w="5669"/>
+            <w:shd w:val="clear" w:color="auto" w:fill="FFFFFF"/>
+            <w:tcBorders>
+              <w:top w:val="single" w:sz="4" w:space="0" w:color="AAAAAA"/>
+              <w:left w:val="single" w:sz="4" w:space="0" w:color="AAAAAA"/>
+              <w:bottom w:val="single" w:sz="4" w:space="0" w:color="AAAAAA"/>
+              <w:right w:val="single" w:sz="4" w:space="0" w:color="AAAAAA"/>
+            </w:tcBorders>
+          </w:tcPr>
+          <w:p>
+            <w:pPr>
+              <w:spacing w:before="40" w:after="160"/>
+              <w:ind w:left="80"/>
+            </w:pPr>
+            <w:r>
+              <w:rPr>
+                <w:sz w:val="18"/>
+              </w:rPr>
+            </w:r>
+          </w:p>
+        </w:tc>
+      </w:tr>
+      <w:tr>
+        <w:tc>
+          <w:tcPr>
+            <w:tcW w:type="dxa" w:w="3969"/>
+            <w:shd w:val="clear" w:color="auto" w:fill="FAFAFA"/>
+            <w:tcBorders>
+              <w:top w:val="single" w:sz="4" w:space="0" w:color="AAAAAA"/>
+              <w:left w:val="single" w:sz="4" w:space="0" w:color="AAAAAA"/>
+              <w:bottom w:val="single" w:sz="4" w:space="0" w:color="AAAAAA"/>
+              <w:right w:val="single" w:sz="4" w:space="0" w:color="AAAAAA"/>
+            </w:tcBorders>
+          </w:tcPr>
+          <w:p>
+            <w:pPr>
+              <w:spacing w:before="60" w:after="60"/>
+              <w:ind w:left="80"/>
+            </w:pPr>
+            <w:r>
+              <w:rPr>
+                <w:b w:val="0"/>
+                <w:color w:val="444444"/>
+                <w:sz w:val="18"/>
+              </w:rPr>
+              <w:t>River Training / Protection Work (if any)</w:t>
+            </w:r>
+          </w:p>
+        </w:tc>
+        <w:tc>
+          <w:tcPr>
+            <w:tcW w:type="dxa" w:w="5669"/>
+            <w:shd w:val="clear" w:color="auto" w:fill="FFFFFF"/>
+            <w:tcBorders>
+              <w:top w:val="single" w:sz="4" w:space="0" w:color="AAAAAA"/>
+              <w:left w:val="single" w:sz="4" w:space="0" w:color="AAAAAA"/>
+              <w:bottom w:val="single" w:sz="4" w:space="0" w:color="AAAAAA"/>
+              <w:right w:val="single" w:sz="4" w:space="0" w:color="AAAAAA"/>
+            </w:tcBorders>
+          </w:tcPr>
+          <w:p>
+            <w:pPr>
+              <w:spacing w:before="40" w:after="160"/>
+              <w:ind w:left="80"/>
+            </w:pPr>
+            <w:r>
+              <w:rPr>
+                <w:sz w:val="18"/>
+              </w:rPr>
+            </w:r>
+          </w:p>
+        </w:tc>
+      </w:tr>
+      <w:tr>
+        <w:tc>
+          <w:tcPr>
+            <w:tcW w:type="dxa" w:w="3969"/>
+            <w:shd w:val="clear" w:color="auto" w:fill="FAFAFA"/>
+            <w:tcBorders>
+              <w:top w:val="single" w:sz="4" w:space="0" w:color="AAAAAA"/>
+              <w:left w:val="single" w:sz="4" w:space="0" w:color="AAAAAA"/>
+              <w:bottom w:val="single" w:sz="4" w:space="0" w:color="AAAAAA"/>
+              <w:right w:val="single" w:sz="4" w:space="0" w:color="AAAAAA"/>
+            </w:tcBorders>
+          </w:tcPr>
+          <w:p>
+            <w:pPr>
+              <w:spacing w:before="60" w:after="60"/>
+              <w:ind w:left="80"/>
+            </w:pPr>
+            <w:r>
+              <w:rPr>
+                <w:b w:val="0"/>
+                <w:color w:val="444444"/>
+                <w:sz w:val="18"/>
+              </w:rPr>
+              <w:t>Previous Repair / Strengthening Work (if any)</w:t>
+            </w:r>
+          </w:p>
+        </w:tc>
+        <w:tc>
+          <w:tcPr>
+            <w:tcW w:type="dxa" w:w="5669"/>
+            <w:shd w:val="clear" w:color="auto" w:fill="FFFFFF"/>
+            <w:tcBorders>
+              <w:top w:val="single" w:sz="4" w:space="0" w:color="AAAAAA"/>
+              <w:left w:val="single" w:sz="4" w:space="0" w:color="AAAAAA"/>
+              <w:bottom w:val="single" w:sz="4" w:space="0" w:color="AAAAAA"/>
+              <w:right w:val="single" w:sz="4" w:space="0" w:color="AAAAAA"/>
+            </w:tcBorders>
+          </w:tcPr>
+          <w:p>
+            <w:pPr>
+              <w:spacing w:before="40" w:after="160"/>
+              <w:ind w:left="80"/>
+            </w:pPr>
+            <w:r>
+              <w:rPr>
+                <w:sz w:val="18"/>
+              </w:rPr>
+            </w:r>
+          </w:p>
+        </w:tc>
+      </w:tr>
+      <w:tr>
+        <w:tc>
+          <w:tcPr>
+            <w:tcW w:type="dxa" w:w="3969"/>
+            <w:shd w:val="clear" w:color="auto" w:fill="EBF5FB"/>
+            <w:tcBorders>
+              <w:top w:val="single" w:sz="4" w:space="0" w:color="AAAAAA"/>
+              <w:left w:val="single" w:sz="4" w:space="0" w:color="AAAAAA"/>
+              <w:bottom w:val="single" w:sz="4" w:space="0" w:color="AAAAAA"/>
+              <w:right w:val="single" w:sz="4" w:space="0" w:color="AAAAAA"/>
+            </w:tcBorders>
+          </w:tcPr>
+          <w:p>
+            <w:pPr>
+              <w:spacing w:before="60" w:after="60"/>
+              <w:ind w:left="80"/>
+            </w:pPr>
+            <w:r>
+              <w:rPr>
+                <w:b/>
+                <w:color w:val="1F3864"/>
+                <w:sz w:val="18"/>
+              </w:rPr>
+              <w:t>Date of Survey *</w:t>
+            </w:r>
+          </w:p>
+        </w:tc>
+        <w:tc>
+          <w:tcPr>
+            <w:tcW w:type="dxa" w:w="5669"/>
+            <w:shd w:val="clear" w:color="auto" w:fill="FFFFFF"/>
+            <w:tcBorders>
+              <w:top w:val="single" w:sz="4" w:space="0" w:color="AAAAAA"/>
+              <w:left w:val="single" w:sz="4" w:space="0" w:color="AAAAAA"/>
+              <w:bottom w:val="single" w:sz="4" w:space="0" w:color="AAAAAA"/>
+              <w:right w:val="single" w:sz="4" w:space="0" w:color="AAAAAA"/>
+            </w:tcBorders>
+          </w:tcPr>
+          <w:p>
+            <w:pPr>
+              <w:spacing w:before="40" w:after="160"/>
+              <w:ind w:left="80"/>
+            </w:pPr>
+            <w:r>
+              <w:rPr>
+                <w:sz w:val="18"/>
+              </w:rPr>
+            </w:r>
+          </w:p>
+        </w:tc>
+      </w:tr>
+      <w:tr>
+        <w:tc>
+          <w:tcPr>
+            <w:tcW w:type="dxa" w:w="3969"/>
+            <w:shd w:val="clear" w:color="auto" w:fill="EBF5FB"/>
+            <w:tcBorders>
+              <w:top w:val="single" w:sz="4" w:space="0" w:color="AAAAAA"/>
+              <w:left w:val="single" w:sz="4" w:space="0" w:color="AAAAAA"/>
+              <w:bottom w:val="single" w:sz="4" w:space="0" w:color="AAAAAA"/>
+              <w:right w:val="single" w:sz="4" w:space="0" w:color="AAAAAA"/>
+            </w:tcBorders>
+          </w:tcPr>
+          <w:p>
+            <w:pPr>
+              <w:spacing w:before="60" w:after="60"/>
+              <w:ind w:left="80"/>
+            </w:pPr>
+            <w:r>
+              <w:rPr>
+                <w:b/>
+                <w:color w:val="1F3864"/>
+                <w:sz w:val="18"/>
+              </w:rPr>
+              <w:t>Condition Rating *</w:t>
+              <w:br/>
+              <w:t>(Excellent / Good / Fair / Poor / Critical)</w:t>
+            </w:r>
+          </w:p>
+        </w:tc>
+        <w:tc>
+          <w:tcPr>
+            <w:tcW w:type="dxa" w:w="5669"/>
+            <w:shd w:val="clear" w:color="auto" w:fill="FFFFFF"/>
+            <w:tcBorders>
+              <w:top w:val="single" w:sz="4" w:space="0" w:color="AAAAAA"/>
+              <w:left w:val="single" w:sz="4" w:space="0" w:color="AAAAAA"/>
+              <w:bottom w:val="single" w:sz="4" w:space="0" w:color="AAAAAA"/>
+              <w:right w:val="single" w:sz="4" w:space="0" w:color="AAAAAA"/>
+            </w:tcBorders>
+          </w:tcPr>
+          <w:p>
+            <w:pPr>
+              <w:spacing w:before="40" w:after="160"/>
+              <w:ind w:left="80"/>
+            </w:pPr>
+            <w:r>
+              <w:rPr>
+                <w:sz w:val="18"/>
+              </w:rPr>
+            </w:r>
+          </w:p>
+        </w:tc>
+      </w:tr>
+      <w:tr>
+        <w:tc>
+          <w:tcPr>
+            <w:tcW w:type="dxa" w:w="3969"/>
+            <w:shd w:val="clear" w:color="auto" w:fill="EBF5FB"/>
+            <w:tcBorders>
+              <w:top w:val="single" w:sz="4" w:space="0" w:color="AAAAAA"/>
+              <w:left w:val="single" w:sz="4" w:space="0" w:color="AAAAAA"/>
+              <w:bottom w:val="single" w:sz="4" w:space="0" w:color="AAAAAA"/>
+              <w:right w:val="single" w:sz="4" w:space="0" w:color="AAAAAA"/>
+            </w:tcBorders>
+          </w:tcPr>
+          <w:p>
+            <w:pPr>
+              <w:spacing w:before="60" w:after="60"/>
+              <w:ind w:left="80"/>
+            </w:pPr>
+            <w:r>
+              <w:rPr>
+                <w:b/>
+                <w:color w:val="1F3864"/>
+                <w:sz w:val="18"/>
+              </w:rPr>
+              <w:t>Name of Site Engineer / Representative *</w:t>
+            </w:r>
+          </w:p>
+        </w:tc>
+        <w:tc>
+          <w:tcPr>
+            <w:tcW w:type="dxa" w:w="5669"/>
+            <w:shd w:val="clear" w:color="auto" w:fill="FFFFFF"/>
+            <w:tcBorders>
+              <w:top w:val="single" w:sz="4" w:space="0" w:color="AAAAAA"/>
+              <w:left w:val="single" w:sz="4" w:space="0" w:color="AAAAAA"/>
+              <w:bottom w:val="single" w:sz="4" w:space="0" w:color="AAAAAA"/>
+              <w:right w:val="single" w:sz="4" w:space="0" w:color="AAAAAA"/>
+            </w:tcBorders>
+          </w:tcPr>
+          <w:p>
+            <w:pPr>
+              <w:spacing w:before="40" w:after="160"/>
+              <w:ind w:left="80"/>
+            </w:pPr>
+            <w:r>
+              <w:rPr>
+                <w:sz w:val="18"/>
+              </w:rPr>
+            </w:r>
+          </w:p>
+        </w:tc>
+      </w:tr>
+      <w:tr>
+        <w:tc>
+          <w:tcPr>
+            <w:tcW w:type="dxa" w:w="3969"/>
+            <w:shd w:val="clear" w:color="auto" w:fill="FAFAFA"/>
+            <w:tcBorders>
+              <w:top w:val="single" w:sz="4" w:space="0" w:color="AAAAAA"/>
+              <w:left w:val="single" w:sz="4" w:space="0" w:color="AAAAAA"/>
+              <w:bottom w:val="single" w:sz="4" w:space="0" w:color="AAAAAA"/>
+              <w:right w:val="single" w:sz="4" w:space="0" w:color="AAAAAA"/>
+            </w:tcBorders>
+          </w:tcPr>
+          <w:p>
+            <w:pPr>
+              <w:spacing w:before="60" w:after="60"/>
+              <w:ind w:left="80"/>
+            </w:pPr>
+            <w:r>
+              <w:rPr>
+                <w:b w:val="0"/>
+                <w:color w:val="444444"/>
+                <w:sz w:val="18"/>
+              </w:rPr>
+              <w:t>Overall Observations &amp; Recommendations</w:t>
+            </w:r>
+          </w:p>
+        </w:tc>
+        <w:tc>
+          <w:tcPr>
+            <w:tcW w:type="dxa" w:w="5669"/>
+            <w:shd w:val="clear" w:color="auto" w:fill="FFFFFF"/>
+            <w:tcBorders>
+              <w:top w:val="single" w:sz="4" w:space="0" w:color="AAAAAA"/>
+              <w:left w:val="single" w:sz="4" w:space="0" w:color="AAAAAA"/>
+              <w:bottom w:val="single" w:sz="4" w:space="0" w:color="AAAAAA"/>
+              <w:right w:val="single" w:sz="4" w:space="0" w:color="AAAAAA"/>
+            </w:tcBorders>
+          </w:tcPr>
+          <w:p>
+            <w:pPr>
+              <w:spacing w:before="40" w:after="160"/>
+              <w:ind w:left="80"/>
+            </w:pPr>
+            <w:r>
+              <w:rPr>
+                <w:sz w:val="18"/>
+              </w:rPr>
+            </w:r>
+          </w:p>
+          <w:p>
+            <w:pPr>
+              <w:spacing w:before="40" w:after="160"/>
+              <w:ind w:left="80"/>
+            </w:pPr>
+            <w:r>
+              <w:rPr>
+                <w:sz w:val="18"/>
+              </w:rPr>
+            </w:r>
+          </w:p>
+          <w:p>
+            <w:pPr>
+              <w:spacing w:before="40" w:after="160"/>
+              <w:ind w:left="80"/>
+            </w:pPr>
+            <w:r>
+              <w:rPr>
+                <w:sz w:val="18"/>
+              </w:rPr>
+            </w:r>
+          </w:p>
+        </w:tc>
+      </w:tr>
+    </w:tbl>
+    <w:p>
+      <w:pPr>
+        <w:spacing w:after="120"/>
+      </w:pPr>
     </w:p>
     <w:p>
       <w:r>

</xml_diff>

<commit_message>
Revert form appendix from report (moved to SOP instead)
</commit_message>
<xml_diff>
--- a/casad_template.docx
+++ b/casad_template.docx
@@ -7273,1409 +7273,6 @@
     </w:p>
     <w:p>
       <w:pPr>
-        <w:spacing w:after="80"/>
-        <w:jc w:val="center"/>
-      </w:pPr>
-      <w:r>
-        <w:rPr>
-          <w:b/>
-          <w:color w:val="1F3864"/>
-          <w:sz w:val="24"/>
-        </w:rPr>
-        <w:t>Appendix: Bridge Details — Field Data Collection Form</w:t>
-      </w:r>
-    </w:p>
-    <w:p>
-      <w:pPr>
-        <w:spacing w:after="160"/>
-        <w:jc w:val="center"/>
-      </w:pPr>
-      <w:r>
-        <w:rPr>
-          <w:i/>
-          <w:color w:val="555555"/>
-          <w:sz w:val="18"/>
-        </w:rPr>
-        <w:t>Fill this form at site before sending information on WhatsApp. All fields marked * are mandatory.</w:t>
-      </w:r>
-    </w:p>
-    <w:tbl>
-      <w:tblPr>
-        <w:tblStyle w:val="TableGrid"/>
-        <w:tblW w:type="auto" w:w="0"/>
-        <w:tblLook w:firstColumn="1" w:firstRow="1" w:lastColumn="0" w:lastRow="0" w:noHBand="0" w:noVBand="1" w:val="04A0"/>
-      </w:tblPr>
-      <w:tblGrid>
-        <w:gridCol w:w="4819"/>
-        <w:gridCol w:w="4819"/>
-      </w:tblGrid>
-      <w:tr>
-        <w:tc>
-          <w:tcPr>
-            <w:tcW w:type="dxa" w:w="3969"/>
-            <w:shd w:val="clear" w:color="auto" w:fill="EBF5FB"/>
-            <w:tcBorders>
-              <w:top w:val="single" w:sz="4" w:space="0" w:color="AAAAAA"/>
-              <w:left w:val="single" w:sz="4" w:space="0" w:color="AAAAAA"/>
-              <w:bottom w:val="single" w:sz="4" w:space="0" w:color="AAAAAA"/>
-              <w:right w:val="single" w:sz="4" w:space="0" w:color="AAAAAA"/>
-            </w:tcBorders>
-          </w:tcPr>
-          <w:p>
-            <w:pPr>
-              <w:spacing w:before="60" w:after="60"/>
-              <w:ind w:left="80"/>
-            </w:pPr>
-            <w:r>
-              <w:rPr>
-                <w:b/>
-                <w:color w:val="1F3864"/>
-                <w:sz w:val="18"/>
-              </w:rPr>
-              <w:t>Name of River / Bridge *</w:t>
-            </w:r>
-          </w:p>
-        </w:tc>
-        <w:tc>
-          <w:tcPr>
-            <w:tcW w:type="dxa" w:w="5669"/>
-            <w:shd w:val="clear" w:color="auto" w:fill="FFFFFF"/>
-            <w:tcBorders>
-              <w:top w:val="single" w:sz="4" w:space="0" w:color="AAAAAA"/>
-              <w:left w:val="single" w:sz="4" w:space="0" w:color="AAAAAA"/>
-              <w:bottom w:val="single" w:sz="4" w:space="0" w:color="AAAAAA"/>
-              <w:right w:val="single" w:sz="4" w:space="0" w:color="AAAAAA"/>
-            </w:tcBorders>
-          </w:tcPr>
-          <w:p>
-            <w:pPr>
-              <w:spacing w:before="40" w:after="160"/>
-              <w:ind w:left="80"/>
-            </w:pPr>
-            <w:r>
-              <w:rPr>
-                <w:sz w:val="18"/>
-              </w:rPr>
-            </w:r>
-          </w:p>
-        </w:tc>
-      </w:tr>
-      <w:tr>
-        <w:tc>
-          <w:tcPr>
-            <w:tcW w:type="dxa" w:w="3969"/>
-            <w:shd w:val="clear" w:color="auto" w:fill="EBF5FB"/>
-            <w:tcBorders>
-              <w:top w:val="single" w:sz="4" w:space="0" w:color="AAAAAA"/>
-              <w:left w:val="single" w:sz="4" w:space="0" w:color="AAAAAA"/>
-              <w:bottom w:val="single" w:sz="4" w:space="0" w:color="AAAAAA"/>
-              <w:right w:val="single" w:sz="4" w:space="0" w:color="AAAAAA"/>
-            </w:tcBorders>
-          </w:tcPr>
-          <w:p>
-            <w:pPr>
-              <w:spacing w:before="60" w:after="60"/>
-              <w:ind w:left="80"/>
-            </w:pPr>
-            <w:r>
-              <w:rPr>
-                <w:b/>
-                <w:color w:val="1F3864"/>
-                <w:sz w:val="18"/>
-              </w:rPr>
-              <w:t>Name of Road *</w:t>
-            </w:r>
-          </w:p>
-        </w:tc>
-        <w:tc>
-          <w:tcPr>
-            <w:tcW w:type="dxa" w:w="5669"/>
-            <w:shd w:val="clear" w:color="auto" w:fill="FFFFFF"/>
-            <w:tcBorders>
-              <w:top w:val="single" w:sz="4" w:space="0" w:color="AAAAAA"/>
-              <w:left w:val="single" w:sz="4" w:space="0" w:color="AAAAAA"/>
-              <w:bottom w:val="single" w:sz="4" w:space="0" w:color="AAAAAA"/>
-              <w:right w:val="single" w:sz="4" w:space="0" w:color="AAAAAA"/>
-            </w:tcBorders>
-          </w:tcPr>
-          <w:p>
-            <w:pPr>
-              <w:spacing w:before="40" w:after="160"/>
-              <w:ind w:left="80"/>
-            </w:pPr>
-            <w:r>
-              <w:rPr>
-                <w:sz w:val="18"/>
-              </w:rPr>
-            </w:r>
-          </w:p>
-        </w:tc>
-      </w:tr>
-      <w:tr>
-        <w:tc>
-          <w:tcPr>
-            <w:tcW w:type="dxa" w:w="3969"/>
-            <w:shd w:val="clear" w:color="auto" w:fill="EBF5FB"/>
-            <w:tcBorders>
-              <w:top w:val="single" w:sz="4" w:space="0" w:color="AAAAAA"/>
-              <w:left w:val="single" w:sz="4" w:space="0" w:color="AAAAAA"/>
-              <w:bottom w:val="single" w:sz="4" w:space="0" w:color="AAAAAA"/>
-              <w:right w:val="single" w:sz="4" w:space="0" w:color="AAAAAA"/>
-            </w:tcBorders>
-          </w:tcPr>
-          <w:p>
-            <w:pPr>
-              <w:spacing w:before="60" w:after="60"/>
-              <w:ind w:left="80"/>
-            </w:pPr>
-            <w:r>
-              <w:rPr>
-                <w:b/>
-                <w:color w:val="1F3864"/>
-                <w:sz w:val="18"/>
-              </w:rPr>
-              <w:t>Chainage *</w:t>
-            </w:r>
-          </w:p>
-        </w:tc>
-        <w:tc>
-          <w:tcPr>
-            <w:tcW w:type="dxa" w:w="5669"/>
-            <w:shd w:val="clear" w:color="auto" w:fill="FFFFFF"/>
-            <w:tcBorders>
-              <w:top w:val="single" w:sz="4" w:space="0" w:color="AAAAAA"/>
-              <w:left w:val="single" w:sz="4" w:space="0" w:color="AAAAAA"/>
-              <w:bottom w:val="single" w:sz="4" w:space="0" w:color="AAAAAA"/>
-              <w:right w:val="single" w:sz="4" w:space="0" w:color="AAAAAA"/>
-            </w:tcBorders>
-          </w:tcPr>
-          <w:p>
-            <w:pPr>
-              <w:spacing w:before="40" w:after="160"/>
-              <w:ind w:left="80"/>
-            </w:pPr>
-            <w:r>
-              <w:rPr>
-                <w:sz w:val="18"/>
-              </w:rPr>
-            </w:r>
-          </w:p>
-        </w:tc>
-      </w:tr>
-      <w:tr>
-        <w:tc>
-          <w:tcPr>
-            <w:tcW w:type="dxa" w:w="3969"/>
-            <w:shd w:val="clear" w:color="auto" w:fill="FAFAFA"/>
-            <w:tcBorders>
-              <w:top w:val="single" w:sz="4" w:space="0" w:color="AAAAAA"/>
-              <w:left w:val="single" w:sz="4" w:space="0" w:color="AAAAAA"/>
-              <w:bottom w:val="single" w:sz="4" w:space="0" w:color="AAAAAA"/>
-              <w:right w:val="single" w:sz="4" w:space="0" w:color="AAAAAA"/>
-            </w:tcBorders>
-          </w:tcPr>
-          <w:p>
-            <w:pPr>
-              <w:spacing w:before="60" w:after="60"/>
-              <w:ind w:left="80"/>
-            </w:pPr>
-            <w:r>
-              <w:rPr>
-                <w:b w:val="0"/>
-                <w:color w:val="444444"/>
-                <w:sz w:val="18"/>
-              </w:rPr>
-              <w:t>Latitude</w:t>
-            </w:r>
-          </w:p>
-        </w:tc>
-        <w:tc>
-          <w:tcPr>
-            <w:tcW w:type="dxa" w:w="5669"/>
-            <w:shd w:val="clear" w:color="auto" w:fill="FFFFFF"/>
-            <w:tcBorders>
-              <w:top w:val="single" w:sz="4" w:space="0" w:color="AAAAAA"/>
-              <w:left w:val="single" w:sz="4" w:space="0" w:color="AAAAAA"/>
-              <w:bottom w:val="single" w:sz="4" w:space="0" w:color="AAAAAA"/>
-              <w:right w:val="single" w:sz="4" w:space="0" w:color="AAAAAA"/>
-            </w:tcBorders>
-          </w:tcPr>
-          <w:p>
-            <w:pPr>
-              <w:spacing w:before="40" w:after="160"/>
-              <w:ind w:left="80"/>
-            </w:pPr>
-            <w:r>
-              <w:rPr>
-                <w:sz w:val="18"/>
-              </w:rPr>
-            </w:r>
-          </w:p>
-        </w:tc>
-      </w:tr>
-      <w:tr>
-        <w:tc>
-          <w:tcPr>
-            <w:tcW w:type="dxa" w:w="3969"/>
-            <w:shd w:val="clear" w:color="auto" w:fill="FAFAFA"/>
-            <w:tcBorders>
-              <w:top w:val="single" w:sz="4" w:space="0" w:color="AAAAAA"/>
-              <w:left w:val="single" w:sz="4" w:space="0" w:color="AAAAAA"/>
-              <w:bottom w:val="single" w:sz="4" w:space="0" w:color="AAAAAA"/>
-              <w:right w:val="single" w:sz="4" w:space="0" w:color="AAAAAA"/>
-            </w:tcBorders>
-          </w:tcPr>
-          <w:p>
-            <w:pPr>
-              <w:spacing w:before="60" w:after="60"/>
-              <w:ind w:left="80"/>
-            </w:pPr>
-            <w:r>
-              <w:rPr>
-                <w:b w:val="0"/>
-                <w:color w:val="444444"/>
-                <w:sz w:val="18"/>
-              </w:rPr>
-              <w:t>Longitude</w:t>
-            </w:r>
-          </w:p>
-        </w:tc>
-        <w:tc>
-          <w:tcPr>
-            <w:tcW w:type="dxa" w:w="5669"/>
-            <w:shd w:val="clear" w:color="auto" w:fill="FFFFFF"/>
-            <w:tcBorders>
-              <w:top w:val="single" w:sz="4" w:space="0" w:color="AAAAAA"/>
-              <w:left w:val="single" w:sz="4" w:space="0" w:color="AAAAAA"/>
-              <w:bottom w:val="single" w:sz="4" w:space="0" w:color="AAAAAA"/>
-              <w:right w:val="single" w:sz="4" w:space="0" w:color="AAAAAA"/>
-            </w:tcBorders>
-          </w:tcPr>
-          <w:p>
-            <w:pPr>
-              <w:spacing w:before="40" w:after="160"/>
-              <w:ind w:left="80"/>
-            </w:pPr>
-            <w:r>
-              <w:rPr>
-                <w:sz w:val="18"/>
-              </w:rPr>
-            </w:r>
-          </w:p>
-        </w:tc>
-      </w:tr>
-      <w:tr>
-        <w:tc>
-          <w:tcPr>
-            <w:tcW w:type="dxa" w:w="3969"/>
-            <w:shd w:val="clear" w:color="auto" w:fill="EBF5FB"/>
-            <w:tcBorders>
-              <w:top w:val="single" w:sz="4" w:space="0" w:color="AAAAAA"/>
-              <w:left w:val="single" w:sz="4" w:space="0" w:color="AAAAAA"/>
-              <w:bottom w:val="single" w:sz="4" w:space="0" w:color="AAAAAA"/>
-              <w:right w:val="single" w:sz="4" w:space="0" w:color="AAAAAA"/>
-            </w:tcBorders>
-          </w:tcPr>
-          <w:p>
-            <w:pPr>
-              <w:spacing w:before="60" w:after="60"/>
-              <w:ind w:left="80"/>
-            </w:pPr>
-            <w:r>
-              <w:rPr>
-                <w:b/>
-                <w:color w:val="1F3864"/>
-                <w:sz w:val="18"/>
-              </w:rPr>
-              <w:t>Circle / Division / Sub-Division *</w:t>
-            </w:r>
-          </w:p>
-        </w:tc>
-        <w:tc>
-          <w:tcPr>
-            <w:tcW w:type="dxa" w:w="5669"/>
-            <w:shd w:val="clear" w:color="auto" w:fill="FFFFFF"/>
-            <w:tcBorders>
-              <w:top w:val="single" w:sz="4" w:space="0" w:color="AAAAAA"/>
-              <w:left w:val="single" w:sz="4" w:space="0" w:color="AAAAAA"/>
-              <w:bottom w:val="single" w:sz="4" w:space="0" w:color="AAAAAA"/>
-              <w:right w:val="single" w:sz="4" w:space="0" w:color="AAAAAA"/>
-            </w:tcBorders>
-          </w:tcPr>
-          <w:p>
-            <w:pPr>
-              <w:spacing w:before="40" w:after="160"/>
-              <w:ind w:left="80"/>
-            </w:pPr>
-            <w:r>
-              <w:rPr>
-                <w:sz w:val="18"/>
-              </w:rPr>
-            </w:r>
-          </w:p>
-        </w:tc>
-      </w:tr>
-      <w:tr>
-        <w:tc>
-          <w:tcPr>
-            <w:tcW w:type="dxa" w:w="3969"/>
-            <w:shd w:val="clear" w:color="auto" w:fill="EBF5FB"/>
-            <w:tcBorders>
-              <w:top w:val="single" w:sz="4" w:space="0" w:color="AAAAAA"/>
-              <w:left w:val="single" w:sz="4" w:space="0" w:color="AAAAAA"/>
-              <w:bottom w:val="single" w:sz="4" w:space="0" w:color="AAAAAA"/>
-              <w:right w:val="single" w:sz="4" w:space="0" w:color="AAAAAA"/>
-            </w:tcBorders>
-          </w:tcPr>
-          <w:p>
-            <w:pPr>
-              <w:spacing w:before="60" w:after="60"/>
-              <w:ind w:left="80"/>
-            </w:pPr>
-            <w:r>
-              <w:rPr>
-                <w:b/>
-                <w:color w:val="1F3864"/>
-                <w:sz w:val="18"/>
-              </w:rPr>
-              <w:t>No. of Spans *</w:t>
-            </w:r>
-          </w:p>
-        </w:tc>
-        <w:tc>
-          <w:tcPr>
-            <w:tcW w:type="dxa" w:w="5669"/>
-            <w:shd w:val="clear" w:color="auto" w:fill="FFFFFF"/>
-            <w:tcBorders>
-              <w:top w:val="single" w:sz="4" w:space="0" w:color="AAAAAA"/>
-              <w:left w:val="single" w:sz="4" w:space="0" w:color="AAAAAA"/>
-              <w:bottom w:val="single" w:sz="4" w:space="0" w:color="AAAAAA"/>
-              <w:right w:val="single" w:sz="4" w:space="0" w:color="AAAAAA"/>
-            </w:tcBorders>
-          </w:tcPr>
-          <w:p>
-            <w:pPr>
-              <w:spacing w:before="40" w:after="160"/>
-              <w:ind w:left="80"/>
-            </w:pPr>
-            <w:r>
-              <w:rPr>
-                <w:sz w:val="18"/>
-              </w:rPr>
-            </w:r>
-          </w:p>
-        </w:tc>
-      </w:tr>
-      <w:tr>
-        <w:tc>
-          <w:tcPr>
-            <w:tcW w:type="dxa" w:w="3969"/>
-            <w:shd w:val="clear" w:color="auto" w:fill="EBF5FB"/>
-            <w:tcBorders>
-              <w:top w:val="single" w:sz="4" w:space="0" w:color="AAAAAA"/>
-              <w:left w:val="single" w:sz="4" w:space="0" w:color="AAAAAA"/>
-              <w:bottom w:val="single" w:sz="4" w:space="0" w:color="AAAAAA"/>
-              <w:right w:val="single" w:sz="4" w:space="0" w:color="AAAAAA"/>
-            </w:tcBorders>
-          </w:tcPr>
-          <w:p>
-            <w:pPr>
-              <w:spacing w:before="60" w:after="60"/>
-              <w:ind w:left="80"/>
-            </w:pPr>
-            <w:r>
-              <w:rPr>
-                <w:b/>
-                <w:color w:val="1F3864"/>
-                <w:sz w:val="18"/>
-              </w:rPr>
-              <w:t>Span Length &amp; Arrangement *</w:t>
-            </w:r>
-          </w:p>
-        </w:tc>
-        <w:tc>
-          <w:tcPr>
-            <w:tcW w:type="dxa" w:w="5669"/>
-            <w:shd w:val="clear" w:color="auto" w:fill="FFFFFF"/>
-            <w:tcBorders>
-              <w:top w:val="single" w:sz="4" w:space="0" w:color="AAAAAA"/>
-              <w:left w:val="single" w:sz="4" w:space="0" w:color="AAAAAA"/>
-              <w:bottom w:val="single" w:sz="4" w:space="0" w:color="AAAAAA"/>
-              <w:right w:val="single" w:sz="4" w:space="0" w:color="AAAAAA"/>
-            </w:tcBorders>
-          </w:tcPr>
-          <w:p>
-            <w:pPr>
-              <w:spacing w:before="40" w:after="160"/>
-              <w:ind w:left="80"/>
-            </w:pPr>
-            <w:r>
-              <w:rPr>
-                <w:sz w:val="18"/>
-              </w:rPr>
-            </w:r>
-          </w:p>
-        </w:tc>
-      </w:tr>
-      <w:tr>
-        <w:tc>
-          <w:tcPr>
-            <w:tcW w:type="dxa" w:w="3969"/>
-            <w:shd w:val="clear" w:color="auto" w:fill="EBF5FB"/>
-            <w:tcBorders>
-              <w:top w:val="single" w:sz="4" w:space="0" w:color="AAAAAA"/>
-              <w:left w:val="single" w:sz="4" w:space="0" w:color="AAAAAA"/>
-              <w:bottom w:val="single" w:sz="4" w:space="0" w:color="AAAAAA"/>
-              <w:right w:val="single" w:sz="4" w:space="0" w:color="AAAAAA"/>
-            </w:tcBorders>
-          </w:tcPr>
-          <w:p>
-            <w:pPr>
-              <w:spacing w:before="60" w:after="60"/>
-              <w:ind w:left="80"/>
-            </w:pPr>
-            <w:r>
-              <w:rPr>
-                <w:b/>
-                <w:color w:val="1F3864"/>
-                <w:sz w:val="18"/>
-              </w:rPr>
-              <w:t>Total Length of Bridge (m) *</w:t>
-            </w:r>
-          </w:p>
-        </w:tc>
-        <w:tc>
-          <w:tcPr>
-            <w:tcW w:type="dxa" w:w="5669"/>
-            <w:shd w:val="clear" w:color="auto" w:fill="FFFFFF"/>
-            <w:tcBorders>
-              <w:top w:val="single" w:sz="4" w:space="0" w:color="AAAAAA"/>
-              <w:left w:val="single" w:sz="4" w:space="0" w:color="AAAAAA"/>
-              <w:bottom w:val="single" w:sz="4" w:space="0" w:color="AAAAAA"/>
-              <w:right w:val="single" w:sz="4" w:space="0" w:color="AAAAAA"/>
-            </w:tcBorders>
-          </w:tcPr>
-          <w:p>
-            <w:pPr>
-              <w:spacing w:before="40" w:after="160"/>
-              <w:ind w:left="80"/>
-            </w:pPr>
-            <w:r>
-              <w:rPr>
-                <w:sz w:val="18"/>
-              </w:rPr>
-            </w:r>
-          </w:p>
-        </w:tc>
-      </w:tr>
-      <w:tr>
-        <w:tc>
-          <w:tcPr>
-            <w:tcW w:type="dxa" w:w="3969"/>
-            <w:shd w:val="clear" w:color="auto" w:fill="FAFAFA"/>
-            <w:tcBorders>
-              <w:top w:val="single" w:sz="4" w:space="0" w:color="AAAAAA"/>
-              <w:left w:val="single" w:sz="4" w:space="0" w:color="AAAAAA"/>
-              <w:bottom w:val="single" w:sz="4" w:space="0" w:color="AAAAAA"/>
-              <w:right w:val="single" w:sz="4" w:space="0" w:color="AAAAAA"/>
-            </w:tcBorders>
-          </w:tcPr>
-          <w:p>
-            <w:pPr>
-              <w:spacing w:before="60" w:after="60"/>
-              <w:ind w:left="80"/>
-            </w:pPr>
-            <w:r>
-              <w:rPr>
-                <w:b w:val="0"/>
-                <w:color w:val="444444"/>
-                <w:sz w:val="18"/>
-              </w:rPr>
-              <w:t>Total Length of Approach (m)</w:t>
-            </w:r>
-          </w:p>
-        </w:tc>
-        <w:tc>
-          <w:tcPr>
-            <w:tcW w:type="dxa" w:w="5669"/>
-            <w:shd w:val="clear" w:color="auto" w:fill="FFFFFF"/>
-            <w:tcBorders>
-              <w:top w:val="single" w:sz="4" w:space="0" w:color="AAAAAA"/>
-              <w:left w:val="single" w:sz="4" w:space="0" w:color="AAAAAA"/>
-              <w:bottom w:val="single" w:sz="4" w:space="0" w:color="AAAAAA"/>
-              <w:right w:val="single" w:sz="4" w:space="0" w:color="AAAAAA"/>
-            </w:tcBorders>
-          </w:tcPr>
-          <w:p>
-            <w:pPr>
-              <w:spacing w:before="40" w:after="160"/>
-              <w:ind w:left="80"/>
-            </w:pPr>
-            <w:r>
-              <w:rPr>
-                <w:sz w:val="18"/>
-              </w:rPr>
-            </w:r>
-          </w:p>
-        </w:tc>
-      </w:tr>
-      <w:tr>
-        <w:tc>
-          <w:tcPr>
-            <w:tcW w:type="dxa" w:w="3969"/>
-            <w:shd w:val="clear" w:color="auto" w:fill="EBF5FB"/>
-            <w:tcBorders>
-              <w:top w:val="single" w:sz="4" w:space="0" w:color="AAAAAA"/>
-              <w:left w:val="single" w:sz="4" w:space="0" w:color="AAAAAA"/>
-              <w:bottom w:val="single" w:sz="4" w:space="0" w:color="AAAAAA"/>
-              <w:right w:val="single" w:sz="4" w:space="0" w:color="AAAAAA"/>
-            </w:tcBorders>
-          </w:tcPr>
-          <w:p>
-            <w:pPr>
-              <w:spacing w:before="60" w:after="60"/>
-              <w:ind w:left="80"/>
-            </w:pPr>
-            <w:r>
-              <w:rPr>
-                <w:b/>
-                <w:color w:val="1F3864"/>
-                <w:sz w:val="18"/>
-              </w:rPr>
-              <w:t>Type of Bridge *</w:t>
-              <w:br/>
-              <w:t>(Simply Supported / Continuous / Arch / Other)</w:t>
-            </w:r>
-          </w:p>
-        </w:tc>
-        <w:tc>
-          <w:tcPr>
-            <w:tcW w:type="dxa" w:w="5669"/>
-            <w:shd w:val="clear" w:color="auto" w:fill="FFFFFF"/>
-            <w:tcBorders>
-              <w:top w:val="single" w:sz="4" w:space="0" w:color="AAAAAA"/>
-              <w:left w:val="single" w:sz="4" w:space="0" w:color="AAAAAA"/>
-              <w:bottom w:val="single" w:sz="4" w:space="0" w:color="AAAAAA"/>
-              <w:right w:val="single" w:sz="4" w:space="0" w:color="AAAAAA"/>
-            </w:tcBorders>
-          </w:tcPr>
-          <w:p>
-            <w:pPr>
-              <w:spacing w:before="40" w:after="160"/>
-              <w:ind w:left="80"/>
-            </w:pPr>
-            <w:r>
-              <w:rPr>
-                <w:sz w:val="18"/>
-              </w:rPr>
-            </w:r>
-          </w:p>
-        </w:tc>
-      </w:tr>
-      <w:tr>
-        <w:tc>
-          <w:tcPr>
-            <w:tcW w:type="dxa" w:w="3969"/>
-            <w:shd w:val="clear" w:color="auto" w:fill="EBF5FB"/>
-            <w:tcBorders>
-              <w:top w:val="single" w:sz="4" w:space="0" w:color="AAAAAA"/>
-              <w:left w:val="single" w:sz="4" w:space="0" w:color="AAAAAA"/>
-              <w:bottom w:val="single" w:sz="4" w:space="0" w:color="AAAAAA"/>
-              <w:right w:val="single" w:sz="4" w:space="0" w:color="AAAAAA"/>
-            </w:tcBorders>
-          </w:tcPr>
-          <w:p>
-            <w:pPr>
-              <w:spacing w:before="60" w:after="60"/>
-              <w:ind w:left="80"/>
-            </w:pPr>
-            <w:r>
-              <w:rPr>
-                <w:b/>
-                <w:color w:val="1F3864"/>
-                <w:sz w:val="18"/>
-              </w:rPr>
-              <w:t>Type of Superstructure *</w:t>
-            </w:r>
-          </w:p>
-        </w:tc>
-        <w:tc>
-          <w:tcPr>
-            <w:tcW w:type="dxa" w:w="5669"/>
-            <w:shd w:val="clear" w:color="auto" w:fill="FFFFFF"/>
-            <w:tcBorders>
-              <w:top w:val="single" w:sz="4" w:space="0" w:color="AAAAAA"/>
-              <w:left w:val="single" w:sz="4" w:space="0" w:color="AAAAAA"/>
-              <w:bottom w:val="single" w:sz="4" w:space="0" w:color="AAAAAA"/>
-              <w:right w:val="single" w:sz="4" w:space="0" w:color="AAAAAA"/>
-            </w:tcBorders>
-          </w:tcPr>
-          <w:p>
-            <w:pPr>
-              <w:spacing w:before="40" w:after="160"/>
-              <w:ind w:left="80"/>
-            </w:pPr>
-            <w:r>
-              <w:rPr>
-                <w:sz w:val="18"/>
-              </w:rPr>
-            </w:r>
-          </w:p>
-        </w:tc>
-      </w:tr>
-      <w:tr>
-        <w:tc>
-          <w:tcPr>
-            <w:tcW w:type="dxa" w:w="3969"/>
-            <w:shd w:val="clear" w:color="auto" w:fill="EBF5FB"/>
-            <w:tcBorders>
-              <w:top w:val="single" w:sz="4" w:space="0" w:color="AAAAAA"/>
-              <w:left w:val="single" w:sz="4" w:space="0" w:color="AAAAAA"/>
-              <w:bottom w:val="single" w:sz="4" w:space="0" w:color="AAAAAA"/>
-              <w:right w:val="single" w:sz="4" w:space="0" w:color="AAAAAA"/>
-            </w:tcBorders>
-          </w:tcPr>
-          <w:p>
-            <w:pPr>
-              <w:spacing w:before="60" w:after="60"/>
-              <w:ind w:left="80"/>
-            </w:pPr>
-            <w:r>
-              <w:rPr>
-                <w:b/>
-                <w:color w:val="1F3864"/>
-                <w:sz w:val="18"/>
-              </w:rPr>
-              <w:t>Type of Substructure *</w:t>
-            </w:r>
-          </w:p>
-        </w:tc>
-        <w:tc>
-          <w:tcPr>
-            <w:tcW w:type="dxa" w:w="5669"/>
-            <w:shd w:val="clear" w:color="auto" w:fill="FFFFFF"/>
-            <w:tcBorders>
-              <w:top w:val="single" w:sz="4" w:space="0" w:color="AAAAAA"/>
-              <w:left w:val="single" w:sz="4" w:space="0" w:color="AAAAAA"/>
-              <w:bottom w:val="single" w:sz="4" w:space="0" w:color="AAAAAA"/>
-              <w:right w:val="single" w:sz="4" w:space="0" w:color="AAAAAA"/>
-            </w:tcBorders>
-          </w:tcPr>
-          <w:p>
-            <w:pPr>
-              <w:spacing w:before="40" w:after="160"/>
-              <w:ind w:left="80"/>
-            </w:pPr>
-            <w:r>
-              <w:rPr>
-                <w:sz w:val="18"/>
-              </w:rPr>
-            </w:r>
-          </w:p>
-        </w:tc>
-      </w:tr>
-      <w:tr>
-        <w:tc>
-          <w:tcPr>
-            <w:tcW w:type="dxa" w:w="3969"/>
-            <w:shd w:val="clear" w:color="auto" w:fill="EBF5FB"/>
-            <w:tcBorders>
-              <w:top w:val="single" w:sz="4" w:space="0" w:color="AAAAAA"/>
-              <w:left w:val="single" w:sz="4" w:space="0" w:color="AAAAAA"/>
-              <w:bottom w:val="single" w:sz="4" w:space="0" w:color="AAAAAA"/>
-              <w:right w:val="single" w:sz="4" w:space="0" w:color="AAAAAA"/>
-            </w:tcBorders>
-          </w:tcPr>
-          <w:p>
-            <w:pPr>
-              <w:spacing w:before="60" w:after="60"/>
-              <w:ind w:left="80"/>
-            </w:pPr>
-            <w:r>
-              <w:rPr>
-                <w:b/>
-                <w:color w:val="1F3864"/>
-                <w:sz w:val="18"/>
-              </w:rPr>
-              <w:t>Type of Foundation *</w:t>
-            </w:r>
-          </w:p>
-        </w:tc>
-        <w:tc>
-          <w:tcPr>
-            <w:tcW w:type="dxa" w:w="5669"/>
-            <w:shd w:val="clear" w:color="auto" w:fill="FFFFFF"/>
-            <w:tcBorders>
-              <w:top w:val="single" w:sz="4" w:space="0" w:color="AAAAAA"/>
-              <w:left w:val="single" w:sz="4" w:space="0" w:color="AAAAAA"/>
-              <w:bottom w:val="single" w:sz="4" w:space="0" w:color="AAAAAA"/>
-              <w:right w:val="single" w:sz="4" w:space="0" w:color="AAAAAA"/>
-            </w:tcBorders>
-          </w:tcPr>
-          <w:p>
-            <w:pPr>
-              <w:spacing w:before="40" w:after="160"/>
-              <w:ind w:left="80"/>
-            </w:pPr>
-            <w:r>
-              <w:rPr>
-                <w:sz w:val="18"/>
-              </w:rPr>
-            </w:r>
-          </w:p>
-        </w:tc>
-      </w:tr>
-      <w:tr>
-        <w:tc>
-          <w:tcPr>
-            <w:tcW w:type="dxa" w:w="3969"/>
-            <w:shd w:val="clear" w:color="auto" w:fill="FAFAFA"/>
-            <w:tcBorders>
-              <w:top w:val="single" w:sz="4" w:space="0" w:color="AAAAAA"/>
-              <w:left w:val="single" w:sz="4" w:space="0" w:color="AAAAAA"/>
-              <w:bottom w:val="single" w:sz="4" w:space="0" w:color="AAAAAA"/>
-              <w:right w:val="single" w:sz="4" w:space="0" w:color="AAAAAA"/>
-            </w:tcBorders>
-          </w:tcPr>
-          <w:p>
-            <w:pPr>
-              <w:spacing w:before="60" w:after="60"/>
-              <w:ind w:left="80"/>
-            </w:pPr>
-            <w:r>
-              <w:rPr>
-                <w:b w:val="0"/>
-                <w:color w:val="444444"/>
-                <w:sz w:val="18"/>
-              </w:rPr>
-              <w:t>Type of Bearing</w:t>
-            </w:r>
-          </w:p>
-        </w:tc>
-        <w:tc>
-          <w:tcPr>
-            <w:tcW w:type="dxa" w:w="5669"/>
-            <w:shd w:val="clear" w:color="auto" w:fill="FFFFFF"/>
-            <w:tcBorders>
-              <w:top w:val="single" w:sz="4" w:space="0" w:color="AAAAAA"/>
-              <w:left w:val="single" w:sz="4" w:space="0" w:color="AAAAAA"/>
-              <w:bottom w:val="single" w:sz="4" w:space="0" w:color="AAAAAA"/>
-              <w:right w:val="single" w:sz="4" w:space="0" w:color="AAAAAA"/>
-            </w:tcBorders>
-          </w:tcPr>
-          <w:p>
-            <w:pPr>
-              <w:spacing w:before="40" w:after="160"/>
-              <w:ind w:left="80"/>
-            </w:pPr>
-            <w:r>
-              <w:rPr>
-                <w:sz w:val="18"/>
-              </w:rPr>
-            </w:r>
-          </w:p>
-        </w:tc>
-      </w:tr>
-      <w:tr>
-        <w:tc>
-          <w:tcPr>
-            <w:tcW w:type="dxa" w:w="3969"/>
-            <w:shd w:val="clear" w:color="auto" w:fill="EBF5FB"/>
-            <w:tcBorders>
-              <w:top w:val="single" w:sz="4" w:space="0" w:color="AAAAAA"/>
-              <w:left w:val="single" w:sz="4" w:space="0" w:color="AAAAAA"/>
-              <w:bottom w:val="single" w:sz="4" w:space="0" w:color="AAAAAA"/>
-              <w:right w:val="single" w:sz="4" w:space="0" w:color="AAAAAA"/>
-            </w:tcBorders>
-          </w:tcPr>
-          <w:p>
-            <w:pPr>
-              <w:spacing w:before="60" w:after="60"/>
-              <w:ind w:left="80"/>
-            </w:pPr>
-            <w:r>
-              <w:rPr>
-                <w:b/>
-                <w:color w:val="1F3864"/>
-                <w:sz w:val="18"/>
-              </w:rPr>
-              <w:t>Clear Carriageway Width (m) *</w:t>
-            </w:r>
-          </w:p>
-        </w:tc>
-        <w:tc>
-          <w:tcPr>
-            <w:tcW w:type="dxa" w:w="5669"/>
-            <w:shd w:val="clear" w:color="auto" w:fill="FFFFFF"/>
-            <w:tcBorders>
-              <w:top w:val="single" w:sz="4" w:space="0" w:color="AAAAAA"/>
-              <w:left w:val="single" w:sz="4" w:space="0" w:color="AAAAAA"/>
-              <w:bottom w:val="single" w:sz="4" w:space="0" w:color="AAAAAA"/>
-              <w:right w:val="single" w:sz="4" w:space="0" w:color="AAAAAA"/>
-            </w:tcBorders>
-          </w:tcPr>
-          <w:p>
-            <w:pPr>
-              <w:spacing w:before="40" w:after="160"/>
-              <w:ind w:left="80"/>
-            </w:pPr>
-            <w:r>
-              <w:rPr>
-                <w:sz w:val="18"/>
-              </w:rPr>
-            </w:r>
-          </w:p>
-        </w:tc>
-      </w:tr>
-      <w:tr>
-        <w:tc>
-          <w:tcPr>
-            <w:tcW w:type="dxa" w:w="3969"/>
-            <w:shd w:val="clear" w:color="auto" w:fill="FAFAFA"/>
-            <w:tcBorders>
-              <w:top w:val="single" w:sz="4" w:space="0" w:color="AAAAAA"/>
-              <w:left w:val="single" w:sz="4" w:space="0" w:color="AAAAAA"/>
-              <w:bottom w:val="single" w:sz="4" w:space="0" w:color="AAAAAA"/>
-              <w:right w:val="single" w:sz="4" w:space="0" w:color="AAAAAA"/>
-            </w:tcBorders>
-          </w:tcPr>
-          <w:p>
-            <w:pPr>
-              <w:spacing w:before="60" w:after="60"/>
-              <w:ind w:left="80"/>
-            </w:pPr>
-            <w:r>
-              <w:rPr>
-                <w:b w:val="0"/>
-                <w:color w:val="444444"/>
-                <w:sz w:val="18"/>
-              </w:rPr>
-              <w:t>Type of Railing</w:t>
-              <w:br/>
-              <w:t>(RCC Parapet / Pipe Railing / Crash Barrier)</w:t>
-            </w:r>
-          </w:p>
-        </w:tc>
-        <w:tc>
-          <w:tcPr>
-            <w:tcW w:type="dxa" w:w="5669"/>
-            <w:shd w:val="clear" w:color="auto" w:fill="FFFFFF"/>
-            <w:tcBorders>
-              <w:top w:val="single" w:sz="4" w:space="0" w:color="AAAAAA"/>
-              <w:left w:val="single" w:sz="4" w:space="0" w:color="AAAAAA"/>
-              <w:bottom w:val="single" w:sz="4" w:space="0" w:color="AAAAAA"/>
-              <w:right w:val="single" w:sz="4" w:space="0" w:color="AAAAAA"/>
-            </w:tcBorders>
-          </w:tcPr>
-          <w:p>
-            <w:pPr>
-              <w:spacing w:before="40" w:after="160"/>
-              <w:ind w:left="80"/>
-            </w:pPr>
-            <w:r>
-              <w:rPr>
-                <w:sz w:val="18"/>
-              </w:rPr>
-            </w:r>
-          </w:p>
-        </w:tc>
-      </w:tr>
-      <w:tr>
-        <w:tc>
-          <w:tcPr>
-            <w:tcW w:type="dxa" w:w="3969"/>
-            <w:shd w:val="clear" w:color="auto" w:fill="EBF5FB"/>
-            <w:tcBorders>
-              <w:top w:val="single" w:sz="4" w:space="0" w:color="AAAAAA"/>
-              <w:left w:val="single" w:sz="4" w:space="0" w:color="AAAAAA"/>
-              <w:bottom w:val="single" w:sz="4" w:space="0" w:color="AAAAAA"/>
-              <w:right w:val="single" w:sz="4" w:space="0" w:color="AAAAAA"/>
-            </w:tcBorders>
-          </w:tcPr>
-          <w:p>
-            <w:pPr>
-              <w:spacing w:before="60" w:after="60"/>
-              <w:ind w:left="80"/>
-            </w:pPr>
-            <w:r>
-              <w:rPr>
-                <w:b/>
-                <w:color w:val="1F3864"/>
-                <w:sz w:val="18"/>
-              </w:rPr>
-              <w:t>Year of Construction *</w:t>
-            </w:r>
-          </w:p>
-        </w:tc>
-        <w:tc>
-          <w:tcPr>
-            <w:tcW w:type="dxa" w:w="5669"/>
-            <w:shd w:val="clear" w:color="auto" w:fill="FFFFFF"/>
-            <w:tcBorders>
-              <w:top w:val="single" w:sz="4" w:space="0" w:color="AAAAAA"/>
-              <w:left w:val="single" w:sz="4" w:space="0" w:color="AAAAAA"/>
-              <w:bottom w:val="single" w:sz="4" w:space="0" w:color="AAAAAA"/>
-              <w:right w:val="single" w:sz="4" w:space="0" w:color="AAAAAA"/>
-            </w:tcBorders>
-          </w:tcPr>
-          <w:p>
-            <w:pPr>
-              <w:spacing w:before="40" w:after="160"/>
-              <w:ind w:left="80"/>
-            </w:pPr>
-            <w:r>
-              <w:rPr>
-                <w:sz w:val="18"/>
-              </w:rPr>
-            </w:r>
-          </w:p>
-        </w:tc>
-      </w:tr>
-      <w:tr>
-        <w:tc>
-          <w:tcPr>
-            <w:tcW w:type="dxa" w:w="3969"/>
-            <w:shd w:val="clear" w:color="auto" w:fill="EBF5FB"/>
-            <w:tcBorders>
-              <w:top w:val="single" w:sz="4" w:space="0" w:color="AAAAAA"/>
-              <w:left w:val="single" w:sz="4" w:space="0" w:color="AAAAAA"/>
-              <w:bottom w:val="single" w:sz="4" w:space="0" w:color="AAAAAA"/>
-              <w:right w:val="single" w:sz="4" w:space="0" w:color="AAAAAA"/>
-            </w:tcBorders>
-          </w:tcPr>
-          <w:p>
-            <w:pPr>
-              <w:spacing w:before="60" w:after="60"/>
-              <w:ind w:left="80"/>
-            </w:pPr>
-            <w:r>
-              <w:rPr>
-                <w:b/>
-                <w:color w:val="1F3864"/>
-                <w:sz w:val="18"/>
-              </w:rPr>
-              <w:t>High Level / Submersible *</w:t>
-            </w:r>
-          </w:p>
-        </w:tc>
-        <w:tc>
-          <w:tcPr>
-            <w:tcW w:type="dxa" w:w="5669"/>
-            <w:shd w:val="clear" w:color="auto" w:fill="FFFFFF"/>
-            <w:tcBorders>
-              <w:top w:val="single" w:sz="4" w:space="0" w:color="AAAAAA"/>
-              <w:left w:val="single" w:sz="4" w:space="0" w:color="AAAAAA"/>
-              <w:bottom w:val="single" w:sz="4" w:space="0" w:color="AAAAAA"/>
-              <w:right w:val="single" w:sz="4" w:space="0" w:color="AAAAAA"/>
-            </w:tcBorders>
-          </w:tcPr>
-          <w:p>
-            <w:pPr>
-              <w:spacing w:before="40" w:after="160"/>
-              <w:ind w:left="80"/>
-            </w:pPr>
-            <w:r>
-              <w:rPr>
-                <w:sz w:val="18"/>
-              </w:rPr>
-            </w:r>
-          </w:p>
-        </w:tc>
-      </w:tr>
-      <w:tr>
-        <w:tc>
-          <w:tcPr>
-            <w:tcW w:type="dxa" w:w="3969"/>
-            <w:shd w:val="clear" w:color="auto" w:fill="EBF5FB"/>
-            <w:tcBorders>
-              <w:top w:val="single" w:sz="4" w:space="0" w:color="AAAAAA"/>
-              <w:left w:val="single" w:sz="4" w:space="0" w:color="AAAAAA"/>
-              <w:bottom w:val="single" w:sz="4" w:space="0" w:color="AAAAAA"/>
-              <w:right w:val="single" w:sz="4" w:space="0" w:color="AAAAAA"/>
-            </w:tcBorders>
-          </w:tcPr>
-          <w:p>
-            <w:pPr>
-              <w:spacing w:before="60" w:after="60"/>
-              <w:ind w:left="80"/>
-            </w:pPr>
-            <w:r>
-              <w:rPr>
-                <w:b/>
-                <w:color w:val="1F3864"/>
-                <w:sz w:val="18"/>
-              </w:rPr>
-              <w:t>River Perennial / Non-Perennial *</w:t>
-            </w:r>
-          </w:p>
-        </w:tc>
-        <w:tc>
-          <w:tcPr>
-            <w:tcW w:type="dxa" w:w="5669"/>
-            <w:shd w:val="clear" w:color="auto" w:fill="FFFFFF"/>
-            <w:tcBorders>
-              <w:top w:val="single" w:sz="4" w:space="0" w:color="AAAAAA"/>
-              <w:left w:val="single" w:sz="4" w:space="0" w:color="AAAAAA"/>
-              <w:bottom w:val="single" w:sz="4" w:space="0" w:color="AAAAAA"/>
-              <w:right w:val="single" w:sz="4" w:space="0" w:color="AAAAAA"/>
-            </w:tcBorders>
-          </w:tcPr>
-          <w:p>
-            <w:pPr>
-              <w:spacing w:before="40" w:after="160"/>
-              <w:ind w:left="80"/>
-            </w:pPr>
-            <w:r>
-              <w:rPr>
-                <w:sz w:val="18"/>
-              </w:rPr>
-            </w:r>
-          </w:p>
-        </w:tc>
-      </w:tr>
-      <w:tr>
-        <w:tc>
-          <w:tcPr>
-            <w:tcW w:type="dxa" w:w="3969"/>
-            <w:shd w:val="clear" w:color="auto" w:fill="FAFAFA"/>
-            <w:tcBorders>
-              <w:top w:val="single" w:sz="4" w:space="0" w:color="AAAAAA"/>
-              <w:left w:val="single" w:sz="4" w:space="0" w:color="AAAAAA"/>
-              <w:bottom w:val="single" w:sz="4" w:space="0" w:color="AAAAAA"/>
-              <w:right w:val="single" w:sz="4" w:space="0" w:color="AAAAAA"/>
-            </w:tcBorders>
-          </w:tcPr>
-          <w:p>
-            <w:pPr>
-              <w:spacing w:before="60" w:after="60"/>
-              <w:ind w:left="80"/>
-            </w:pPr>
-            <w:r>
-              <w:rPr>
-                <w:b w:val="0"/>
-                <w:color w:val="444444"/>
-                <w:sz w:val="18"/>
-              </w:rPr>
-              <w:t>River Training / Protection Work (if any)</w:t>
-            </w:r>
-          </w:p>
-        </w:tc>
-        <w:tc>
-          <w:tcPr>
-            <w:tcW w:type="dxa" w:w="5669"/>
-            <w:shd w:val="clear" w:color="auto" w:fill="FFFFFF"/>
-            <w:tcBorders>
-              <w:top w:val="single" w:sz="4" w:space="0" w:color="AAAAAA"/>
-              <w:left w:val="single" w:sz="4" w:space="0" w:color="AAAAAA"/>
-              <w:bottom w:val="single" w:sz="4" w:space="0" w:color="AAAAAA"/>
-              <w:right w:val="single" w:sz="4" w:space="0" w:color="AAAAAA"/>
-            </w:tcBorders>
-          </w:tcPr>
-          <w:p>
-            <w:pPr>
-              <w:spacing w:before="40" w:after="160"/>
-              <w:ind w:left="80"/>
-            </w:pPr>
-            <w:r>
-              <w:rPr>
-                <w:sz w:val="18"/>
-              </w:rPr>
-            </w:r>
-          </w:p>
-        </w:tc>
-      </w:tr>
-      <w:tr>
-        <w:tc>
-          <w:tcPr>
-            <w:tcW w:type="dxa" w:w="3969"/>
-            <w:shd w:val="clear" w:color="auto" w:fill="FAFAFA"/>
-            <w:tcBorders>
-              <w:top w:val="single" w:sz="4" w:space="0" w:color="AAAAAA"/>
-              <w:left w:val="single" w:sz="4" w:space="0" w:color="AAAAAA"/>
-              <w:bottom w:val="single" w:sz="4" w:space="0" w:color="AAAAAA"/>
-              <w:right w:val="single" w:sz="4" w:space="0" w:color="AAAAAA"/>
-            </w:tcBorders>
-          </w:tcPr>
-          <w:p>
-            <w:pPr>
-              <w:spacing w:before="60" w:after="60"/>
-              <w:ind w:left="80"/>
-            </w:pPr>
-            <w:r>
-              <w:rPr>
-                <w:b w:val="0"/>
-                <w:color w:val="444444"/>
-                <w:sz w:val="18"/>
-              </w:rPr>
-              <w:t>Previous Repair / Strengthening Work (if any)</w:t>
-            </w:r>
-          </w:p>
-        </w:tc>
-        <w:tc>
-          <w:tcPr>
-            <w:tcW w:type="dxa" w:w="5669"/>
-            <w:shd w:val="clear" w:color="auto" w:fill="FFFFFF"/>
-            <w:tcBorders>
-              <w:top w:val="single" w:sz="4" w:space="0" w:color="AAAAAA"/>
-              <w:left w:val="single" w:sz="4" w:space="0" w:color="AAAAAA"/>
-              <w:bottom w:val="single" w:sz="4" w:space="0" w:color="AAAAAA"/>
-              <w:right w:val="single" w:sz="4" w:space="0" w:color="AAAAAA"/>
-            </w:tcBorders>
-          </w:tcPr>
-          <w:p>
-            <w:pPr>
-              <w:spacing w:before="40" w:after="160"/>
-              <w:ind w:left="80"/>
-            </w:pPr>
-            <w:r>
-              <w:rPr>
-                <w:sz w:val="18"/>
-              </w:rPr>
-            </w:r>
-          </w:p>
-        </w:tc>
-      </w:tr>
-      <w:tr>
-        <w:tc>
-          <w:tcPr>
-            <w:tcW w:type="dxa" w:w="3969"/>
-            <w:shd w:val="clear" w:color="auto" w:fill="EBF5FB"/>
-            <w:tcBorders>
-              <w:top w:val="single" w:sz="4" w:space="0" w:color="AAAAAA"/>
-              <w:left w:val="single" w:sz="4" w:space="0" w:color="AAAAAA"/>
-              <w:bottom w:val="single" w:sz="4" w:space="0" w:color="AAAAAA"/>
-              <w:right w:val="single" w:sz="4" w:space="0" w:color="AAAAAA"/>
-            </w:tcBorders>
-          </w:tcPr>
-          <w:p>
-            <w:pPr>
-              <w:spacing w:before="60" w:after="60"/>
-              <w:ind w:left="80"/>
-            </w:pPr>
-            <w:r>
-              <w:rPr>
-                <w:b/>
-                <w:color w:val="1F3864"/>
-                <w:sz w:val="18"/>
-              </w:rPr>
-              <w:t>Date of Survey *</w:t>
-            </w:r>
-          </w:p>
-        </w:tc>
-        <w:tc>
-          <w:tcPr>
-            <w:tcW w:type="dxa" w:w="5669"/>
-            <w:shd w:val="clear" w:color="auto" w:fill="FFFFFF"/>
-            <w:tcBorders>
-              <w:top w:val="single" w:sz="4" w:space="0" w:color="AAAAAA"/>
-              <w:left w:val="single" w:sz="4" w:space="0" w:color="AAAAAA"/>
-              <w:bottom w:val="single" w:sz="4" w:space="0" w:color="AAAAAA"/>
-              <w:right w:val="single" w:sz="4" w:space="0" w:color="AAAAAA"/>
-            </w:tcBorders>
-          </w:tcPr>
-          <w:p>
-            <w:pPr>
-              <w:spacing w:before="40" w:after="160"/>
-              <w:ind w:left="80"/>
-            </w:pPr>
-            <w:r>
-              <w:rPr>
-                <w:sz w:val="18"/>
-              </w:rPr>
-            </w:r>
-          </w:p>
-        </w:tc>
-      </w:tr>
-      <w:tr>
-        <w:tc>
-          <w:tcPr>
-            <w:tcW w:type="dxa" w:w="3969"/>
-            <w:shd w:val="clear" w:color="auto" w:fill="EBF5FB"/>
-            <w:tcBorders>
-              <w:top w:val="single" w:sz="4" w:space="0" w:color="AAAAAA"/>
-              <w:left w:val="single" w:sz="4" w:space="0" w:color="AAAAAA"/>
-              <w:bottom w:val="single" w:sz="4" w:space="0" w:color="AAAAAA"/>
-              <w:right w:val="single" w:sz="4" w:space="0" w:color="AAAAAA"/>
-            </w:tcBorders>
-          </w:tcPr>
-          <w:p>
-            <w:pPr>
-              <w:spacing w:before="60" w:after="60"/>
-              <w:ind w:left="80"/>
-            </w:pPr>
-            <w:r>
-              <w:rPr>
-                <w:b/>
-                <w:color w:val="1F3864"/>
-                <w:sz w:val="18"/>
-              </w:rPr>
-              <w:t>Condition Rating *</w:t>
-              <w:br/>
-              <w:t>(Excellent / Good / Fair / Poor / Critical)</w:t>
-            </w:r>
-          </w:p>
-        </w:tc>
-        <w:tc>
-          <w:tcPr>
-            <w:tcW w:type="dxa" w:w="5669"/>
-            <w:shd w:val="clear" w:color="auto" w:fill="FFFFFF"/>
-            <w:tcBorders>
-              <w:top w:val="single" w:sz="4" w:space="0" w:color="AAAAAA"/>
-              <w:left w:val="single" w:sz="4" w:space="0" w:color="AAAAAA"/>
-              <w:bottom w:val="single" w:sz="4" w:space="0" w:color="AAAAAA"/>
-              <w:right w:val="single" w:sz="4" w:space="0" w:color="AAAAAA"/>
-            </w:tcBorders>
-          </w:tcPr>
-          <w:p>
-            <w:pPr>
-              <w:spacing w:before="40" w:after="160"/>
-              <w:ind w:left="80"/>
-            </w:pPr>
-            <w:r>
-              <w:rPr>
-                <w:sz w:val="18"/>
-              </w:rPr>
-            </w:r>
-          </w:p>
-        </w:tc>
-      </w:tr>
-      <w:tr>
-        <w:tc>
-          <w:tcPr>
-            <w:tcW w:type="dxa" w:w="3969"/>
-            <w:shd w:val="clear" w:color="auto" w:fill="EBF5FB"/>
-            <w:tcBorders>
-              <w:top w:val="single" w:sz="4" w:space="0" w:color="AAAAAA"/>
-              <w:left w:val="single" w:sz="4" w:space="0" w:color="AAAAAA"/>
-              <w:bottom w:val="single" w:sz="4" w:space="0" w:color="AAAAAA"/>
-              <w:right w:val="single" w:sz="4" w:space="0" w:color="AAAAAA"/>
-            </w:tcBorders>
-          </w:tcPr>
-          <w:p>
-            <w:pPr>
-              <w:spacing w:before="60" w:after="60"/>
-              <w:ind w:left="80"/>
-            </w:pPr>
-            <w:r>
-              <w:rPr>
-                <w:b/>
-                <w:color w:val="1F3864"/>
-                <w:sz w:val="18"/>
-              </w:rPr>
-              <w:t>Name of Site Engineer / Representative *</w:t>
-            </w:r>
-          </w:p>
-        </w:tc>
-        <w:tc>
-          <w:tcPr>
-            <w:tcW w:type="dxa" w:w="5669"/>
-            <w:shd w:val="clear" w:color="auto" w:fill="FFFFFF"/>
-            <w:tcBorders>
-              <w:top w:val="single" w:sz="4" w:space="0" w:color="AAAAAA"/>
-              <w:left w:val="single" w:sz="4" w:space="0" w:color="AAAAAA"/>
-              <w:bottom w:val="single" w:sz="4" w:space="0" w:color="AAAAAA"/>
-              <w:right w:val="single" w:sz="4" w:space="0" w:color="AAAAAA"/>
-            </w:tcBorders>
-          </w:tcPr>
-          <w:p>
-            <w:pPr>
-              <w:spacing w:before="40" w:after="160"/>
-              <w:ind w:left="80"/>
-            </w:pPr>
-            <w:r>
-              <w:rPr>
-                <w:sz w:val="18"/>
-              </w:rPr>
-            </w:r>
-          </w:p>
-        </w:tc>
-      </w:tr>
-      <w:tr>
-        <w:tc>
-          <w:tcPr>
-            <w:tcW w:type="dxa" w:w="3969"/>
-            <w:shd w:val="clear" w:color="auto" w:fill="FAFAFA"/>
-            <w:tcBorders>
-              <w:top w:val="single" w:sz="4" w:space="0" w:color="AAAAAA"/>
-              <w:left w:val="single" w:sz="4" w:space="0" w:color="AAAAAA"/>
-              <w:bottom w:val="single" w:sz="4" w:space="0" w:color="AAAAAA"/>
-              <w:right w:val="single" w:sz="4" w:space="0" w:color="AAAAAA"/>
-            </w:tcBorders>
-          </w:tcPr>
-          <w:p>
-            <w:pPr>
-              <w:spacing w:before="60" w:after="60"/>
-              <w:ind w:left="80"/>
-            </w:pPr>
-            <w:r>
-              <w:rPr>
-                <w:b w:val="0"/>
-                <w:color w:val="444444"/>
-                <w:sz w:val="18"/>
-              </w:rPr>
-              <w:t>Overall Observations &amp; Recommendations</w:t>
-            </w:r>
-          </w:p>
-        </w:tc>
-        <w:tc>
-          <w:tcPr>
-            <w:tcW w:type="dxa" w:w="5669"/>
-            <w:shd w:val="clear" w:color="auto" w:fill="FFFFFF"/>
-            <w:tcBorders>
-              <w:top w:val="single" w:sz="4" w:space="0" w:color="AAAAAA"/>
-              <w:left w:val="single" w:sz="4" w:space="0" w:color="AAAAAA"/>
-              <w:bottom w:val="single" w:sz="4" w:space="0" w:color="AAAAAA"/>
-              <w:right w:val="single" w:sz="4" w:space="0" w:color="AAAAAA"/>
-            </w:tcBorders>
-          </w:tcPr>
-          <w:p>
-            <w:pPr>
-              <w:spacing w:before="40" w:after="160"/>
-              <w:ind w:left="80"/>
-            </w:pPr>
-            <w:r>
-              <w:rPr>
-                <w:sz w:val="18"/>
-              </w:rPr>
-            </w:r>
-          </w:p>
-          <w:p>
-            <w:pPr>
-              <w:spacing w:before="40" w:after="160"/>
-              <w:ind w:left="80"/>
-            </w:pPr>
-            <w:r>
-              <w:rPr>
-                <w:sz w:val="18"/>
-              </w:rPr>
-            </w:r>
-          </w:p>
-          <w:p>
-            <w:pPr>
-              <w:spacing w:before="40" w:after="160"/>
-              <w:ind w:left="80"/>
-            </w:pPr>
-            <w:r>
-              <w:rPr>
-                <w:sz w:val="18"/>
-              </w:rPr>
-            </w:r>
-          </w:p>
-        </w:tc>
-      </w:tr>
-    </w:tbl>
-    <w:p>
-      <w:pPr>
-        <w:spacing w:after="120"/>
-      </w:pPr>
-    </w:p>
-    <w:p>
-      <w:r>
-        <w:br w:type="page"/>
-      </w:r>
-    </w:p>
-    <w:p>
-      <w:pPr>
         <w:jc w:val="center"/>
       </w:pPr>
       <w:r>

</xml_diff>

<commit_message>
Fix section headers, photo refs, SR column width in report
- create_template.py: B2-B9 section headers now use b_section_header()
  with light blue bg and merged description+details columns; SR column
  narrowed from 0.7cm to 0.5cm
- ai_parse.py: Claude instructed to append (Photo No.-X) refs in
  observation fields; numbered photo info passed in user_content
- report_gen.py: accept both 'damage' and 'damaged' category strings
- casad_template.docx: regenerated with above changes

Co-Authored-By: Claude Sonnet 4.6 <noreply@anthropic.com>
</commit_message>
<xml_diff>
--- a/casad_template.docx
+++ b/casad_template.docx
@@ -44,7 +44,7 @@
       <w:tr>
         <w:tc>
           <w:tcPr>
-            <w:tcW w:type="dxa" w:w="397"/>
+            <w:tcW w:type="dxa" w:w="283"/>
             <w:shd w:val="clear" w:color="auto" w:fill="1F3864"/>
             <w:tcBorders>
               <w:top w:val="single" w:sz="4" w:space="0" w:color="FFFFFF"/>
@@ -72,7 +72,7 @@
         </w:tc>
         <w:tc>
           <w:tcPr>
-            <w:tcW w:type="dxa" w:w="4252"/>
+            <w:tcW w:type="dxa" w:w="4365"/>
             <w:shd w:val="clear" w:color="auto" w:fill="1F3864"/>
             <w:tcBorders>
               <w:top w:val="single" w:sz="4" w:space="0" w:color="FFFFFF"/>
@@ -155,7 +155,7 @@
       <w:tr>
         <w:tc>
           <w:tcPr>
-            <w:tcW w:type="dxa" w:w="397"/>
+            <w:tcW w:type="dxa" w:w="283"/>
             <w:shd w:val="clear" w:color="auto" w:fill="FFFFFF"/>
             <w:tcBorders>
               <w:top w:val="single" w:sz="4" w:space="0" w:color="AAAAAA"/>
@@ -181,7 +181,7 @@
         </w:tc>
         <w:tc>
           <w:tcPr>
-            <w:tcW w:type="dxa" w:w="4252"/>
+            <w:tcW w:type="dxa" w:w="4365"/>
             <w:shd w:val="clear" w:color="auto" w:fill="FFFFFF"/>
             <w:tcBorders>
               <w:top w:val="single" w:sz="4" w:space="0" w:color="AAAAAA"/>
@@ -235,7 +235,7 @@
       <w:tr>
         <w:tc>
           <w:tcPr>
-            <w:tcW w:type="dxa" w:w="397"/>
+            <w:tcW w:type="dxa" w:w="283"/>
             <w:shd w:val="clear" w:color="auto" w:fill="FFFFFF"/>
             <w:tcBorders>
               <w:top w:val="single" w:sz="4" w:space="0" w:color="AAAAAA"/>
@@ -261,7 +261,7 @@
         </w:tc>
         <w:tc>
           <w:tcPr>
-            <w:tcW w:type="dxa" w:w="4252"/>
+            <w:tcW w:type="dxa" w:w="4365"/>
             <w:shd w:val="clear" w:color="auto" w:fill="FFFFFF"/>
             <w:tcBorders>
               <w:top w:val="single" w:sz="4" w:space="0" w:color="AAAAAA"/>
@@ -315,7 +315,7 @@
       <w:tr>
         <w:tc>
           <w:tcPr>
-            <w:tcW w:type="dxa" w:w="397"/>
+            <w:tcW w:type="dxa" w:w="283"/>
             <w:shd w:val="clear" w:color="auto" w:fill="FFFFFF"/>
             <w:tcBorders>
               <w:top w:val="single" w:sz="4" w:space="0" w:color="AAAAAA"/>
@@ -341,7 +341,7 @@
         </w:tc>
         <w:tc>
           <w:tcPr>
-            <w:tcW w:type="dxa" w:w="4252"/>
+            <w:tcW w:type="dxa" w:w="4365"/>
             <w:shd w:val="clear" w:color="auto" w:fill="FFFFFF"/>
             <w:tcBorders>
               <w:top w:val="single" w:sz="4" w:space="0" w:color="AAAAAA"/>
@@ -403,7 +403,7 @@
       <w:tr>
         <w:tc>
           <w:tcPr>
-            <w:tcW w:type="dxa" w:w="397"/>
+            <w:tcW w:type="dxa" w:w="283"/>
             <w:shd w:val="clear" w:color="auto" w:fill="FFFFFF"/>
             <w:tcBorders>
               <w:top w:val="single" w:sz="4" w:space="0" w:color="AAAAAA"/>
@@ -429,7 +429,7 @@
         </w:tc>
         <w:tc>
           <w:tcPr>
-            <w:tcW w:type="dxa" w:w="4252"/>
+            <w:tcW w:type="dxa" w:w="4365"/>
             <w:shd w:val="clear" w:color="auto" w:fill="FFFFFF"/>
             <w:tcBorders>
               <w:top w:val="single" w:sz="4" w:space="0" w:color="AAAAAA"/>
@@ -491,7 +491,7 @@
       <w:tr>
         <w:tc>
           <w:tcPr>
-            <w:tcW w:type="dxa" w:w="397"/>
+            <w:tcW w:type="dxa" w:w="283"/>
             <w:shd w:val="clear" w:color="auto" w:fill="FFFFFF"/>
             <w:tcBorders>
               <w:top w:val="single" w:sz="4" w:space="0" w:color="AAAAAA"/>
@@ -517,7 +517,7 @@
         </w:tc>
         <w:tc>
           <w:tcPr>
-            <w:tcW w:type="dxa" w:w="4252"/>
+            <w:tcW w:type="dxa" w:w="4365"/>
             <w:shd w:val="clear" w:color="auto" w:fill="FFFFFF"/>
             <w:tcBorders>
               <w:top w:val="single" w:sz="4" w:space="0" w:color="AAAAAA"/>
@@ -571,7 +571,7 @@
       <w:tr>
         <w:tc>
           <w:tcPr>
-            <w:tcW w:type="dxa" w:w="397"/>
+            <w:tcW w:type="dxa" w:w="283"/>
             <w:shd w:val="clear" w:color="auto" w:fill="FFFFFF"/>
             <w:tcBorders>
               <w:top w:val="single" w:sz="4" w:space="0" w:color="AAAAAA"/>
@@ -597,7 +597,7 @@
         </w:tc>
         <w:tc>
           <w:tcPr>
-            <w:tcW w:type="dxa" w:w="4252"/>
+            <w:tcW w:type="dxa" w:w="4365"/>
             <w:shd w:val="clear" w:color="auto" w:fill="FFFFFF"/>
             <w:tcBorders>
               <w:top w:val="single" w:sz="4" w:space="0" w:color="AAAAAA"/>
@@ -651,7 +651,7 @@
       <w:tr>
         <w:tc>
           <w:tcPr>
-            <w:tcW w:type="dxa" w:w="397"/>
+            <w:tcW w:type="dxa" w:w="283"/>
             <w:shd w:val="clear" w:color="auto" w:fill="FFFFFF"/>
             <w:tcBorders>
               <w:top w:val="single" w:sz="4" w:space="0" w:color="AAAAAA"/>
@@ -677,7 +677,7 @@
         </w:tc>
         <w:tc>
           <w:tcPr>
-            <w:tcW w:type="dxa" w:w="4252"/>
+            <w:tcW w:type="dxa" w:w="4365"/>
             <w:shd w:val="clear" w:color="auto" w:fill="FFFFFF"/>
             <w:tcBorders>
               <w:top w:val="single" w:sz="4" w:space="0" w:color="AAAAAA"/>
@@ -733,7 +733,7 @@
       <w:tr>
         <w:tc>
           <w:tcPr>
-            <w:tcW w:type="dxa" w:w="397"/>
+            <w:tcW w:type="dxa" w:w="283"/>
             <w:shd w:val="clear" w:color="auto" w:fill="FFFFFF"/>
             <w:tcBorders>
               <w:top w:val="single" w:sz="4" w:space="0" w:color="AAAAAA"/>
@@ -759,7 +759,7 @@
         </w:tc>
         <w:tc>
           <w:tcPr>
-            <w:tcW w:type="dxa" w:w="4252"/>
+            <w:tcW w:type="dxa" w:w="4365"/>
             <w:shd w:val="clear" w:color="auto" w:fill="FFFFFF"/>
             <w:tcBorders>
               <w:top w:val="single" w:sz="4" w:space="0" w:color="AAAAAA"/>
@@ -813,7 +813,7 @@
       <w:tr>
         <w:tc>
           <w:tcPr>
-            <w:tcW w:type="dxa" w:w="397"/>
+            <w:tcW w:type="dxa" w:w="283"/>
             <w:shd w:val="clear" w:color="auto" w:fill="FFFFFF"/>
             <w:tcBorders>
               <w:top w:val="single" w:sz="4" w:space="0" w:color="AAAAAA"/>
@@ -839,7 +839,7 @@
         </w:tc>
         <w:tc>
           <w:tcPr>
-            <w:tcW w:type="dxa" w:w="4252"/>
+            <w:tcW w:type="dxa" w:w="4365"/>
             <w:shd w:val="clear" w:color="auto" w:fill="FFFFFF"/>
             <w:tcBorders>
               <w:top w:val="single" w:sz="4" w:space="0" w:color="AAAAAA"/>
@@ -893,7 +893,7 @@
       <w:tr>
         <w:tc>
           <w:tcPr>
-            <w:tcW w:type="dxa" w:w="397"/>
+            <w:tcW w:type="dxa" w:w="283"/>
             <w:shd w:val="clear" w:color="auto" w:fill="FFFFFF"/>
             <w:tcBorders>
               <w:top w:val="single" w:sz="4" w:space="0" w:color="AAAAAA"/>
@@ -919,7 +919,7 @@
         </w:tc>
         <w:tc>
           <w:tcPr>
-            <w:tcW w:type="dxa" w:w="4252"/>
+            <w:tcW w:type="dxa" w:w="4365"/>
             <w:shd w:val="clear" w:color="auto" w:fill="FFFFFF"/>
             <w:tcBorders>
               <w:top w:val="single" w:sz="4" w:space="0" w:color="AAAAAA"/>
@@ -973,7 +973,7 @@
       <w:tr>
         <w:tc>
           <w:tcPr>
-            <w:tcW w:type="dxa" w:w="397"/>
+            <w:tcW w:type="dxa" w:w="283"/>
             <w:shd w:val="clear" w:color="auto" w:fill="FFFFFF"/>
             <w:tcBorders>
               <w:top w:val="single" w:sz="4" w:space="0" w:color="AAAAAA"/>
@@ -999,7 +999,7 @@
         </w:tc>
         <w:tc>
           <w:tcPr>
-            <w:tcW w:type="dxa" w:w="4252"/>
+            <w:tcW w:type="dxa" w:w="4365"/>
             <w:shd w:val="clear" w:color="auto" w:fill="FFFFFF"/>
             <w:tcBorders>
               <w:top w:val="single" w:sz="4" w:space="0" w:color="AAAAAA"/>
@@ -1053,7 +1053,7 @@
       <w:tr>
         <w:tc>
           <w:tcPr>
-            <w:tcW w:type="dxa" w:w="397"/>
+            <w:tcW w:type="dxa" w:w="283"/>
             <w:shd w:val="clear" w:color="auto" w:fill="FFFFFF"/>
             <w:tcBorders>
               <w:top w:val="single" w:sz="4" w:space="0" w:color="AAAAAA"/>
@@ -1079,7 +1079,7 @@
         </w:tc>
         <w:tc>
           <w:tcPr>
-            <w:tcW w:type="dxa" w:w="4252"/>
+            <w:tcW w:type="dxa" w:w="4365"/>
             <w:shd w:val="clear" w:color="auto" w:fill="FFFFFF"/>
             <w:tcBorders>
               <w:top w:val="single" w:sz="4" w:space="0" w:color="AAAAAA"/>
@@ -1133,7 +1133,7 @@
       <w:tr>
         <w:tc>
           <w:tcPr>
-            <w:tcW w:type="dxa" w:w="397"/>
+            <w:tcW w:type="dxa" w:w="283"/>
             <w:shd w:val="clear" w:color="auto" w:fill="FFFFFF"/>
             <w:tcBorders>
               <w:top w:val="single" w:sz="4" w:space="0" w:color="AAAAAA"/>
@@ -1159,7 +1159,7 @@
         </w:tc>
         <w:tc>
           <w:tcPr>
-            <w:tcW w:type="dxa" w:w="4252"/>
+            <w:tcW w:type="dxa" w:w="4365"/>
             <w:shd w:val="clear" w:color="auto" w:fill="FFFFFF"/>
             <w:tcBorders>
               <w:top w:val="single" w:sz="4" w:space="0" w:color="AAAAAA"/>
@@ -1213,7 +1213,7 @@
       <w:tr>
         <w:tc>
           <w:tcPr>
-            <w:tcW w:type="dxa" w:w="397"/>
+            <w:tcW w:type="dxa" w:w="283"/>
             <w:shd w:val="clear" w:color="auto" w:fill="FFFFFF"/>
             <w:tcBorders>
               <w:top w:val="single" w:sz="4" w:space="0" w:color="AAAAAA"/>
@@ -1239,7 +1239,7 @@
         </w:tc>
         <w:tc>
           <w:tcPr>
-            <w:tcW w:type="dxa" w:w="4252"/>
+            <w:tcW w:type="dxa" w:w="4365"/>
             <w:shd w:val="clear" w:color="auto" w:fill="FFFFFF"/>
             <w:tcBorders>
               <w:top w:val="single" w:sz="4" w:space="0" w:color="AAAAAA"/>
@@ -1295,7 +1295,7 @@
       <w:tr>
         <w:tc>
           <w:tcPr>
-            <w:tcW w:type="dxa" w:w="397"/>
+            <w:tcW w:type="dxa" w:w="283"/>
             <w:shd w:val="clear" w:color="auto" w:fill="FFFFFF"/>
             <w:tcBorders>
               <w:top w:val="single" w:sz="4" w:space="0" w:color="AAAAAA"/>
@@ -1321,7 +1321,7 @@
         </w:tc>
         <w:tc>
           <w:tcPr>
-            <w:tcW w:type="dxa" w:w="4252"/>
+            <w:tcW w:type="dxa" w:w="4365"/>
             <w:shd w:val="clear" w:color="auto" w:fill="FFFFFF"/>
             <w:tcBorders>
               <w:top w:val="single" w:sz="4" w:space="0" w:color="AAAAAA"/>
@@ -1375,7 +1375,7 @@
       <w:tr>
         <w:tc>
           <w:tcPr>
-            <w:tcW w:type="dxa" w:w="397"/>
+            <w:tcW w:type="dxa" w:w="283"/>
             <w:shd w:val="clear" w:color="auto" w:fill="FFFFFF"/>
             <w:tcBorders>
               <w:top w:val="single" w:sz="4" w:space="0" w:color="AAAAAA"/>
@@ -1401,7 +1401,7 @@
         </w:tc>
         <w:tc>
           <w:tcPr>
-            <w:tcW w:type="dxa" w:w="4252"/>
+            <w:tcW w:type="dxa" w:w="4365"/>
             <w:shd w:val="clear" w:color="auto" w:fill="FFFFFF"/>
             <w:tcBorders>
               <w:top w:val="single" w:sz="4" w:space="0" w:color="AAAAAA"/>
@@ -1455,7 +1455,7 @@
       <w:tr>
         <w:tc>
           <w:tcPr>
-            <w:tcW w:type="dxa" w:w="397"/>
+            <w:tcW w:type="dxa" w:w="283"/>
             <w:shd w:val="clear" w:color="auto" w:fill="FFFFFF"/>
             <w:tcBorders>
               <w:top w:val="single" w:sz="4" w:space="0" w:color="AAAAAA"/>
@@ -1481,7 +1481,7 @@
         </w:tc>
         <w:tc>
           <w:tcPr>
-            <w:tcW w:type="dxa" w:w="4252"/>
+            <w:tcW w:type="dxa" w:w="4365"/>
             <w:shd w:val="clear" w:color="auto" w:fill="FFFFFF"/>
             <w:tcBorders>
               <w:top w:val="single" w:sz="4" w:space="0" w:color="AAAAAA"/>
@@ -1535,7 +1535,7 @@
       <w:tr>
         <w:tc>
           <w:tcPr>
-            <w:tcW w:type="dxa" w:w="397"/>
+            <w:tcW w:type="dxa" w:w="283"/>
             <w:shd w:val="clear" w:color="auto" w:fill="FFFFFF"/>
             <w:tcBorders>
               <w:top w:val="single" w:sz="4" w:space="0" w:color="AAAAAA"/>
@@ -1561,7 +1561,7 @@
         </w:tc>
         <w:tc>
           <w:tcPr>
-            <w:tcW w:type="dxa" w:w="4252"/>
+            <w:tcW w:type="dxa" w:w="4365"/>
             <w:shd w:val="clear" w:color="auto" w:fill="FFFFFF"/>
             <w:tcBorders>
               <w:top w:val="single" w:sz="4" w:space="0" w:color="AAAAAA"/>
@@ -1615,7 +1615,7 @@
       <w:tr>
         <w:tc>
           <w:tcPr>
-            <w:tcW w:type="dxa" w:w="397"/>
+            <w:tcW w:type="dxa" w:w="283"/>
             <w:shd w:val="clear" w:color="auto" w:fill="FFFFFF"/>
             <w:tcBorders>
               <w:top w:val="single" w:sz="4" w:space="0" w:color="AAAAAA"/>
@@ -1641,7 +1641,7 @@
         </w:tc>
         <w:tc>
           <w:tcPr>
-            <w:tcW w:type="dxa" w:w="4252"/>
+            <w:tcW w:type="dxa" w:w="4365"/>
             <w:shd w:val="clear" w:color="auto" w:fill="FFFFFF"/>
             <w:tcBorders>
               <w:top w:val="single" w:sz="4" w:space="0" w:color="AAAAAA"/>
@@ -1695,7 +1695,7 @@
       <w:tr>
         <w:tc>
           <w:tcPr>
-            <w:tcW w:type="dxa" w:w="397"/>
+            <w:tcW w:type="dxa" w:w="283"/>
             <w:shd w:val="clear" w:color="auto" w:fill="FFFFFF"/>
             <w:tcBorders>
               <w:top w:val="single" w:sz="4" w:space="0" w:color="AAAAAA"/>
@@ -1721,7 +1721,7 @@
         </w:tc>
         <w:tc>
           <w:tcPr>
-            <w:tcW w:type="dxa" w:w="4252"/>
+            <w:tcW w:type="dxa" w:w="4365"/>
             <w:shd w:val="clear" w:color="auto" w:fill="FFFFFF"/>
             <w:tcBorders>
               <w:top w:val="single" w:sz="4" w:space="0" w:color="AAAAAA"/>
@@ -1804,7 +1804,7 @@
       <w:tr>
         <w:tc>
           <w:tcPr>
-            <w:tcW w:type="dxa" w:w="397"/>
+            <w:tcW w:type="dxa" w:w="283"/>
             <w:shd w:val="clear" w:color="auto" w:fill="FFFFFF"/>
             <w:tcBorders>
               <w:top w:val="single" w:sz="4" w:space="0" w:color="AAAAAA"/>
@@ -1830,7 +1830,7 @@
         </w:tc>
         <w:tc>
           <w:tcPr>
-            <w:tcW w:type="dxa" w:w="4252"/>
+            <w:tcW w:type="dxa" w:w="4365"/>
             <w:shd w:val="clear" w:color="auto" w:fill="FFFFFF"/>
             <w:tcBorders>
               <w:top w:val="single" w:sz="4" w:space="0" w:color="AAAAAA"/>
@@ -1884,15 +1884,14 @@
       <w:tr>
         <w:tc>
           <w:tcPr>
-            <w:tcW w:type="dxa" w:w="397"/>
-            <w:shd w:val="clear" w:color="auto" w:fill="FFFFFF"/>
+            <w:tcW w:type="dxa" w:w="283"/>
+            <w:shd w:val="clear" w:color="auto" w:fill="D6E4F0"/>
             <w:tcBorders>
               <w:top w:val="single" w:sz="4" w:space="0" w:color="AAAAAA"/>
               <w:left w:val="single" w:sz="4" w:space="0" w:color="AAAAAA"/>
               <w:bottom w:val="single" w:sz="4" w:space="0" w:color="AAAAAA"/>
               <w:right w:val="single" w:sz="4" w:space="0" w:color="AAAAAA"/>
             </w:tcBorders>
-            <w:vAlign w:val="center"/>
           </w:tcPr>
           <w:p>
             <w:pPr>
@@ -1902,6 +1901,7 @@
             <w:r>
               <w:rPr>
                 <w:b/>
+                <w:color w:val="1F3864"/>
                 <w:sz w:val="18"/>
               </w:rPr>
               <w:t>2</w:t>
@@ -1910,15 +1910,15 @@
         </w:tc>
         <w:tc>
           <w:tcPr>
-            <w:tcW w:type="dxa" w:w="4252"/>
-            <w:shd w:val="clear" w:color="auto" w:fill="FFFFFF"/>
+            <w:tcW w:type="dxa" w:w="4989"/>
+            <w:gridSpan w:val="2"/>
+            <w:shd w:val="clear" w:color="auto" w:fill="D6E4F0"/>
             <w:tcBorders>
               <w:top w:val="single" w:sz="4" w:space="0" w:color="AAAAAA"/>
               <w:left w:val="single" w:sz="4" w:space="0" w:color="AAAAAA"/>
               <w:bottom w:val="single" w:sz="4" w:space="0" w:color="AAAAAA"/>
               <w:right w:val="single" w:sz="4" w:space="0" w:color="AAAAAA"/>
             </w:tcBorders>
-            <w:vAlign w:val="center"/>
           </w:tcPr>
           <w:p>
             <w:pPr>
@@ -1927,35 +1927,11 @@
             </w:pPr>
             <w:r>
               <w:rPr>
-                <w:b w:val="0"/>
+                <w:b/>
+                <w:color w:val="1F3864"/>
                 <w:sz w:val="18"/>
               </w:rPr>
               <w:t>SUPERSTRUCTURE</w:t>
-            </w:r>
-          </w:p>
-        </w:tc>
-        <w:tc>
-          <w:tcPr>
-            <w:tcW w:type="dxa" w:w="4989"/>
-            <w:shd w:val="clear" w:color="auto" w:fill="FFFFFF"/>
-            <w:tcBorders>
-              <w:top w:val="single" w:sz="4" w:space="0" w:color="AAAAAA"/>
-              <w:left w:val="single" w:sz="4" w:space="0" w:color="AAAAAA"/>
-              <w:bottom w:val="single" w:sz="4" w:space="0" w:color="AAAAAA"/>
-              <w:right w:val="single" w:sz="4" w:space="0" w:color="AAAAAA"/>
-            </w:tcBorders>
-            <w:vAlign w:val="center"/>
-          </w:tcPr>
-          <w:p>
-            <w:pPr>
-              <w:spacing w:before="40" w:after="40"/>
-              <w:jc w:val="left"/>
-            </w:pPr>
-            <w:r>
-              <w:rPr>
-                <w:b w:val="0"/>
-                <w:sz w:val="18"/>
-              </w:rPr>
             </w:r>
           </w:p>
         </w:tc>
@@ -1963,7 +1939,7 @@
       <w:tr>
         <w:tc>
           <w:tcPr>
-            <w:tcW w:type="dxa" w:w="397"/>
+            <w:tcW w:type="dxa" w:w="283"/>
             <w:shd w:val="clear" w:color="auto" w:fill="FFFFFF"/>
             <w:tcBorders>
               <w:top w:val="single" w:sz="4" w:space="0" w:color="AAAAAA"/>
@@ -1989,7 +1965,7 @@
         </w:tc>
         <w:tc>
           <w:tcPr>
-            <w:tcW w:type="dxa" w:w="4252"/>
+            <w:tcW w:type="dxa" w:w="4365"/>
             <w:shd w:val="clear" w:color="auto" w:fill="FFFFFF"/>
             <w:tcBorders>
               <w:top w:val="single" w:sz="4" w:space="0" w:color="AAAAAA"/>
@@ -2043,7 +2019,7 @@
       <w:tr>
         <w:tc>
           <w:tcPr>
-            <w:tcW w:type="dxa" w:w="397"/>
+            <w:tcW w:type="dxa" w:w="283"/>
             <w:shd w:val="clear" w:color="auto" w:fill="FFFFFF"/>
             <w:tcBorders>
               <w:top w:val="single" w:sz="4" w:space="0" w:color="AAAAAA"/>
@@ -2069,7 +2045,7 @@
         </w:tc>
         <w:tc>
           <w:tcPr>
-            <w:tcW w:type="dxa" w:w="4252"/>
+            <w:tcW w:type="dxa" w:w="4365"/>
             <w:shd w:val="clear" w:color="auto" w:fill="FFFFFF"/>
             <w:tcBorders>
               <w:top w:val="single" w:sz="4" w:space="0" w:color="AAAAAA"/>
@@ -2123,7 +2099,7 @@
       <w:tr>
         <w:tc>
           <w:tcPr>
-            <w:tcW w:type="dxa" w:w="397"/>
+            <w:tcW w:type="dxa" w:w="283"/>
             <w:shd w:val="clear" w:color="auto" w:fill="FFFFFF"/>
             <w:tcBorders>
               <w:top w:val="single" w:sz="4" w:space="0" w:color="AAAAAA"/>
@@ -2149,7 +2125,7 @@
         </w:tc>
         <w:tc>
           <w:tcPr>
-            <w:tcW w:type="dxa" w:w="4252"/>
+            <w:tcW w:type="dxa" w:w="4365"/>
             <w:shd w:val="clear" w:color="auto" w:fill="FFFFFF"/>
             <w:tcBorders>
               <w:top w:val="single" w:sz="4" w:space="0" w:color="AAAAAA"/>
@@ -2203,7 +2179,7 @@
       <w:tr>
         <w:tc>
           <w:tcPr>
-            <w:tcW w:type="dxa" w:w="397"/>
+            <w:tcW w:type="dxa" w:w="283"/>
             <w:shd w:val="clear" w:color="auto" w:fill="FFFFFF"/>
             <w:tcBorders>
               <w:top w:val="single" w:sz="4" w:space="0" w:color="AAAAAA"/>
@@ -2229,7 +2205,7 @@
         </w:tc>
         <w:tc>
           <w:tcPr>
-            <w:tcW w:type="dxa" w:w="4252"/>
+            <w:tcW w:type="dxa" w:w="4365"/>
             <w:shd w:val="clear" w:color="auto" w:fill="FFFFFF"/>
             <w:tcBorders>
               <w:top w:val="single" w:sz="4" w:space="0" w:color="AAAAAA"/>
@@ -2283,7 +2259,7 @@
       <w:tr>
         <w:tc>
           <w:tcPr>
-            <w:tcW w:type="dxa" w:w="397"/>
+            <w:tcW w:type="dxa" w:w="283"/>
             <w:shd w:val="clear" w:color="auto" w:fill="FFFFFF"/>
             <w:tcBorders>
               <w:top w:val="single" w:sz="4" w:space="0" w:color="AAAAAA"/>
@@ -2309,7 +2285,7 @@
         </w:tc>
         <w:tc>
           <w:tcPr>
-            <w:tcW w:type="dxa" w:w="4252"/>
+            <w:tcW w:type="dxa" w:w="4365"/>
             <w:shd w:val="clear" w:color="auto" w:fill="FFFFFF"/>
             <w:tcBorders>
               <w:top w:val="single" w:sz="4" w:space="0" w:color="AAAAAA"/>
@@ -2363,7 +2339,7 @@
       <w:tr>
         <w:tc>
           <w:tcPr>
-            <w:tcW w:type="dxa" w:w="397"/>
+            <w:tcW w:type="dxa" w:w="283"/>
             <w:shd w:val="clear" w:color="auto" w:fill="FFFFFF"/>
             <w:tcBorders>
               <w:top w:val="single" w:sz="4" w:space="0" w:color="AAAAAA"/>
@@ -2389,7 +2365,7 @@
         </w:tc>
         <w:tc>
           <w:tcPr>
-            <w:tcW w:type="dxa" w:w="4252"/>
+            <w:tcW w:type="dxa" w:w="4365"/>
             <w:shd w:val="clear" w:color="auto" w:fill="FFFFFF"/>
             <w:tcBorders>
               <w:top w:val="single" w:sz="4" w:space="0" w:color="AAAAAA"/>
@@ -2443,7 +2419,7 @@
       <w:tr>
         <w:tc>
           <w:tcPr>
-            <w:tcW w:type="dxa" w:w="397"/>
+            <w:tcW w:type="dxa" w:w="283"/>
             <w:shd w:val="clear" w:color="auto" w:fill="FFFFFF"/>
             <w:tcBorders>
               <w:top w:val="single" w:sz="4" w:space="0" w:color="AAAAAA"/>
@@ -2469,7 +2445,7 @@
         </w:tc>
         <w:tc>
           <w:tcPr>
-            <w:tcW w:type="dxa" w:w="4252"/>
+            <w:tcW w:type="dxa" w:w="4365"/>
             <w:shd w:val="clear" w:color="auto" w:fill="FFFFFF"/>
             <w:tcBorders>
               <w:top w:val="single" w:sz="4" w:space="0" w:color="AAAAAA"/>
@@ -2523,7 +2499,7 @@
       <w:tr>
         <w:tc>
           <w:tcPr>
-            <w:tcW w:type="dxa" w:w="397"/>
+            <w:tcW w:type="dxa" w:w="283"/>
             <w:shd w:val="clear" w:color="auto" w:fill="FFFFFF"/>
             <w:tcBorders>
               <w:top w:val="single" w:sz="4" w:space="0" w:color="AAAAAA"/>
@@ -2549,7 +2525,7 @@
         </w:tc>
         <w:tc>
           <w:tcPr>
-            <w:tcW w:type="dxa" w:w="4252"/>
+            <w:tcW w:type="dxa" w:w="4365"/>
             <w:shd w:val="clear" w:color="auto" w:fill="FFFFFF"/>
             <w:tcBorders>
               <w:top w:val="single" w:sz="4" w:space="0" w:color="AAAAAA"/>
@@ -2603,7 +2579,7 @@
       <w:tr>
         <w:tc>
           <w:tcPr>
-            <w:tcW w:type="dxa" w:w="397"/>
+            <w:tcW w:type="dxa" w:w="283"/>
             <w:shd w:val="clear" w:color="auto" w:fill="FFFFFF"/>
             <w:tcBorders>
               <w:top w:val="single" w:sz="4" w:space="0" w:color="AAAAAA"/>
@@ -2629,7 +2605,7 @@
         </w:tc>
         <w:tc>
           <w:tcPr>
-            <w:tcW w:type="dxa" w:w="4252"/>
+            <w:tcW w:type="dxa" w:w="4365"/>
             <w:shd w:val="clear" w:color="auto" w:fill="FFFFFF"/>
             <w:tcBorders>
               <w:top w:val="single" w:sz="4" w:space="0" w:color="AAAAAA"/>
@@ -2683,7 +2659,7 @@
       <w:tr>
         <w:tc>
           <w:tcPr>
-            <w:tcW w:type="dxa" w:w="397"/>
+            <w:tcW w:type="dxa" w:w="283"/>
             <w:shd w:val="clear" w:color="auto" w:fill="FFFFFF"/>
             <w:tcBorders>
               <w:top w:val="single" w:sz="4" w:space="0" w:color="AAAAAA"/>
@@ -2709,7 +2685,7 @@
         </w:tc>
         <w:tc>
           <w:tcPr>
-            <w:tcW w:type="dxa" w:w="4252"/>
+            <w:tcW w:type="dxa" w:w="4365"/>
             <w:shd w:val="clear" w:color="auto" w:fill="FFFFFF"/>
             <w:tcBorders>
               <w:top w:val="single" w:sz="4" w:space="0" w:color="AAAAAA"/>
@@ -2763,15 +2739,14 @@
       <w:tr>
         <w:tc>
           <w:tcPr>
-            <w:tcW w:type="dxa" w:w="397"/>
-            <w:shd w:val="clear" w:color="auto" w:fill="FFFFFF"/>
+            <w:tcW w:type="dxa" w:w="283"/>
+            <w:shd w:val="clear" w:color="auto" w:fill="D6E4F0"/>
             <w:tcBorders>
               <w:top w:val="single" w:sz="4" w:space="0" w:color="AAAAAA"/>
               <w:left w:val="single" w:sz="4" w:space="0" w:color="AAAAAA"/>
               <w:bottom w:val="single" w:sz="4" w:space="0" w:color="AAAAAA"/>
               <w:right w:val="single" w:sz="4" w:space="0" w:color="AAAAAA"/>
             </w:tcBorders>
-            <w:vAlign w:val="center"/>
           </w:tcPr>
           <w:p>
             <w:pPr>
@@ -2781,6 +2756,7 @@
             <w:r>
               <w:rPr>
                 <w:b/>
+                <w:color w:val="1F3864"/>
                 <w:sz w:val="18"/>
               </w:rPr>
               <w:t>3</w:t>
@@ -2789,15 +2765,15 @@
         </w:tc>
         <w:tc>
           <w:tcPr>
-            <w:tcW w:type="dxa" w:w="4252"/>
-            <w:shd w:val="clear" w:color="auto" w:fill="FFFFFF"/>
+            <w:tcW w:type="dxa" w:w="4989"/>
+            <w:gridSpan w:val="2"/>
+            <w:shd w:val="clear" w:color="auto" w:fill="D6E4F0"/>
             <w:tcBorders>
               <w:top w:val="single" w:sz="4" w:space="0" w:color="AAAAAA"/>
               <w:left w:val="single" w:sz="4" w:space="0" w:color="AAAAAA"/>
               <w:bottom w:val="single" w:sz="4" w:space="0" w:color="AAAAAA"/>
               <w:right w:val="single" w:sz="4" w:space="0" w:color="AAAAAA"/>
             </w:tcBorders>
-            <w:vAlign w:val="center"/>
           </w:tcPr>
           <w:p>
             <w:pPr>
@@ -2806,35 +2782,11 @@
             </w:pPr>
             <w:r>
               <w:rPr>
-                <w:b w:val="0"/>
+                <w:b/>
+                <w:color w:val="1F3864"/>
                 <w:sz w:val="18"/>
               </w:rPr>
               <w:t>SUBSTRUCTURE</w:t>
-            </w:r>
-          </w:p>
-        </w:tc>
-        <w:tc>
-          <w:tcPr>
-            <w:tcW w:type="dxa" w:w="4989"/>
-            <w:shd w:val="clear" w:color="auto" w:fill="FFFFFF"/>
-            <w:tcBorders>
-              <w:top w:val="single" w:sz="4" w:space="0" w:color="AAAAAA"/>
-              <w:left w:val="single" w:sz="4" w:space="0" w:color="AAAAAA"/>
-              <w:bottom w:val="single" w:sz="4" w:space="0" w:color="AAAAAA"/>
-              <w:right w:val="single" w:sz="4" w:space="0" w:color="AAAAAA"/>
-            </w:tcBorders>
-            <w:vAlign w:val="center"/>
-          </w:tcPr>
-          <w:p>
-            <w:pPr>
-              <w:spacing w:before="40" w:after="40"/>
-              <w:jc w:val="left"/>
-            </w:pPr>
-            <w:r>
-              <w:rPr>
-                <w:b w:val="0"/>
-                <w:sz w:val="18"/>
-              </w:rPr>
             </w:r>
           </w:p>
         </w:tc>
@@ -2842,7 +2794,7 @@
       <w:tr>
         <w:tc>
           <w:tcPr>
-            <w:tcW w:type="dxa" w:w="397"/>
+            <w:tcW w:type="dxa" w:w="283"/>
             <w:shd w:val="clear" w:color="auto" w:fill="FFFFFF"/>
             <w:tcBorders>
               <w:top w:val="single" w:sz="4" w:space="0" w:color="AAAAAA"/>
@@ -2868,7 +2820,7 @@
         </w:tc>
         <w:tc>
           <w:tcPr>
-            <w:tcW w:type="dxa" w:w="4252"/>
+            <w:tcW w:type="dxa" w:w="4365"/>
             <w:shd w:val="clear" w:color="auto" w:fill="FFFFFF"/>
             <w:tcBorders>
               <w:top w:val="single" w:sz="4" w:space="0" w:color="AAAAAA"/>
@@ -2922,7 +2874,7 @@
       <w:tr>
         <w:tc>
           <w:tcPr>
-            <w:tcW w:type="dxa" w:w="397"/>
+            <w:tcW w:type="dxa" w:w="283"/>
             <w:shd w:val="clear" w:color="auto" w:fill="FFFFFF"/>
             <w:tcBorders>
               <w:top w:val="single" w:sz="4" w:space="0" w:color="AAAAAA"/>
@@ -2948,7 +2900,7 @@
         </w:tc>
         <w:tc>
           <w:tcPr>
-            <w:tcW w:type="dxa" w:w="4252"/>
+            <w:tcW w:type="dxa" w:w="4365"/>
             <w:shd w:val="clear" w:color="auto" w:fill="FFFFFF"/>
             <w:tcBorders>
               <w:top w:val="single" w:sz="4" w:space="0" w:color="AAAAAA"/>
@@ -3002,7 +2954,7 @@
       <w:tr>
         <w:tc>
           <w:tcPr>
-            <w:tcW w:type="dxa" w:w="397"/>
+            <w:tcW w:type="dxa" w:w="283"/>
             <w:shd w:val="clear" w:color="auto" w:fill="FFFFFF"/>
             <w:tcBorders>
               <w:top w:val="single" w:sz="4" w:space="0" w:color="AAAAAA"/>
@@ -3028,7 +2980,7 @@
         </w:tc>
         <w:tc>
           <w:tcPr>
-            <w:tcW w:type="dxa" w:w="4252"/>
+            <w:tcW w:type="dxa" w:w="4365"/>
             <w:shd w:val="clear" w:color="auto" w:fill="FFFFFF"/>
             <w:tcBorders>
               <w:top w:val="single" w:sz="4" w:space="0" w:color="AAAAAA"/>
@@ -3082,7 +3034,7 @@
       <w:tr>
         <w:tc>
           <w:tcPr>
-            <w:tcW w:type="dxa" w:w="397"/>
+            <w:tcW w:type="dxa" w:w="283"/>
             <w:shd w:val="clear" w:color="auto" w:fill="FFFFFF"/>
             <w:tcBorders>
               <w:top w:val="single" w:sz="4" w:space="0" w:color="AAAAAA"/>
@@ -3108,7 +3060,7 @@
         </w:tc>
         <w:tc>
           <w:tcPr>
-            <w:tcW w:type="dxa" w:w="4252"/>
+            <w:tcW w:type="dxa" w:w="4365"/>
             <w:shd w:val="clear" w:color="auto" w:fill="FFFFFF"/>
             <w:tcBorders>
               <w:top w:val="single" w:sz="4" w:space="0" w:color="AAAAAA"/>
@@ -3162,7 +3114,7 @@
       <w:tr>
         <w:tc>
           <w:tcPr>
-            <w:tcW w:type="dxa" w:w="397"/>
+            <w:tcW w:type="dxa" w:w="283"/>
             <w:shd w:val="clear" w:color="auto" w:fill="FFFFFF"/>
             <w:tcBorders>
               <w:top w:val="single" w:sz="4" w:space="0" w:color="AAAAAA"/>
@@ -3188,7 +3140,7 @@
         </w:tc>
         <w:tc>
           <w:tcPr>
-            <w:tcW w:type="dxa" w:w="4252"/>
+            <w:tcW w:type="dxa" w:w="4365"/>
             <w:shd w:val="clear" w:color="auto" w:fill="FFFFFF"/>
             <w:tcBorders>
               <w:top w:val="single" w:sz="4" w:space="0" w:color="AAAAAA"/>
@@ -3242,7 +3194,7 @@
       <w:tr>
         <w:tc>
           <w:tcPr>
-            <w:tcW w:type="dxa" w:w="397"/>
+            <w:tcW w:type="dxa" w:w="283"/>
             <w:shd w:val="clear" w:color="auto" w:fill="FFFFFF"/>
             <w:tcBorders>
               <w:top w:val="single" w:sz="4" w:space="0" w:color="AAAAAA"/>
@@ -3268,7 +3220,7 @@
         </w:tc>
         <w:tc>
           <w:tcPr>
-            <w:tcW w:type="dxa" w:w="4252"/>
+            <w:tcW w:type="dxa" w:w="4365"/>
             <w:shd w:val="clear" w:color="auto" w:fill="FFFFFF"/>
             <w:tcBorders>
               <w:top w:val="single" w:sz="4" w:space="0" w:color="AAAAAA"/>
@@ -3322,7 +3274,7 @@
       <w:tr>
         <w:tc>
           <w:tcPr>
-            <w:tcW w:type="dxa" w:w="397"/>
+            <w:tcW w:type="dxa" w:w="283"/>
             <w:shd w:val="clear" w:color="auto" w:fill="FFFFFF"/>
             <w:tcBorders>
               <w:top w:val="single" w:sz="4" w:space="0" w:color="AAAAAA"/>
@@ -3348,7 +3300,7 @@
         </w:tc>
         <w:tc>
           <w:tcPr>
-            <w:tcW w:type="dxa" w:w="4252"/>
+            <w:tcW w:type="dxa" w:w="4365"/>
             <w:shd w:val="clear" w:color="auto" w:fill="FFFFFF"/>
             <w:tcBorders>
               <w:top w:val="single" w:sz="4" w:space="0" w:color="AAAAAA"/>
@@ -3402,7 +3354,7 @@
       <w:tr>
         <w:tc>
           <w:tcPr>
-            <w:tcW w:type="dxa" w:w="397"/>
+            <w:tcW w:type="dxa" w:w="283"/>
             <w:shd w:val="clear" w:color="auto" w:fill="FFFFFF"/>
             <w:tcBorders>
               <w:top w:val="single" w:sz="4" w:space="0" w:color="AAAAAA"/>
@@ -3428,7 +3380,7 @@
         </w:tc>
         <w:tc>
           <w:tcPr>
-            <w:tcW w:type="dxa" w:w="4252"/>
+            <w:tcW w:type="dxa" w:w="4365"/>
             <w:shd w:val="clear" w:color="auto" w:fill="FFFFFF"/>
             <w:tcBorders>
               <w:top w:val="single" w:sz="4" w:space="0" w:color="AAAAAA"/>
@@ -3482,7 +3434,7 @@
       <w:tr>
         <w:tc>
           <w:tcPr>
-            <w:tcW w:type="dxa" w:w="397"/>
+            <w:tcW w:type="dxa" w:w="283"/>
             <w:shd w:val="clear" w:color="auto" w:fill="FFFFFF"/>
             <w:tcBorders>
               <w:top w:val="single" w:sz="4" w:space="0" w:color="AAAAAA"/>
@@ -3508,7 +3460,7 @@
         </w:tc>
         <w:tc>
           <w:tcPr>
-            <w:tcW w:type="dxa" w:w="4252"/>
+            <w:tcW w:type="dxa" w:w="4365"/>
             <w:shd w:val="clear" w:color="auto" w:fill="FFFFFF"/>
             <w:tcBorders>
               <w:top w:val="single" w:sz="4" w:space="0" w:color="AAAAAA"/>
@@ -3562,7 +3514,7 @@
       <w:tr>
         <w:tc>
           <w:tcPr>
-            <w:tcW w:type="dxa" w:w="397"/>
+            <w:tcW w:type="dxa" w:w="283"/>
             <w:shd w:val="clear" w:color="auto" w:fill="FFFFFF"/>
             <w:tcBorders>
               <w:top w:val="single" w:sz="4" w:space="0" w:color="AAAAAA"/>
@@ -3588,7 +3540,7 @@
         </w:tc>
         <w:tc>
           <w:tcPr>
-            <w:tcW w:type="dxa" w:w="4252"/>
+            <w:tcW w:type="dxa" w:w="4365"/>
             <w:shd w:val="clear" w:color="auto" w:fill="FFFFFF"/>
             <w:tcBorders>
               <w:top w:val="single" w:sz="4" w:space="0" w:color="AAAAAA"/>
@@ -3642,15 +3594,14 @@
       <w:tr>
         <w:tc>
           <w:tcPr>
-            <w:tcW w:type="dxa" w:w="397"/>
-            <w:shd w:val="clear" w:color="auto" w:fill="FFFFFF"/>
+            <w:tcW w:type="dxa" w:w="283"/>
+            <w:shd w:val="clear" w:color="auto" w:fill="D6E4F0"/>
             <w:tcBorders>
               <w:top w:val="single" w:sz="4" w:space="0" w:color="AAAAAA"/>
               <w:left w:val="single" w:sz="4" w:space="0" w:color="AAAAAA"/>
               <w:bottom w:val="single" w:sz="4" w:space="0" w:color="AAAAAA"/>
               <w:right w:val="single" w:sz="4" w:space="0" w:color="AAAAAA"/>
             </w:tcBorders>
-            <w:vAlign w:val="center"/>
           </w:tcPr>
           <w:p>
             <w:pPr>
@@ -3660,6 +3611,7 @@
             <w:r>
               <w:rPr>
                 <w:b/>
+                <w:color w:val="1F3864"/>
                 <w:sz w:val="18"/>
               </w:rPr>
               <w:t>4</w:t>
@@ -3668,15 +3620,15 @@
         </w:tc>
         <w:tc>
           <w:tcPr>
-            <w:tcW w:type="dxa" w:w="4252"/>
-            <w:shd w:val="clear" w:color="auto" w:fill="FFFFFF"/>
+            <w:tcW w:type="dxa" w:w="4989"/>
+            <w:gridSpan w:val="2"/>
+            <w:shd w:val="clear" w:color="auto" w:fill="D6E4F0"/>
             <w:tcBorders>
               <w:top w:val="single" w:sz="4" w:space="0" w:color="AAAAAA"/>
               <w:left w:val="single" w:sz="4" w:space="0" w:color="AAAAAA"/>
               <w:bottom w:val="single" w:sz="4" w:space="0" w:color="AAAAAA"/>
               <w:right w:val="single" w:sz="4" w:space="0" w:color="AAAAAA"/>
             </w:tcBorders>
-            <w:vAlign w:val="center"/>
           </w:tcPr>
           <w:p>
             <w:pPr>
@@ -3685,35 +3637,11 @@
             </w:pPr>
             <w:r>
               <w:rPr>
-                <w:b w:val="0"/>
+                <w:b/>
+                <w:color w:val="1F3864"/>
                 <w:sz w:val="18"/>
               </w:rPr>
               <w:t>FOUNDATIONS (pile / cap etc.)</w:t>
-            </w:r>
-          </w:p>
-        </w:tc>
-        <w:tc>
-          <w:tcPr>
-            <w:tcW w:type="dxa" w:w="4989"/>
-            <w:shd w:val="clear" w:color="auto" w:fill="FFFFFF"/>
-            <w:tcBorders>
-              <w:top w:val="single" w:sz="4" w:space="0" w:color="AAAAAA"/>
-              <w:left w:val="single" w:sz="4" w:space="0" w:color="AAAAAA"/>
-              <w:bottom w:val="single" w:sz="4" w:space="0" w:color="AAAAAA"/>
-              <w:right w:val="single" w:sz="4" w:space="0" w:color="AAAAAA"/>
-            </w:tcBorders>
-            <w:vAlign w:val="center"/>
-          </w:tcPr>
-          <w:p>
-            <w:pPr>
-              <w:spacing w:before="40" w:after="40"/>
-              <w:jc w:val="left"/>
-            </w:pPr>
-            <w:r>
-              <w:rPr>
-                <w:b w:val="0"/>
-                <w:sz w:val="18"/>
-              </w:rPr>
             </w:r>
           </w:p>
         </w:tc>
@@ -3721,7 +3649,7 @@
       <w:tr>
         <w:tc>
           <w:tcPr>
-            <w:tcW w:type="dxa" w:w="397"/>
+            <w:tcW w:type="dxa" w:w="283"/>
             <w:shd w:val="clear" w:color="auto" w:fill="FFFFFF"/>
             <w:tcBorders>
               <w:top w:val="single" w:sz="4" w:space="0" w:color="AAAAAA"/>
@@ -3747,7 +3675,7 @@
         </w:tc>
         <w:tc>
           <w:tcPr>
-            <w:tcW w:type="dxa" w:w="4252"/>
+            <w:tcW w:type="dxa" w:w="4365"/>
             <w:shd w:val="clear" w:color="auto" w:fill="FFFFFF"/>
             <w:tcBorders>
               <w:top w:val="single" w:sz="4" w:space="0" w:color="AAAAAA"/>
@@ -3801,7 +3729,7 @@
       <w:tr>
         <w:tc>
           <w:tcPr>
-            <w:tcW w:type="dxa" w:w="397"/>
+            <w:tcW w:type="dxa" w:w="283"/>
             <w:shd w:val="clear" w:color="auto" w:fill="FFFFFF"/>
             <w:tcBorders>
               <w:top w:val="single" w:sz="4" w:space="0" w:color="AAAAAA"/>
@@ -3827,7 +3755,7 @@
         </w:tc>
         <w:tc>
           <w:tcPr>
-            <w:tcW w:type="dxa" w:w="4252"/>
+            <w:tcW w:type="dxa" w:w="4365"/>
             <w:shd w:val="clear" w:color="auto" w:fill="FFFFFF"/>
             <w:tcBorders>
               <w:top w:val="single" w:sz="4" w:space="0" w:color="AAAAAA"/>
@@ -3881,7 +3809,7 @@
       <w:tr>
         <w:tc>
           <w:tcPr>
-            <w:tcW w:type="dxa" w:w="397"/>
+            <w:tcW w:type="dxa" w:w="283"/>
             <w:shd w:val="clear" w:color="auto" w:fill="FFFFFF"/>
             <w:tcBorders>
               <w:top w:val="single" w:sz="4" w:space="0" w:color="AAAAAA"/>
@@ -3907,7 +3835,7 @@
         </w:tc>
         <w:tc>
           <w:tcPr>
-            <w:tcW w:type="dxa" w:w="4252"/>
+            <w:tcW w:type="dxa" w:w="4365"/>
             <w:shd w:val="clear" w:color="auto" w:fill="FFFFFF"/>
             <w:tcBorders>
               <w:top w:val="single" w:sz="4" w:space="0" w:color="AAAAAA"/>
@@ -3961,7 +3889,7 @@
       <w:tr>
         <w:tc>
           <w:tcPr>
-            <w:tcW w:type="dxa" w:w="397"/>
+            <w:tcW w:type="dxa" w:w="283"/>
             <w:shd w:val="clear" w:color="auto" w:fill="FFFFFF"/>
             <w:tcBorders>
               <w:top w:val="single" w:sz="4" w:space="0" w:color="AAAAAA"/>
@@ -3987,7 +3915,7 @@
         </w:tc>
         <w:tc>
           <w:tcPr>
-            <w:tcW w:type="dxa" w:w="4252"/>
+            <w:tcW w:type="dxa" w:w="4365"/>
             <w:shd w:val="clear" w:color="auto" w:fill="FFFFFF"/>
             <w:tcBorders>
               <w:top w:val="single" w:sz="4" w:space="0" w:color="AAAAAA"/>
@@ -4041,7 +3969,7 @@
       <w:tr>
         <w:tc>
           <w:tcPr>
-            <w:tcW w:type="dxa" w:w="397"/>
+            <w:tcW w:type="dxa" w:w="283"/>
             <w:shd w:val="clear" w:color="auto" w:fill="FFFFFF"/>
             <w:tcBorders>
               <w:top w:val="single" w:sz="4" w:space="0" w:color="AAAAAA"/>
@@ -4067,7 +3995,7 @@
         </w:tc>
         <w:tc>
           <w:tcPr>
-            <w:tcW w:type="dxa" w:w="4252"/>
+            <w:tcW w:type="dxa" w:w="4365"/>
             <w:shd w:val="clear" w:color="auto" w:fill="FFFFFF"/>
             <w:tcBorders>
               <w:top w:val="single" w:sz="4" w:space="0" w:color="AAAAAA"/>
@@ -4121,7 +4049,7 @@
       <w:tr>
         <w:tc>
           <w:tcPr>
-            <w:tcW w:type="dxa" w:w="397"/>
+            <w:tcW w:type="dxa" w:w="283"/>
             <w:shd w:val="clear" w:color="auto" w:fill="FFFFFF"/>
             <w:tcBorders>
               <w:top w:val="single" w:sz="4" w:space="0" w:color="AAAAAA"/>
@@ -4147,7 +4075,7 @@
         </w:tc>
         <w:tc>
           <w:tcPr>
-            <w:tcW w:type="dxa" w:w="4252"/>
+            <w:tcW w:type="dxa" w:w="4365"/>
             <w:shd w:val="clear" w:color="auto" w:fill="FFFFFF"/>
             <w:tcBorders>
               <w:top w:val="single" w:sz="4" w:space="0" w:color="AAAAAA"/>
@@ -4201,7 +4129,7 @@
       <w:tr>
         <w:tc>
           <w:tcPr>
-            <w:tcW w:type="dxa" w:w="397"/>
+            <w:tcW w:type="dxa" w:w="283"/>
             <w:shd w:val="clear" w:color="auto" w:fill="FFFFFF"/>
             <w:tcBorders>
               <w:top w:val="single" w:sz="4" w:space="0" w:color="AAAAAA"/>
@@ -4227,7 +4155,7 @@
         </w:tc>
         <w:tc>
           <w:tcPr>
-            <w:tcW w:type="dxa" w:w="4252"/>
+            <w:tcW w:type="dxa" w:w="4365"/>
             <w:shd w:val="clear" w:color="auto" w:fill="FFFFFF"/>
             <w:tcBorders>
               <w:top w:val="single" w:sz="4" w:space="0" w:color="AAAAAA"/>
@@ -4281,7 +4209,7 @@
       <w:tr>
         <w:tc>
           <w:tcPr>
-            <w:tcW w:type="dxa" w:w="397"/>
+            <w:tcW w:type="dxa" w:w="283"/>
             <w:shd w:val="clear" w:color="auto" w:fill="FFFFFF"/>
             <w:tcBorders>
               <w:top w:val="single" w:sz="4" w:space="0" w:color="AAAAAA"/>
@@ -4307,7 +4235,7 @@
         </w:tc>
         <w:tc>
           <w:tcPr>
-            <w:tcW w:type="dxa" w:w="4252"/>
+            <w:tcW w:type="dxa" w:w="4365"/>
             <w:shd w:val="clear" w:color="auto" w:fill="FFFFFF"/>
             <w:tcBorders>
               <w:top w:val="single" w:sz="4" w:space="0" w:color="AAAAAA"/>
@@ -4361,7 +4289,7 @@
       <w:tr>
         <w:tc>
           <w:tcPr>
-            <w:tcW w:type="dxa" w:w="397"/>
+            <w:tcW w:type="dxa" w:w="283"/>
             <w:shd w:val="clear" w:color="auto" w:fill="FFFFFF"/>
             <w:tcBorders>
               <w:top w:val="single" w:sz="4" w:space="0" w:color="AAAAAA"/>
@@ -4387,7 +4315,7 @@
         </w:tc>
         <w:tc>
           <w:tcPr>
-            <w:tcW w:type="dxa" w:w="4252"/>
+            <w:tcW w:type="dxa" w:w="4365"/>
             <w:shd w:val="clear" w:color="auto" w:fill="FFFFFF"/>
             <w:tcBorders>
               <w:top w:val="single" w:sz="4" w:space="0" w:color="AAAAAA"/>
@@ -4441,7 +4369,7 @@
       <w:tr>
         <w:tc>
           <w:tcPr>
-            <w:tcW w:type="dxa" w:w="397"/>
+            <w:tcW w:type="dxa" w:w="283"/>
             <w:shd w:val="clear" w:color="auto" w:fill="FFFFFF"/>
             <w:tcBorders>
               <w:top w:val="single" w:sz="4" w:space="0" w:color="AAAAAA"/>
@@ -4467,7 +4395,7 @@
         </w:tc>
         <w:tc>
           <w:tcPr>
-            <w:tcW w:type="dxa" w:w="4252"/>
+            <w:tcW w:type="dxa" w:w="4365"/>
             <w:shd w:val="clear" w:color="auto" w:fill="FFFFFF"/>
             <w:tcBorders>
               <w:top w:val="single" w:sz="4" w:space="0" w:color="AAAAAA"/>
@@ -4521,7 +4449,7 @@
       <w:tr>
         <w:tc>
           <w:tcPr>
-            <w:tcW w:type="dxa" w:w="397"/>
+            <w:tcW w:type="dxa" w:w="283"/>
             <w:shd w:val="clear" w:color="auto" w:fill="FFFFFF"/>
             <w:tcBorders>
               <w:top w:val="single" w:sz="4" w:space="0" w:color="AAAAAA"/>
@@ -4547,7 +4475,7 @@
         </w:tc>
         <w:tc>
           <w:tcPr>
-            <w:tcW w:type="dxa" w:w="4252"/>
+            <w:tcW w:type="dxa" w:w="4365"/>
             <w:shd w:val="clear" w:color="auto" w:fill="FFFFFF"/>
             <w:tcBorders>
               <w:top w:val="single" w:sz="4" w:space="0" w:color="AAAAAA"/>
@@ -4601,7 +4529,7 @@
       <w:tr>
         <w:tc>
           <w:tcPr>
-            <w:tcW w:type="dxa" w:w="397"/>
+            <w:tcW w:type="dxa" w:w="283"/>
             <w:shd w:val="clear" w:color="auto" w:fill="FFFFFF"/>
             <w:tcBorders>
               <w:top w:val="single" w:sz="4" w:space="0" w:color="AAAAAA"/>
@@ -4627,7 +4555,7 @@
         </w:tc>
         <w:tc>
           <w:tcPr>
-            <w:tcW w:type="dxa" w:w="4252"/>
+            <w:tcW w:type="dxa" w:w="4365"/>
             <w:shd w:val="clear" w:color="auto" w:fill="FFFFFF"/>
             <w:tcBorders>
               <w:top w:val="single" w:sz="4" w:space="0" w:color="AAAAAA"/>
@@ -4681,15 +4609,14 @@
       <w:tr>
         <w:tc>
           <w:tcPr>
-            <w:tcW w:type="dxa" w:w="397"/>
-            <w:shd w:val="clear" w:color="auto" w:fill="FFFFFF"/>
+            <w:tcW w:type="dxa" w:w="283"/>
+            <w:shd w:val="clear" w:color="auto" w:fill="D6E4F0"/>
             <w:tcBorders>
               <w:top w:val="single" w:sz="4" w:space="0" w:color="AAAAAA"/>
               <w:left w:val="single" w:sz="4" w:space="0" w:color="AAAAAA"/>
               <w:bottom w:val="single" w:sz="4" w:space="0" w:color="AAAAAA"/>
               <w:right w:val="single" w:sz="4" w:space="0" w:color="AAAAAA"/>
             </w:tcBorders>
-            <w:vAlign w:val="center"/>
           </w:tcPr>
           <w:p>
             <w:pPr>
@@ -4699,6 +4626,7 @@
             <w:r>
               <w:rPr>
                 <w:b/>
+                <w:color w:val="1F3864"/>
                 <w:sz w:val="18"/>
               </w:rPr>
               <w:t>5</w:t>
@@ -4707,15 +4635,15 @@
         </w:tc>
         <w:tc>
           <w:tcPr>
-            <w:tcW w:type="dxa" w:w="4252"/>
-            <w:shd w:val="clear" w:color="auto" w:fill="FFFFFF"/>
+            <w:tcW w:type="dxa" w:w="4989"/>
+            <w:gridSpan w:val="2"/>
+            <w:shd w:val="clear" w:color="auto" w:fill="D6E4F0"/>
             <w:tcBorders>
               <w:top w:val="single" w:sz="4" w:space="0" w:color="AAAAAA"/>
               <w:left w:val="single" w:sz="4" w:space="0" w:color="AAAAAA"/>
               <w:bottom w:val="single" w:sz="4" w:space="0" w:color="AAAAAA"/>
               <w:right w:val="single" w:sz="4" w:space="0" w:color="AAAAAA"/>
             </w:tcBorders>
-            <w:vAlign w:val="center"/>
           </w:tcPr>
           <w:p>
             <w:pPr>
@@ -4724,35 +4652,11 @@
             </w:pPr>
             <w:r>
               <w:rPr>
-                <w:b w:val="0"/>
+                <w:b/>
+                <w:color w:val="1F3864"/>
                 <w:sz w:val="18"/>
               </w:rPr>
               <w:t>BEARINGS</w:t>
-            </w:r>
-          </w:p>
-        </w:tc>
-        <w:tc>
-          <w:tcPr>
-            <w:tcW w:type="dxa" w:w="4989"/>
-            <w:shd w:val="clear" w:color="auto" w:fill="FFFFFF"/>
-            <w:tcBorders>
-              <w:top w:val="single" w:sz="4" w:space="0" w:color="AAAAAA"/>
-              <w:left w:val="single" w:sz="4" w:space="0" w:color="AAAAAA"/>
-              <w:bottom w:val="single" w:sz="4" w:space="0" w:color="AAAAAA"/>
-              <w:right w:val="single" w:sz="4" w:space="0" w:color="AAAAAA"/>
-            </w:tcBorders>
-            <w:vAlign w:val="center"/>
-          </w:tcPr>
-          <w:p>
-            <w:pPr>
-              <w:spacing w:before="40" w:after="40"/>
-              <w:jc w:val="left"/>
-            </w:pPr>
-            <w:r>
-              <w:rPr>
-                <w:b w:val="0"/>
-                <w:sz w:val="18"/>
-              </w:rPr>
             </w:r>
           </w:p>
         </w:tc>
@@ -4760,7 +4664,7 @@
       <w:tr>
         <w:tc>
           <w:tcPr>
-            <w:tcW w:type="dxa" w:w="397"/>
+            <w:tcW w:type="dxa" w:w="283"/>
             <w:shd w:val="clear" w:color="auto" w:fill="FFFFFF"/>
             <w:tcBorders>
               <w:top w:val="single" w:sz="4" w:space="0" w:color="AAAAAA"/>
@@ -4786,7 +4690,7 @@
         </w:tc>
         <w:tc>
           <w:tcPr>
-            <w:tcW w:type="dxa" w:w="4252"/>
+            <w:tcW w:type="dxa" w:w="4365"/>
             <w:shd w:val="clear" w:color="auto" w:fill="FFFFFF"/>
             <w:tcBorders>
               <w:top w:val="single" w:sz="4" w:space="0" w:color="AAAAAA"/>
@@ -4840,7 +4744,7 @@
       <w:tr>
         <w:tc>
           <w:tcPr>
-            <w:tcW w:type="dxa" w:w="397"/>
+            <w:tcW w:type="dxa" w:w="283"/>
             <w:shd w:val="clear" w:color="auto" w:fill="FFFFFF"/>
             <w:tcBorders>
               <w:top w:val="single" w:sz="4" w:space="0" w:color="AAAAAA"/>
@@ -4866,7 +4770,7 @@
         </w:tc>
         <w:tc>
           <w:tcPr>
-            <w:tcW w:type="dxa" w:w="4252"/>
+            <w:tcW w:type="dxa" w:w="4365"/>
             <w:shd w:val="clear" w:color="auto" w:fill="FFFFFF"/>
             <w:tcBorders>
               <w:top w:val="single" w:sz="4" w:space="0" w:color="AAAAAA"/>
@@ -4920,7 +4824,7 @@
       <w:tr>
         <w:tc>
           <w:tcPr>
-            <w:tcW w:type="dxa" w:w="397"/>
+            <w:tcW w:type="dxa" w:w="283"/>
             <w:shd w:val="clear" w:color="auto" w:fill="FFFFFF"/>
             <w:tcBorders>
               <w:top w:val="single" w:sz="4" w:space="0" w:color="AAAAAA"/>
@@ -4946,7 +4850,7 @@
         </w:tc>
         <w:tc>
           <w:tcPr>
-            <w:tcW w:type="dxa" w:w="4252"/>
+            <w:tcW w:type="dxa" w:w="4365"/>
             <w:shd w:val="clear" w:color="auto" w:fill="FFFFFF"/>
             <w:tcBorders>
               <w:top w:val="single" w:sz="4" w:space="0" w:color="AAAAAA"/>
@@ -5000,15 +4904,14 @@
       <w:tr>
         <w:tc>
           <w:tcPr>
-            <w:tcW w:type="dxa" w:w="397"/>
-            <w:shd w:val="clear" w:color="auto" w:fill="FFFFFF"/>
+            <w:tcW w:type="dxa" w:w="283"/>
+            <w:shd w:val="clear" w:color="auto" w:fill="D6E4F0"/>
             <w:tcBorders>
               <w:top w:val="single" w:sz="4" w:space="0" w:color="AAAAAA"/>
               <w:left w:val="single" w:sz="4" w:space="0" w:color="AAAAAA"/>
               <w:bottom w:val="single" w:sz="4" w:space="0" w:color="AAAAAA"/>
               <w:right w:val="single" w:sz="4" w:space="0" w:color="AAAAAA"/>
             </w:tcBorders>
-            <w:vAlign w:val="center"/>
           </w:tcPr>
           <w:p>
             <w:pPr>
@@ -5018,6 +4921,7 @@
             <w:r>
               <w:rPr>
                 <w:b/>
+                <w:color w:val="1F3864"/>
                 <w:sz w:val="18"/>
               </w:rPr>
               <w:t>6</w:t>
@@ -5026,15 +4930,15 @@
         </w:tc>
         <w:tc>
           <w:tcPr>
-            <w:tcW w:type="dxa" w:w="4252"/>
-            <w:shd w:val="clear" w:color="auto" w:fill="FFFFFF"/>
+            <w:tcW w:type="dxa" w:w="4989"/>
+            <w:gridSpan w:val="2"/>
+            <w:shd w:val="clear" w:color="auto" w:fill="D6E4F0"/>
             <w:tcBorders>
               <w:top w:val="single" w:sz="4" w:space="0" w:color="AAAAAA"/>
               <w:left w:val="single" w:sz="4" w:space="0" w:color="AAAAAA"/>
               <w:bottom w:val="single" w:sz="4" w:space="0" w:color="AAAAAA"/>
               <w:right w:val="single" w:sz="4" w:space="0" w:color="AAAAAA"/>
             </w:tcBorders>
-            <w:vAlign w:val="center"/>
           </w:tcPr>
           <w:p>
             <w:pPr>
@@ -5043,35 +4947,11 @@
             </w:pPr>
             <w:r>
               <w:rPr>
-                <w:b w:val="0"/>
+                <w:b/>
+                <w:color w:val="1F3864"/>
                 <w:sz w:val="18"/>
               </w:rPr>
               <w:t>APPROACH AND OTHER</w:t>
-            </w:r>
-          </w:p>
-        </w:tc>
-        <w:tc>
-          <w:tcPr>
-            <w:tcW w:type="dxa" w:w="4989"/>
-            <w:shd w:val="clear" w:color="auto" w:fill="FFFFFF"/>
-            <w:tcBorders>
-              <w:top w:val="single" w:sz="4" w:space="0" w:color="AAAAAA"/>
-              <w:left w:val="single" w:sz="4" w:space="0" w:color="AAAAAA"/>
-              <w:bottom w:val="single" w:sz="4" w:space="0" w:color="AAAAAA"/>
-              <w:right w:val="single" w:sz="4" w:space="0" w:color="AAAAAA"/>
-            </w:tcBorders>
-            <w:vAlign w:val="center"/>
-          </w:tcPr>
-          <w:p>
-            <w:pPr>
-              <w:spacing w:before="40" w:after="40"/>
-              <w:jc w:val="left"/>
-            </w:pPr>
-            <w:r>
-              <w:rPr>
-                <w:b w:val="0"/>
-                <w:sz w:val="18"/>
-              </w:rPr>
             </w:r>
           </w:p>
         </w:tc>
@@ -5079,7 +4959,7 @@
       <w:tr>
         <w:tc>
           <w:tcPr>
-            <w:tcW w:type="dxa" w:w="397"/>
+            <w:tcW w:type="dxa" w:w="283"/>
             <w:shd w:val="clear" w:color="auto" w:fill="FFFFFF"/>
             <w:tcBorders>
               <w:top w:val="single" w:sz="4" w:space="0" w:color="AAAAAA"/>
@@ -5105,7 +4985,7 @@
         </w:tc>
         <w:tc>
           <w:tcPr>
-            <w:tcW w:type="dxa" w:w="4252"/>
+            <w:tcW w:type="dxa" w:w="4365"/>
             <w:shd w:val="clear" w:color="auto" w:fill="FFFFFF"/>
             <w:tcBorders>
               <w:top w:val="single" w:sz="4" w:space="0" w:color="AAAAAA"/>
@@ -5159,7 +5039,7 @@
       <w:tr>
         <w:tc>
           <w:tcPr>
-            <w:tcW w:type="dxa" w:w="397"/>
+            <w:tcW w:type="dxa" w:w="283"/>
             <w:shd w:val="clear" w:color="auto" w:fill="FFFFFF"/>
             <w:tcBorders>
               <w:top w:val="single" w:sz="4" w:space="0" w:color="AAAAAA"/>
@@ -5185,7 +5065,7 @@
         </w:tc>
         <w:tc>
           <w:tcPr>
-            <w:tcW w:type="dxa" w:w="4252"/>
+            <w:tcW w:type="dxa" w:w="4365"/>
             <w:shd w:val="clear" w:color="auto" w:fill="FFFFFF"/>
             <w:tcBorders>
               <w:top w:val="single" w:sz="4" w:space="0" w:color="AAAAAA"/>
@@ -5239,7 +5119,7 @@
       <w:tr>
         <w:tc>
           <w:tcPr>
-            <w:tcW w:type="dxa" w:w="397"/>
+            <w:tcW w:type="dxa" w:w="283"/>
             <w:shd w:val="clear" w:color="auto" w:fill="FFFFFF"/>
             <w:tcBorders>
               <w:top w:val="single" w:sz="4" w:space="0" w:color="AAAAAA"/>
@@ -5265,7 +5145,7 @@
         </w:tc>
         <w:tc>
           <w:tcPr>
-            <w:tcW w:type="dxa" w:w="4252"/>
+            <w:tcW w:type="dxa" w:w="4365"/>
             <w:shd w:val="clear" w:color="auto" w:fill="FFFFFF"/>
             <w:tcBorders>
               <w:top w:val="single" w:sz="4" w:space="0" w:color="AAAAAA"/>
@@ -5319,7 +5199,7 @@
       <w:tr>
         <w:tc>
           <w:tcPr>
-            <w:tcW w:type="dxa" w:w="397"/>
+            <w:tcW w:type="dxa" w:w="283"/>
             <w:shd w:val="clear" w:color="auto" w:fill="FFFFFF"/>
             <w:tcBorders>
               <w:top w:val="single" w:sz="4" w:space="0" w:color="AAAAAA"/>
@@ -5345,7 +5225,7 @@
         </w:tc>
         <w:tc>
           <w:tcPr>
-            <w:tcW w:type="dxa" w:w="4252"/>
+            <w:tcW w:type="dxa" w:w="4365"/>
             <w:shd w:val="clear" w:color="auto" w:fill="FFFFFF"/>
             <w:tcBorders>
               <w:top w:val="single" w:sz="4" w:space="0" w:color="AAAAAA"/>
@@ -5399,7 +5279,7 @@
       <w:tr>
         <w:tc>
           <w:tcPr>
-            <w:tcW w:type="dxa" w:w="397"/>
+            <w:tcW w:type="dxa" w:w="283"/>
             <w:shd w:val="clear" w:color="auto" w:fill="FFFFFF"/>
             <w:tcBorders>
               <w:top w:val="single" w:sz="4" w:space="0" w:color="AAAAAA"/>
@@ -5425,7 +5305,7 @@
         </w:tc>
         <w:tc>
           <w:tcPr>
-            <w:tcW w:type="dxa" w:w="4252"/>
+            <w:tcW w:type="dxa" w:w="4365"/>
             <w:shd w:val="clear" w:color="auto" w:fill="FFFFFF"/>
             <w:tcBorders>
               <w:top w:val="single" w:sz="4" w:space="0" w:color="AAAAAA"/>
@@ -5479,15 +5359,14 @@
       <w:tr>
         <w:tc>
           <w:tcPr>
-            <w:tcW w:type="dxa" w:w="397"/>
-            <w:shd w:val="clear" w:color="auto" w:fill="FFFFFF"/>
+            <w:tcW w:type="dxa" w:w="283"/>
+            <w:shd w:val="clear" w:color="auto" w:fill="D6E4F0"/>
             <w:tcBorders>
               <w:top w:val="single" w:sz="4" w:space="0" w:color="AAAAAA"/>
               <w:left w:val="single" w:sz="4" w:space="0" w:color="AAAAAA"/>
               <w:bottom w:val="single" w:sz="4" w:space="0" w:color="AAAAAA"/>
               <w:right w:val="single" w:sz="4" w:space="0" w:color="AAAAAA"/>
             </w:tcBorders>
-            <w:vAlign w:val="center"/>
           </w:tcPr>
           <w:p>
             <w:pPr>
@@ -5497,6 +5376,7 @@
             <w:r>
               <w:rPr>
                 <w:b/>
+                <w:color w:val="1F3864"/>
                 <w:sz w:val="18"/>
               </w:rPr>
               <w:t>9</w:t>
@@ -5505,15 +5385,15 @@
         </w:tc>
         <w:tc>
           <w:tcPr>
-            <w:tcW w:type="dxa" w:w="4252"/>
-            <w:shd w:val="clear" w:color="auto" w:fill="FFFFFF"/>
+            <w:tcW w:type="dxa" w:w="4989"/>
+            <w:gridSpan w:val="2"/>
+            <w:shd w:val="clear" w:color="auto" w:fill="D6E4F0"/>
             <w:tcBorders>
               <w:top w:val="single" w:sz="4" w:space="0" w:color="AAAAAA"/>
               <w:left w:val="single" w:sz="4" w:space="0" w:color="AAAAAA"/>
               <w:bottom w:val="single" w:sz="4" w:space="0" w:color="AAAAAA"/>
               <w:right w:val="single" w:sz="4" w:space="0" w:color="AAAAAA"/>
             </w:tcBorders>
-            <w:vAlign w:val="center"/>
           </w:tcPr>
           <w:p>
             <w:pPr>
@@ -5522,35 +5402,11 @@
             </w:pPr>
             <w:r>
               <w:rPr>
-                <w:b w:val="0"/>
+                <w:b/>
+                <w:color w:val="1F3864"/>
                 <w:sz w:val="18"/>
               </w:rPr>
               <w:t>MISCELLANEOUS</w:t>
-            </w:r>
-          </w:p>
-        </w:tc>
-        <w:tc>
-          <w:tcPr>
-            <w:tcW w:type="dxa" w:w="4989"/>
-            <w:shd w:val="clear" w:color="auto" w:fill="FFFFFF"/>
-            <w:tcBorders>
-              <w:top w:val="single" w:sz="4" w:space="0" w:color="AAAAAA"/>
-              <w:left w:val="single" w:sz="4" w:space="0" w:color="AAAAAA"/>
-              <w:bottom w:val="single" w:sz="4" w:space="0" w:color="AAAAAA"/>
-              <w:right w:val="single" w:sz="4" w:space="0" w:color="AAAAAA"/>
-            </w:tcBorders>
-            <w:vAlign w:val="center"/>
-          </w:tcPr>
-          <w:p>
-            <w:pPr>
-              <w:spacing w:before="40" w:after="40"/>
-              <w:jc w:val="left"/>
-            </w:pPr>
-            <w:r>
-              <w:rPr>
-                <w:b w:val="0"/>
-                <w:sz w:val="18"/>
-              </w:rPr>
             </w:r>
           </w:p>
         </w:tc>
@@ -5558,7 +5414,7 @@
       <w:tr>
         <w:tc>
           <w:tcPr>
-            <w:tcW w:type="dxa" w:w="397"/>
+            <w:tcW w:type="dxa" w:w="283"/>
             <w:shd w:val="clear" w:color="auto" w:fill="FFFFFF"/>
             <w:tcBorders>
               <w:top w:val="single" w:sz="4" w:space="0" w:color="AAAAAA"/>
@@ -5584,7 +5440,7 @@
         </w:tc>
         <w:tc>
           <w:tcPr>
-            <w:tcW w:type="dxa" w:w="4252"/>
+            <w:tcW w:type="dxa" w:w="4365"/>
             <w:shd w:val="clear" w:color="auto" w:fill="FFFFFF"/>
             <w:tcBorders>
               <w:top w:val="single" w:sz="4" w:space="0" w:color="AAAAAA"/>
@@ -5638,7 +5494,7 @@
       <w:tr>
         <w:tc>
           <w:tcPr>
-            <w:tcW w:type="dxa" w:w="397"/>
+            <w:tcW w:type="dxa" w:w="283"/>
             <w:shd w:val="clear" w:color="auto" w:fill="FFFFFF"/>
             <w:tcBorders>
               <w:top w:val="single" w:sz="4" w:space="0" w:color="AAAAAA"/>
@@ -5664,7 +5520,7 @@
         </w:tc>
         <w:tc>
           <w:tcPr>
-            <w:tcW w:type="dxa" w:w="4252"/>
+            <w:tcW w:type="dxa" w:w="4365"/>
             <w:shd w:val="clear" w:color="auto" w:fill="FFFFFF"/>
             <w:tcBorders>
               <w:top w:val="single" w:sz="4" w:space="0" w:color="AAAAAA"/>
@@ -5718,7 +5574,7 @@
       <w:tr>
         <w:tc>
           <w:tcPr>
-            <w:tcW w:type="dxa" w:w="397"/>
+            <w:tcW w:type="dxa" w:w="283"/>
             <w:shd w:val="clear" w:color="auto" w:fill="FFFFFF"/>
             <w:tcBorders>
               <w:top w:val="single" w:sz="4" w:space="0" w:color="AAAAAA"/>
@@ -5744,7 +5600,7 @@
         </w:tc>
         <w:tc>
           <w:tcPr>
-            <w:tcW w:type="dxa" w:w="4252"/>
+            <w:tcW w:type="dxa" w:w="4365"/>
             <w:shd w:val="clear" w:color="auto" w:fill="FFFFFF"/>
             <w:tcBorders>
               <w:top w:val="single" w:sz="4" w:space="0" w:color="AAAAAA"/>
@@ -5827,7 +5683,7 @@
       <w:tr>
         <w:tc>
           <w:tcPr>
-            <w:tcW w:type="dxa" w:w="397"/>
+            <w:tcW w:type="dxa" w:w="283"/>
             <w:shd w:val="clear" w:color="auto" w:fill="FFFFFF"/>
             <w:tcBorders>
               <w:top w:val="single" w:sz="4" w:space="0" w:color="AAAAAA"/>
@@ -5853,7 +5709,7 @@
         </w:tc>
         <w:tc>
           <w:tcPr>
-            <w:tcW w:type="dxa" w:w="4252"/>
+            <w:tcW w:type="dxa" w:w="4365"/>
             <w:shd w:val="clear" w:color="auto" w:fill="FFFFFF"/>
             <w:tcBorders>
               <w:top w:val="single" w:sz="4" w:space="0" w:color="AAAAAA"/>
@@ -5968,7 +5824,7 @@
       <w:tr>
         <w:tc>
           <w:tcPr>
-            <w:tcW w:type="dxa" w:w="397"/>
+            <w:tcW w:type="dxa" w:w="283"/>
             <w:shd w:val="clear" w:color="auto" w:fill="FFFFFF"/>
             <w:tcBorders>
               <w:top w:val="single" w:sz="4" w:space="0" w:color="AAAAAA"/>
@@ -5994,7 +5850,7 @@
         </w:tc>
         <w:tc>
           <w:tcPr>
-            <w:tcW w:type="dxa" w:w="4252"/>
+            <w:tcW w:type="dxa" w:w="4365"/>
             <w:shd w:val="clear" w:color="auto" w:fill="FFFFFF"/>
             <w:tcBorders>
               <w:top w:val="single" w:sz="4" w:space="0" w:color="AAAAAA"/>
@@ -6048,7 +5904,7 @@
       <w:tr>
         <w:tc>
           <w:tcPr>
-            <w:tcW w:type="dxa" w:w="397"/>
+            <w:tcW w:type="dxa" w:w="283"/>
             <w:shd w:val="clear" w:color="auto" w:fill="FFFFFF"/>
             <w:tcBorders>
               <w:top w:val="single" w:sz="4" w:space="0" w:color="AAAAAA"/>
@@ -6074,7 +5930,7 @@
         </w:tc>
         <w:tc>
           <w:tcPr>
-            <w:tcW w:type="dxa" w:w="4252"/>
+            <w:tcW w:type="dxa" w:w="4365"/>
             <w:shd w:val="clear" w:color="auto" w:fill="FFFFFF"/>
             <w:tcBorders>
               <w:top w:val="single" w:sz="4" w:space="0" w:color="AAAAAA"/>
@@ -6128,7 +5984,7 @@
       <w:tr>
         <w:tc>
           <w:tcPr>
-            <w:tcW w:type="dxa" w:w="397"/>
+            <w:tcW w:type="dxa" w:w="283"/>
             <w:shd w:val="clear" w:color="auto" w:fill="FFFFFF"/>
             <w:tcBorders>
               <w:top w:val="single" w:sz="4" w:space="0" w:color="AAAAAA"/>
@@ -6154,7 +6010,7 @@
         </w:tc>
         <w:tc>
           <w:tcPr>
-            <w:tcW w:type="dxa" w:w="4252"/>
+            <w:tcW w:type="dxa" w:w="4365"/>
             <w:shd w:val="clear" w:color="auto" w:fill="FFFFFF"/>
             <w:tcBorders>
               <w:top w:val="single" w:sz="4" w:space="0" w:color="AAAAAA"/>
@@ -6208,7 +6064,7 @@
       <w:tr>
         <w:tc>
           <w:tcPr>
-            <w:tcW w:type="dxa" w:w="397"/>
+            <w:tcW w:type="dxa" w:w="283"/>
             <w:shd w:val="clear" w:color="auto" w:fill="FFFFFF"/>
             <w:tcBorders>
               <w:top w:val="single" w:sz="4" w:space="0" w:color="AAAAAA"/>
@@ -6234,7 +6090,7 @@
         </w:tc>
         <w:tc>
           <w:tcPr>
-            <w:tcW w:type="dxa" w:w="4252"/>
+            <w:tcW w:type="dxa" w:w="4365"/>
             <w:shd w:val="clear" w:color="auto" w:fill="FFFFFF"/>
             <w:tcBorders>
               <w:top w:val="single" w:sz="4" w:space="0" w:color="AAAAAA"/>
@@ -6288,7 +6144,7 @@
       <w:tr>
         <w:tc>
           <w:tcPr>
-            <w:tcW w:type="dxa" w:w="397"/>
+            <w:tcW w:type="dxa" w:w="283"/>
             <w:shd w:val="clear" w:color="auto" w:fill="FFFFFF"/>
             <w:tcBorders>
               <w:top w:val="single" w:sz="4" w:space="0" w:color="AAAAAA"/>
@@ -6314,7 +6170,7 @@
         </w:tc>
         <w:tc>
           <w:tcPr>
-            <w:tcW w:type="dxa" w:w="4252"/>
+            <w:tcW w:type="dxa" w:w="4365"/>
             <w:shd w:val="clear" w:color="auto" w:fill="FFFFFF"/>
             <w:tcBorders>
               <w:top w:val="single" w:sz="4" w:space="0" w:color="AAAAAA"/>
@@ -6368,7 +6224,7 @@
       <w:tr>
         <w:tc>
           <w:tcPr>
-            <w:tcW w:type="dxa" w:w="397"/>
+            <w:tcW w:type="dxa" w:w="283"/>
             <w:shd w:val="clear" w:color="auto" w:fill="FFFFFF"/>
             <w:tcBorders>
               <w:top w:val="single" w:sz="4" w:space="0" w:color="AAAAAA"/>
@@ -6394,7 +6250,7 @@
         </w:tc>
         <w:tc>
           <w:tcPr>
-            <w:tcW w:type="dxa" w:w="4252"/>
+            <w:tcW w:type="dxa" w:w="4365"/>
             <w:shd w:val="clear" w:color="auto" w:fill="FFFFFF"/>
             <w:tcBorders>
               <w:top w:val="single" w:sz="4" w:space="0" w:color="AAAAAA"/>
@@ -6448,7 +6304,7 @@
       <w:tr>
         <w:tc>
           <w:tcPr>
-            <w:tcW w:type="dxa" w:w="397"/>
+            <w:tcW w:type="dxa" w:w="283"/>
             <w:shd w:val="clear" w:color="auto" w:fill="FFFFFF"/>
             <w:tcBorders>
               <w:top w:val="single" w:sz="4" w:space="0" w:color="AAAAAA"/>
@@ -6474,7 +6330,7 @@
         </w:tc>
         <w:tc>
           <w:tcPr>
-            <w:tcW w:type="dxa" w:w="4252"/>
+            <w:tcW w:type="dxa" w:w="4365"/>
             <w:shd w:val="clear" w:color="auto" w:fill="FFFFFF"/>
             <w:tcBorders>
               <w:top w:val="single" w:sz="4" w:space="0" w:color="AAAAAA"/>
@@ -6556,7 +6412,7 @@
       <w:tr>
         <w:tc>
           <w:tcPr>
-            <w:tcW w:type="dxa" w:w="397"/>
+            <w:tcW w:type="dxa" w:w="283"/>
             <w:shd w:val="clear" w:color="auto" w:fill="FFFFFF"/>
             <w:tcBorders>
               <w:top w:val="single" w:sz="4" w:space="0" w:color="AAAAAA"/>
@@ -6582,7 +6438,7 @@
         </w:tc>
         <w:tc>
           <w:tcPr>
-            <w:tcW w:type="dxa" w:w="4252"/>
+            <w:tcW w:type="dxa" w:w="4365"/>
             <w:shd w:val="clear" w:color="auto" w:fill="FFFFFF"/>
             <w:tcBorders>
               <w:top w:val="single" w:sz="4" w:space="0" w:color="AAAAAA"/>
@@ -6638,7 +6494,7 @@
       <w:tr>
         <w:tc>
           <w:tcPr>
-            <w:tcW w:type="dxa" w:w="397"/>
+            <w:tcW w:type="dxa" w:w="283"/>
             <w:shd w:val="clear" w:color="auto" w:fill="FFFFFF"/>
             <w:tcBorders>
               <w:top w:val="single" w:sz="4" w:space="0" w:color="AAAAAA"/>
@@ -6664,7 +6520,7 @@
         </w:tc>
         <w:tc>
           <w:tcPr>
-            <w:tcW w:type="dxa" w:w="4252"/>
+            <w:tcW w:type="dxa" w:w="4365"/>
             <w:shd w:val="clear" w:color="auto" w:fill="FFFFFF"/>
             <w:tcBorders>
               <w:top w:val="single" w:sz="4" w:space="0" w:color="AAAAAA"/>
@@ -6720,7 +6576,7 @@
       <w:tr>
         <w:tc>
           <w:tcPr>
-            <w:tcW w:type="dxa" w:w="397"/>
+            <w:tcW w:type="dxa" w:w="283"/>
             <w:shd w:val="clear" w:color="auto" w:fill="FFFFFF"/>
             <w:tcBorders>
               <w:top w:val="single" w:sz="4" w:space="0" w:color="AAAAAA"/>
@@ -6745,7 +6601,7 @@
         </w:tc>
         <w:tc>
           <w:tcPr>
-            <w:tcW w:type="dxa" w:w="4252"/>
+            <w:tcW w:type="dxa" w:w="4365"/>
             <w:shd w:val="clear" w:color="auto" w:fill="FFFFFF"/>
             <w:tcBorders>
               <w:top w:val="single" w:sz="4" w:space="0" w:color="AAAAAA"/>
@@ -6799,7 +6655,7 @@
       <w:tr>
         <w:tc>
           <w:tcPr>
-            <w:tcW w:type="dxa" w:w="397"/>
+            <w:tcW w:type="dxa" w:w="283"/>
             <w:shd w:val="clear" w:color="auto" w:fill="FFFFFF"/>
             <w:tcBorders>
               <w:top w:val="single" w:sz="4" w:space="0" w:color="AAAAAA"/>
@@ -6825,7 +6681,7 @@
         </w:tc>
         <w:tc>
           <w:tcPr>
-            <w:tcW w:type="dxa" w:w="4252"/>
+            <w:tcW w:type="dxa" w:w="4365"/>
             <w:shd w:val="clear" w:color="auto" w:fill="FFFFFF"/>
             <w:tcBorders>
               <w:top w:val="single" w:sz="4" w:space="0" w:color="AAAAAA"/>
@@ -6879,7 +6735,7 @@
       <w:tr>
         <w:tc>
           <w:tcPr>
-            <w:tcW w:type="dxa" w:w="397"/>
+            <w:tcW w:type="dxa" w:w="283"/>
             <w:shd w:val="clear" w:color="auto" w:fill="FFFFFF"/>
             <w:tcBorders>
               <w:top w:val="single" w:sz="4" w:space="0" w:color="AAAAAA"/>
@@ -6905,7 +6761,7 @@
         </w:tc>
         <w:tc>
           <w:tcPr>
-            <w:tcW w:type="dxa" w:w="4252"/>
+            <w:tcW w:type="dxa" w:w="4365"/>
             <w:shd w:val="clear" w:color="auto" w:fill="FFFFFF"/>
             <w:tcBorders>
               <w:top w:val="single" w:sz="4" w:space="0" w:color="AAAAAA"/>
@@ -6987,7 +6843,7 @@
       <w:tr>
         <w:tc>
           <w:tcPr>
-            <w:tcW w:type="dxa" w:w="397"/>
+            <w:tcW w:type="dxa" w:w="283"/>
             <w:shd w:val="clear" w:color="auto" w:fill="FFFFFF"/>
             <w:tcBorders>
               <w:top w:val="single" w:sz="4" w:space="0" w:color="AAAAAA"/>
@@ -7012,7 +6868,7 @@
         </w:tc>
         <w:tc>
           <w:tcPr>
-            <w:tcW w:type="dxa" w:w="4252"/>
+            <w:tcW w:type="dxa" w:w="4365"/>
             <w:shd w:val="clear" w:color="auto" w:fill="FFFFFF"/>
             <w:tcBorders>
               <w:top w:val="single" w:sz="4" w:space="0" w:color="AAAAAA"/>
@@ -7068,7 +6924,7 @@
       <w:tr>
         <w:tc>
           <w:tcPr>
-            <w:tcW w:type="dxa" w:w="397"/>
+            <w:tcW w:type="dxa" w:w="283"/>
             <w:shd w:val="clear" w:color="auto" w:fill="FFFFFF"/>
             <w:tcBorders>
               <w:top w:val="single" w:sz="4" w:space="0" w:color="AAAAAA"/>
@@ -7093,7 +6949,7 @@
         </w:tc>
         <w:tc>
           <w:tcPr>
-            <w:tcW w:type="dxa" w:w="4252"/>
+            <w:tcW w:type="dxa" w:w="4365"/>
             <w:shd w:val="clear" w:color="auto" w:fill="FFFFFF"/>
             <w:tcBorders>
               <w:top w:val="single" w:sz="4" w:space="0" w:color="AAAAAA"/>

</xml_diff>

<commit_message>
Narrow SR column to 0.3cm (approx 33% of previous)
</commit_message>
<xml_diff>
--- a/casad_template.docx
+++ b/casad_template.docx
@@ -44,7 +44,7 @@
       <w:tr>
         <w:tc>
           <w:tcPr>
-            <w:tcW w:type="dxa" w:w="283"/>
+            <w:tcW w:type="dxa" w:w="170"/>
             <w:shd w:val="clear" w:color="auto" w:fill="1F3864"/>
             <w:tcBorders>
               <w:top w:val="single" w:sz="4" w:space="0" w:color="FFFFFF"/>
@@ -72,7 +72,7 @@
         </w:tc>
         <w:tc>
           <w:tcPr>
-            <w:tcW w:type="dxa" w:w="4365"/>
+            <w:tcW w:type="dxa" w:w="4479"/>
             <w:shd w:val="clear" w:color="auto" w:fill="1F3864"/>
             <w:tcBorders>
               <w:top w:val="single" w:sz="4" w:space="0" w:color="FFFFFF"/>
@@ -155,7 +155,7 @@
       <w:tr>
         <w:tc>
           <w:tcPr>
-            <w:tcW w:type="dxa" w:w="283"/>
+            <w:tcW w:type="dxa" w:w="170"/>
             <w:shd w:val="clear" w:color="auto" w:fill="FFFFFF"/>
             <w:tcBorders>
               <w:top w:val="single" w:sz="4" w:space="0" w:color="AAAAAA"/>
@@ -181,7 +181,7 @@
         </w:tc>
         <w:tc>
           <w:tcPr>
-            <w:tcW w:type="dxa" w:w="4365"/>
+            <w:tcW w:type="dxa" w:w="4479"/>
             <w:shd w:val="clear" w:color="auto" w:fill="FFFFFF"/>
             <w:tcBorders>
               <w:top w:val="single" w:sz="4" w:space="0" w:color="AAAAAA"/>
@@ -235,7 +235,7 @@
       <w:tr>
         <w:tc>
           <w:tcPr>
-            <w:tcW w:type="dxa" w:w="283"/>
+            <w:tcW w:type="dxa" w:w="170"/>
             <w:shd w:val="clear" w:color="auto" w:fill="FFFFFF"/>
             <w:tcBorders>
               <w:top w:val="single" w:sz="4" w:space="0" w:color="AAAAAA"/>
@@ -261,7 +261,7 @@
         </w:tc>
         <w:tc>
           <w:tcPr>
-            <w:tcW w:type="dxa" w:w="4365"/>
+            <w:tcW w:type="dxa" w:w="4479"/>
             <w:shd w:val="clear" w:color="auto" w:fill="FFFFFF"/>
             <w:tcBorders>
               <w:top w:val="single" w:sz="4" w:space="0" w:color="AAAAAA"/>
@@ -315,7 +315,7 @@
       <w:tr>
         <w:tc>
           <w:tcPr>
-            <w:tcW w:type="dxa" w:w="283"/>
+            <w:tcW w:type="dxa" w:w="170"/>
             <w:shd w:val="clear" w:color="auto" w:fill="FFFFFF"/>
             <w:tcBorders>
               <w:top w:val="single" w:sz="4" w:space="0" w:color="AAAAAA"/>
@@ -341,7 +341,7 @@
         </w:tc>
         <w:tc>
           <w:tcPr>
-            <w:tcW w:type="dxa" w:w="4365"/>
+            <w:tcW w:type="dxa" w:w="4479"/>
             <w:shd w:val="clear" w:color="auto" w:fill="FFFFFF"/>
             <w:tcBorders>
               <w:top w:val="single" w:sz="4" w:space="0" w:color="AAAAAA"/>
@@ -403,7 +403,7 @@
       <w:tr>
         <w:tc>
           <w:tcPr>
-            <w:tcW w:type="dxa" w:w="283"/>
+            <w:tcW w:type="dxa" w:w="170"/>
             <w:shd w:val="clear" w:color="auto" w:fill="FFFFFF"/>
             <w:tcBorders>
               <w:top w:val="single" w:sz="4" w:space="0" w:color="AAAAAA"/>
@@ -429,7 +429,7 @@
         </w:tc>
         <w:tc>
           <w:tcPr>
-            <w:tcW w:type="dxa" w:w="4365"/>
+            <w:tcW w:type="dxa" w:w="4479"/>
             <w:shd w:val="clear" w:color="auto" w:fill="FFFFFF"/>
             <w:tcBorders>
               <w:top w:val="single" w:sz="4" w:space="0" w:color="AAAAAA"/>
@@ -491,7 +491,7 @@
       <w:tr>
         <w:tc>
           <w:tcPr>
-            <w:tcW w:type="dxa" w:w="283"/>
+            <w:tcW w:type="dxa" w:w="170"/>
             <w:shd w:val="clear" w:color="auto" w:fill="FFFFFF"/>
             <w:tcBorders>
               <w:top w:val="single" w:sz="4" w:space="0" w:color="AAAAAA"/>
@@ -517,7 +517,7 @@
         </w:tc>
         <w:tc>
           <w:tcPr>
-            <w:tcW w:type="dxa" w:w="4365"/>
+            <w:tcW w:type="dxa" w:w="4479"/>
             <w:shd w:val="clear" w:color="auto" w:fill="FFFFFF"/>
             <w:tcBorders>
               <w:top w:val="single" w:sz="4" w:space="0" w:color="AAAAAA"/>
@@ -571,7 +571,7 @@
       <w:tr>
         <w:tc>
           <w:tcPr>
-            <w:tcW w:type="dxa" w:w="283"/>
+            <w:tcW w:type="dxa" w:w="170"/>
             <w:shd w:val="clear" w:color="auto" w:fill="FFFFFF"/>
             <w:tcBorders>
               <w:top w:val="single" w:sz="4" w:space="0" w:color="AAAAAA"/>
@@ -597,7 +597,7 @@
         </w:tc>
         <w:tc>
           <w:tcPr>
-            <w:tcW w:type="dxa" w:w="4365"/>
+            <w:tcW w:type="dxa" w:w="4479"/>
             <w:shd w:val="clear" w:color="auto" w:fill="FFFFFF"/>
             <w:tcBorders>
               <w:top w:val="single" w:sz="4" w:space="0" w:color="AAAAAA"/>
@@ -651,7 +651,7 @@
       <w:tr>
         <w:tc>
           <w:tcPr>
-            <w:tcW w:type="dxa" w:w="283"/>
+            <w:tcW w:type="dxa" w:w="170"/>
             <w:shd w:val="clear" w:color="auto" w:fill="FFFFFF"/>
             <w:tcBorders>
               <w:top w:val="single" w:sz="4" w:space="0" w:color="AAAAAA"/>
@@ -677,7 +677,7 @@
         </w:tc>
         <w:tc>
           <w:tcPr>
-            <w:tcW w:type="dxa" w:w="4365"/>
+            <w:tcW w:type="dxa" w:w="4479"/>
             <w:shd w:val="clear" w:color="auto" w:fill="FFFFFF"/>
             <w:tcBorders>
               <w:top w:val="single" w:sz="4" w:space="0" w:color="AAAAAA"/>
@@ -733,7 +733,7 @@
       <w:tr>
         <w:tc>
           <w:tcPr>
-            <w:tcW w:type="dxa" w:w="283"/>
+            <w:tcW w:type="dxa" w:w="170"/>
             <w:shd w:val="clear" w:color="auto" w:fill="FFFFFF"/>
             <w:tcBorders>
               <w:top w:val="single" w:sz="4" w:space="0" w:color="AAAAAA"/>
@@ -759,7 +759,7 @@
         </w:tc>
         <w:tc>
           <w:tcPr>
-            <w:tcW w:type="dxa" w:w="4365"/>
+            <w:tcW w:type="dxa" w:w="4479"/>
             <w:shd w:val="clear" w:color="auto" w:fill="FFFFFF"/>
             <w:tcBorders>
               <w:top w:val="single" w:sz="4" w:space="0" w:color="AAAAAA"/>
@@ -813,7 +813,7 @@
       <w:tr>
         <w:tc>
           <w:tcPr>
-            <w:tcW w:type="dxa" w:w="283"/>
+            <w:tcW w:type="dxa" w:w="170"/>
             <w:shd w:val="clear" w:color="auto" w:fill="FFFFFF"/>
             <w:tcBorders>
               <w:top w:val="single" w:sz="4" w:space="0" w:color="AAAAAA"/>
@@ -839,7 +839,7 @@
         </w:tc>
         <w:tc>
           <w:tcPr>
-            <w:tcW w:type="dxa" w:w="4365"/>
+            <w:tcW w:type="dxa" w:w="4479"/>
             <w:shd w:val="clear" w:color="auto" w:fill="FFFFFF"/>
             <w:tcBorders>
               <w:top w:val="single" w:sz="4" w:space="0" w:color="AAAAAA"/>
@@ -893,7 +893,7 @@
       <w:tr>
         <w:tc>
           <w:tcPr>
-            <w:tcW w:type="dxa" w:w="283"/>
+            <w:tcW w:type="dxa" w:w="170"/>
             <w:shd w:val="clear" w:color="auto" w:fill="FFFFFF"/>
             <w:tcBorders>
               <w:top w:val="single" w:sz="4" w:space="0" w:color="AAAAAA"/>
@@ -919,7 +919,7 @@
         </w:tc>
         <w:tc>
           <w:tcPr>
-            <w:tcW w:type="dxa" w:w="4365"/>
+            <w:tcW w:type="dxa" w:w="4479"/>
             <w:shd w:val="clear" w:color="auto" w:fill="FFFFFF"/>
             <w:tcBorders>
               <w:top w:val="single" w:sz="4" w:space="0" w:color="AAAAAA"/>
@@ -973,7 +973,7 @@
       <w:tr>
         <w:tc>
           <w:tcPr>
-            <w:tcW w:type="dxa" w:w="283"/>
+            <w:tcW w:type="dxa" w:w="170"/>
             <w:shd w:val="clear" w:color="auto" w:fill="FFFFFF"/>
             <w:tcBorders>
               <w:top w:val="single" w:sz="4" w:space="0" w:color="AAAAAA"/>
@@ -999,7 +999,7 @@
         </w:tc>
         <w:tc>
           <w:tcPr>
-            <w:tcW w:type="dxa" w:w="4365"/>
+            <w:tcW w:type="dxa" w:w="4479"/>
             <w:shd w:val="clear" w:color="auto" w:fill="FFFFFF"/>
             <w:tcBorders>
               <w:top w:val="single" w:sz="4" w:space="0" w:color="AAAAAA"/>
@@ -1053,7 +1053,7 @@
       <w:tr>
         <w:tc>
           <w:tcPr>
-            <w:tcW w:type="dxa" w:w="283"/>
+            <w:tcW w:type="dxa" w:w="170"/>
             <w:shd w:val="clear" w:color="auto" w:fill="FFFFFF"/>
             <w:tcBorders>
               <w:top w:val="single" w:sz="4" w:space="0" w:color="AAAAAA"/>
@@ -1079,7 +1079,7 @@
         </w:tc>
         <w:tc>
           <w:tcPr>
-            <w:tcW w:type="dxa" w:w="4365"/>
+            <w:tcW w:type="dxa" w:w="4479"/>
             <w:shd w:val="clear" w:color="auto" w:fill="FFFFFF"/>
             <w:tcBorders>
               <w:top w:val="single" w:sz="4" w:space="0" w:color="AAAAAA"/>
@@ -1133,7 +1133,7 @@
       <w:tr>
         <w:tc>
           <w:tcPr>
-            <w:tcW w:type="dxa" w:w="283"/>
+            <w:tcW w:type="dxa" w:w="170"/>
             <w:shd w:val="clear" w:color="auto" w:fill="FFFFFF"/>
             <w:tcBorders>
               <w:top w:val="single" w:sz="4" w:space="0" w:color="AAAAAA"/>
@@ -1159,7 +1159,7 @@
         </w:tc>
         <w:tc>
           <w:tcPr>
-            <w:tcW w:type="dxa" w:w="4365"/>
+            <w:tcW w:type="dxa" w:w="4479"/>
             <w:shd w:val="clear" w:color="auto" w:fill="FFFFFF"/>
             <w:tcBorders>
               <w:top w:val="single" w:sz="4" w:space="0" w:color="AAAAAA"/>
@@ -1213,7 +1213,7 @@
       <w:tr>
         <w:tc>
           <w:tcPr>
-            <w:tcW w:type="dxa" w:w="283"/>
+            <w:tcW w:type="dxa" w:w="170"/>
             <w:shd w:val="clear" w:color="auto" w:fill="FFFFFF"/>
             <w:tcBorders>
               <w:top w:val="single" w:sz="4" w:space="0" w:color="AAAAAA"/>
@@ -1239,7 +1239,7 @@
         </w:tc>
         <w:tc>
           <w:tcPr>
-            <w:tcW w:type="dxa" w:w="4365"/>
+            <w:tcW w:type="dxa" w:w="4479"/>
             <w:shd w:val="clear" w:color="auto" w:fill="FFFFFF"/>
             <w:tcBorders>
               <w:top w:val="single" w:sz="4" w:space="0" w:color="AAAAAA"/>
@@ -1295,7 +1295,7 @@
       <w:tr>
         <w:tc>
           <w:tcPr>
-            <w:tcW w:type="dxa" w:w="283"/>
+            <w:tcW w:type="dxa" w:w="170"/>
             <w:shd w:val="clear" w:color="auto" w:fill="FFFFFF"/>
             <w:tcBorders>
               <w:top w:val="single" w:sz="4" w:space="0" w:color="AAAAAA"/>
@@ -1321,7 +1321,7 @@
         </w:tc>
         <w:tc>
           <w:tcPr>
-            <w:tcW w:type="dxa" w:w="4365"/>
+            <w:tcW w:type="dxa" w:w="4479"/>
             <w:shd w:val="clear" w:color="auto" w:fill="FFFFFF"/>
             <w:tcBorders>
               <w:top w:val="single" w:sz="4" w:space="0" w:color="AAAAAA"/>
@@ -1375,7 +1375,7 @@
       <w:tr>
         <w:tc>
           <w:tcPr>
-            <w:tcW w:type="dxa" w:w="283"/>
+            <w:tcW w:type="dxa" w:w="170"/>
             <w:shd w:val="clear" w:color="auto" w:fill="FFFFFF"/>
             <w:tcBorders>
               <w:top w:val="single" w:sz="4" w:space="0" w:color="AAAAAA"/>
@@ -1401,7 +1401,7 @@
         </w:tc>
         <w:tc>
           <w:tcPr>
-            <w:tcW w:type="dxa" w:w="4365"/>
+            <w:tcW w:type="dxa" w:w="4479"/>
             <w:shd w:val="clear" w:color="auto" w:fill="FFFFFF"/>
             <w:tcBorders>
               <w:top w:val="single" w:sz="4" w:space="0" w:color="AAAAAA"/>
@@ -1455,7 +1455,7 @@
       <w:tr>
         <w:tc>
           <w:tcPr>
-            <w:tcW w:type="dxa" w:w="283"/>
+            <w:tcW w:type="dxa" w:w="170"/>
             <w:shd w:val="clear" w:color="auto" w:fill="FFFFFF"/>
             <w:tcBorders>
               <w:top w:val="single" w:sz="4" w:space="0" w:color="AAAAAA"/>
@@ -1481,7 +1481,7 @@
         </w:tc>
         <w:tc>
           <w:tcPr>
-            <w:tcW w:type="dxa" w:w="4365"/>
+            <w:tcW w:type="dxa" w:w="4479"/>
             <w:shd w:val="clear" w:color="auto" w:fill="FFFFFF"/>
             <w:tcBorders>
               <w:top w:val="single" w:sz="4" w:space="0" w:color="AAAAAA"/>
@@ -1535,7 +1535,7 @@
       <w:tr>
         <w:tc>
           <w:tcPr>
-            <w:tcW w:type="dxa" w:w="283"/>
+            <w:tcW w:type="dxa" w:w="170"/>
             <w:shd w:val="clear" w:color="auto" w:fill="FFFFFF"/>
             <w:tcBorders>
               <w:top w:val="single" w:sz="4" w:space="0" w:color="AAAAAA"/>
@@ -1561,7 +1561,7 @@
         </w:tc>
         <w:tc>
           <w:tcPr>
-            <w:tcW w:type="dxa" w:w="4365"/>
+            <w:tcW w:type="dxa" w:w="4479"/>
             <w:shd w:val="clear" w:color="auto" w:fill="FFFFFF"/>
             <w:tcBorders>
               <w:top w:val="single" w:sz="4" w:space="0" w:color="AAAAAA"/>
@@ -1615,7 +1615,7 @@
       <w:tr>
         <w:tc>
           <w:tcPr>
-            <w:tcW w:type="dxa" w:w="283"/>
+            <w:tcW w:type="dxa" w:w="170"/>
             <w:shd w:val="clear" w:color="auto" w:fill="FFFFFF"/>
             <w:tcBorders>
               <w:top w:val="single" w:sz="4" w:space="0" w:color="AAAAAA"/>
@@ -1641,7 +1641,7 @@
         </w:tc>
         <w:tc>
           <w:tcPr>
-            <w:tcW w:type="dxa" w:w="4365"/>
+            <w:tcW w:type="dxa" w:w="4479"/>
             <w:shd w:val="clear" w:color="auto" w:fill="FFFFFF"/>
             <w:tcBorders>
               <w:top w:val="single" w:sz="4" w:space="0" w:color="AAAAAA"/>
@@ -1695,7 +1695,7 @@
       <w:tr>
         <w:tc>
           <w:tcPr>
-            <w:tcW w:type="dxa" w:w="283"/>
+            <w:tcW w:type="dxa" w:w="170"/>
             <w:shd w:val="clear" w:color="auto" w:fill="FFFFFF"/>
             <w:tcBorders>
               <w:top w:val="single" w:sz="4" w:space="0" w:color="AAAAAA"/>
@@ -1721,7 +1721,7 @@
         </w:tc>
         <w:tc>
           <w:tcPr>
-            <w:tcW w:type="dxa" w:w="4365"/>
+            <w:tcW w:type="dxa" w:w="4479"/>
             <w:shd w:val="clear" w:color="auto" w:fill="FFFFFF"/>
             <w:tcBorders>
               <w:top w:val="single" w:sz="4" w:space="0" w:color="AAAAAA"/>
@@ -1804,7 +1804,7 @@
       <w:tr>
         <w:tc>
           <w:tcPr>
-            <w:tcW w:type="dxa" w:w="283"/>
+            <w:tcW w:type="dxa" w:w="170"/>
             <w:shd w:val="clear" w:color="auto" w:fill="FFFFFF"/>
             <w:tcBorders>
               <w:top w:val="single" w:sz="4" w:space="0" w:color="AAAAAA"/>
@@ -1830,7 +1830,7 @@
         </w:tc>
         <w:tc>
           <w:tcPr>
-            <w:tcW w:type="dxa" w:w="4365"/>
+            <w:tcW w:type="dxa" w:w="4479"/>
             <w:shd w:val="clear" w:color="auto" w:fill="FFFFFF"/>
             <w:tcBorders>
               <w:top w:val="single" w:sz="4" w:space="0" w:color="AAAAAA"/>
@@ -1884,7 +1884,7 @@
       <w:tr>
         <w:tc>
           <w:tcPr>
-            <w:tcW w:type="dxa" w:w="283"/>
+            <w:tcW w:type="dxa" w:w="170"/>
             <w:shd w:val="clear" w:color="auto" w:fill="D6E4F0"/>
             <w:tcBorders>
               <w:top w:val="single" w:sz="4" w:space="0" w:color="AAAAAA"/>
@@ -1939,7 +1939,7 @@
       <w:tr>
         <w:tc>
           <w:tcPr>
-            <w:tcW w:type="dxa" w:w="283"/>
+            <w:tcW w:type="dxa" w:w="170"/>
             <w:shd w:val="clear" w:color="auto" w:fill="FFFFFF"/>
             <w:tcBorders>
               <w:top w:val="single" w:sz="4" w:space="0" w:color="AAAAAA"/>
@@ -1965,7 +1965,7 @@
         </w:tc>
         <w:tc>
           <w:tcPr>
-            <w:tcW w:type="dxa" w:w="4365"/>
+            <w:tcW w:type="dxa" w:w="4479"/>
             <w:shd w:val="clear" w:color="auto" w:fill="FFFFFF"/>
             <w:tcBorders>
               <w:top w:val="single" w:sz="4" w:space="0" w:color="AAAAAA"/>
@@ -2019,7 +2019,7 @@
       <w:tr>
         <w:tc>
           <w:tcPr>
-            <w:tcW w:type="dxa" w:w="283"/>
+            <w:tcW w:type="dxa" w:w="170"/>
             <w:shd w:val="clear" w:color="auto" w:fill="FFFFFF"/>
             <w:tcBorders>
               <w:top w:val="single" w:sz="4" w:space="0" w:color="AAAAAA"/>
@@ -2045,7 +2045,7 @@
         </w:tc>
         <w:tc>
           <w:tcPr>
-            <w:tcW w:type="dxa" w:w="4365"/>
+            <w:tcW w:type="dxa" w:w="4479"/>
             <w:shd w:val="clear" w:color="auto" w:fill="FFFFFF"/>
             <w:tcBorders>
               <w:top w:val="single" w:sz="4" w:space="0" w:color="AAAAAA"/>
@@ -2099,7 +2099,7 @@
       <w:tr>
         <w:tc>
           <w:tcPr>
-            <w:tcW w:type="dxa" w:w="283"/>
+            <w:tcW w:type="dxa" w:w="170"/>
             <w:shd w:val="clear" w:color="auto" w:fill="FFFFFF"/>
             <w:tcBorders>
               <w:top w:val="single" w:sz="4" w:space="0" w:color="AAAAAA"/>
@@ -2125,7 +2125,7 @@
         </w:tc>
         <w:tc>
           <w:tcPr>
-            <w:tcW w:type="dxa" w:w="4365"/>
+            <w:tcW w:type="dxa" w:w="4479"/>
             <w:shd w:val="clear" w:color="auto" w:fill="FFFFFF"/>
             <w:tcBorders>
               <w:top w:val="single" w:sz="4" w:space="0" w:color="AAAAAA"/>
@@ -2179,7 +2179,7 @@
       <w:tr>
         <w:tc>
           <w:tcPr>
-            <w:tcW w:type="dxa" w:w="283"/>
+            <w:tcW w:type="dxa" w:w="170"/>
             <w:shd w:val="clear" w:color="auto" w:fill="FFFFFF"/>
             <w:tcBorders>
               <w:top w:val="single" w:sz="4" w:space="0" w:color="AAAAAA"/>
@@ -2205,7 +2205,7 @@
         </w:tc>
         <w:tc>
           <w:tcPr>
-            <w:tcW w:type="dxa" w:w="4365"/>
+            <w:tcW w:type="dxa" w:w="4479"/>
             <w:shd w:val="clear" w:color="auto" w:fill="FFFFFF"/>
             <w:tcBorders>
               <w:top w:val="single" w:sz="4" w:space="0" w:color="AAAAAA"/>
@@ -2259,7 +2259,7 @@
       <w:tr>
         <w:tc>
           <w:tcPr>
-            <w:tcW w:type="dxa" w:w="283"/>
+            <w:tcW w:type="dxa" w:w="170"/>
             <w:shd w:val="clear" w:color="auto" w:fill="FFFFFF"/>
             <w:tcBorders>
               <w:top w:val="single" w:sz="4" w:space="0" w:color="AAAAAA"/>
@@ -2285,7 +2285,7 @@
         </w:tc>
         <w:tc>
           <w:tcPr>
-            <w:tcW w:type="dxa" w:w="4365"/>
+            <w:tcW w:type="dxa" w:w="4479"/>
             <w:shd w:val="clear" w:color="auto" w:fill="FFFFFF"/>
             <w:tcBorders>
               <w:top w:val="single" w:sz="4" w:space="0" w:color="AAAAAA"/>
@@ -2339,7 +2339,7 @@
       <w:tr>
         <w:tc>
           <w:tcPr>
-            <w:tcW w:type="dxa" w:w="283"/>
+            <w:tcW w:type="dxa" w:w="170"/>
             <w:shd w:val="clear" w:color="auto" w:fill="FFFFFF"/>
             <w:tcBorders>
               <w:top w:val="single" w:sz="4" w:space="0" w:color="AAAAAA"/>
@@ -2365,7 +2365,7 @@
         </w:tc>
         <w:tc>
           <w:tcPr>
-            <w:tcW w:type="dxa" w:w="4365"/>
+            <w:tcW w:type="dxa" w:w="4479"/>
             <w:shd w:val="clear" w:color="auto" w:fill="FFFFFF"/>
             <w:tcBorders>
               <w:top w:val="single" w:sz="4" w:space="0" w:color="AAAAAA"/>
@@ -2419,7 +2419,7 @@
       <w:tr>
         <w:tc>
           <w:tcPr>
-            <w:tcW w:type="dxa" w:w="283"/>
+            <w:tcW w:type="dxa" w:w="170"/>
             <w:shd w:val="clear" w:color="auto" w:fill="FFFFFF"/>
             <w:tcBorders>
               <w:top w:val="single" w:sz="4" w:space="0" w:color="AAAAAA"/>
@@ -2445,7 +2445,7 @@
         </w:tc>
         <w:tc>
           <w:tcPr>
-            <w:tcW w:type="dxa" w:w="4365"/>
+            <w:tcW w:type="dxa" w:w="4479"/>
             <w:shd w:val="clear" w:color="auto" w:fill="FFFFFF"/>
             <w:tcBorders>
               <w:top w:val="single" w:sz="4" w:space="0" w:color="AAAAAA"/>
@@ -2499,7 +2499,7 @@
       <w:tr>
         <w:tc>
           <w:tcPr>
-            <w:tcW w:type="dxa" w:w="283"/>
+            <w:tcW w:type="dxa" w:w="170"/>
             <w:shd w:val="clear" w:color="auto" w:fill="FFFFFF"/>
             <w:tcBorders>
               <w:top w:val="single" w:sz="4" w:space="0" w:color="AAAAAA"/>
@@ -2525,7 +2525,7 @@
         </w:tc>
         <w:tc>
           <w:tcPr>
-            <w:tcW w:type="dxa" w:w="4365"/>
+            <w:tcW w:type="dxa" w:w="4479"/>
             <w:shd w:val="clear" w:color="auto" w:fill="FFFFFF"/>
             <w:tcBorders>
               <w:top w:val="single" w:sz="4" w:space="0" w:color="AAAAAA"/>
@@ -2579,7 +2579,7 @@
       <w:tr>
         <w:tc>
           <w:tcPr>
-            <w:tcW w:type="dxa" w:w="283"/>
+            <w:tcW w:type="dxa" w:w="170"/>
             <w:shd w:val="clear" w:color="auto" w:fill="FFFFFF"/>
             <w:tcBorders>
               <w:top w:val="single" w:sz="4" w:space="0" w:color="AAAAAA"/>
@@ -2605,7 +2605,7 @@
         </w:tc>
         <w:tc>
           <w:tcPr>
-            <w:tcW w:type="dxa" w:w="4365"/>
+            <w:tcW w:type="dxa" w:w="4479"/>
             <w:shd w:val="clear" w:color="auto" w:fill="FFFFFF"/>
             <w:tcBorders>
               <w:top w:val="single" w:sz="4" w:space="0" w:color="AAAAAA"/>
@@ -2659,7 +2659,7 @@
       <w:tr>
         <w:tc>
           <w:tcPr>
-            <w:tcW w:type="dxa" w:w="283"/>
+            <w:tcW w:type="dxa" w:w="170"/>
             <w:shd w:val="clear" w:color="auto" w:fill="FFFFFF"/>
             <w:tcBorders>
               <w:top w:val="single" w:sz="4" w:space="0" w:color="AAAAAA"/>
@@ -2685,7 +2685,7 @@
         </w:tc>
         <w:tc>
           <w:tcPr>
-            <w:tcW w:type="dxa" w:w="4365"/>
+            <w:tcW w:type="dxa" w:w="4479"/>
             <w:shd w:val="clear" w:color="auto" w:fill="FFFFFF"/>
             <w:tcBorders>
               <w:top w:val="single" w:sz="4" w:space="0" w:color="AAAAAA"/>
@@ -2739,7 +2739,7 @@
       <w:tr>
         <w:tc>
           <w:tcPr>
-            <w:tcW w:type="dxa" w:w="283"/>
+            <w:tcW w:type="dxa" w:w="170"/>
             <w:shd w:val="clear" w:color="auto" w:fill="D6E4F0"/>
             <w:tcBorders>
               <w:top w:val="single" w:sz="4" w:space="0" w:color="AAAAAA"/>
@@ -2794,7 +2794,7 @@
       <w:tr>
         <w:tc>
           <w:tcPr>
-            <w:tcW w:type="dxa" w:w="283"/>
+            <w:tcW w:type="dxa" w:w="170"/>
             <w:shd w:val="clear" w:color="auto" w:fill="FFFFFF"/>
             <w:tcBorders>
               <w:top w:val="single" w:sz="4" w:space="0" w:color="AAAAAA"/>
@@ -2820,7 +2820,7 @@
         </w:tc>
         <w:tc>
           <w:tcPr>
-            <w:tcW w:type="dxa" w:w="4365"/>
+            <w:tcW w:type="dxa" w:w="4479"/>
             <w:shd w:val="clear" w:color="auto" w:fill="FFFFFF"/>
             <w:tcBorders>
               <w:top w:val="single" w:sz="4" w:space="0" w:color="AAAAAA"/>
@@ -2874,7 +2874,7 @@
       <w:tr>
         <w:tc>
           <w:tcPr>
-            <w:tcW w:type="dxa" w:w="283"/>
+            <w:tcW w:type="dxa" w:w="170"/>
             <w:shd w:val="clear" w:color="auto" w:fill="FFFFFF"/>
             <w:tcBorders>
               <w:top w:val="single" w:sz="4" w:space="0" w:color="AAAAAA"/>
@@ -2900,7 +2900,7 @@
         </w:tc>
         <w:tc>
           <w:tcPr>
-            <w:tcW w:type="dxa" w:w="4365"/>
+            <w:tcW w:type="dxa" w:w="4479"/>
             <w:shd w:val="clear" w:color="auto" w:fill="FFFFFF"/>
             <w:tcBorders>
               <w:top w:val="single" w:sz="4" w:space="0" w:color="AAAAAA"/>
@@ -2954,7 +2954,7 @@
       <w:tr>
         <w:tc>
           <w:tcPr>
-            <w:tcW w:type="dxa" w:w="283"/>
+            <w:tcW w:type="dxa" w:w="170"/>
             <w:shd w:val="clear" w:color="auto" w:fill="FFFFFF"/>
             <w:tcBorders>
               <w:top w:val="single" w:sz="4" w:space="0" w:color="AAAAAA"/>
@@ -2980,7 +2980,7 @@
         </w:tc>
         <w:tc>
           <w:tcPr>
-            <w:tcW w:type="dxa" w:w="4365"/>
+            <w:tcW w:type="dxa" w:w="4479"/>
             <w:shd w:val="clear" w:color="auto" w:fill="FFFFFF"/>
             <w:tcBorders>
               <w:top w:val="single" w:sz="4" w:space="0" w:color="AAAAAA"/>
@@ -3034,7 +3034,7 @@
       <w:tr>
         <w:tc>
           <w:tcPr>
-            <w:tcW w:type="dxa" w:w="283"/>
+            <w:tcW w:type="dxa" w:w="170"/>
             <w:shd w:val="clear" w:color="auto" w:fill="FFFFFF"/>
             <w:tcBorders>
               <w:top w:val="single" w:sz="4" w:space="0" w:color="AAAAAA"/>
@@ -3060,7 +3060,7 @@
         </w:tc>
         <w:tc>
           <w:tcPr>
-            <w:tcW w:type="dxa" w:w="4365"/>
+            <w:tcW w:type="dxa" w:w="4479"/>
             <w:shd w:val="clear" w:color="auto" w:fill="FFFFFF"/>
             <w:tcBorders>
               <w:top w:val="single" w:sz="4" w:space="0" w:color="AAAAAA"/>
@@ -3114,7 +3114,7 @@
       <w:tr>
         <w:tc>
           <w:tcPr>
-            <w:tcW w:type="dxa" w:w="283"/>
+            <w:tcW w:type="dxa" w:w="170"/>
             <w:shd w:val="clear" w:color="auto" w:fill="FFFFFF"/>
             <w:tcBorders>
               <w:top w:val="single" w:sz="4" w:space="0" w:color="AAAAAA"/>
@@ -3140,7 +3140,7 @@
         </w:tc>
         <w:tc>
           <w:tcPr>
-            <w:tcW w:type="dxa" w:w="4365"/>
+            <w:tcW w:type="dxa" w:w="4479"/>
             <w:shd w:val="clear" w:color="auto" w:fill="FFFFFF"/>
             <w:tcBorders>
               <w:top w:val="single" w:sz="4" w:space="0" w:color="AAAAAA"/>
@@ -3194,7 +3194,7 @@
       <w:tr>
         <w:tc>
           <w:tcPr>
-            <w:tcW w:type="dxa" w:w="283"/>
+            <w:tcW w:type="dxa" w:w="170"/>
             <w:shd w:val="clear" w:color="auto" w:fill="FFFFFF"/>
             <w:tcBorders>
               <w:top w:val="single" w:sz="4" w:space="0" w:color="AAAAAA"/>
@@ -3220,7 +3220,7 @@
         </w:tc>
         <w:tc>
           <w:tcPr>
-            <w:tcW w:type="dxa" w:w="4365"/>
+            <w:tcW w:type="dxa" w:w="4479"/>
             <w:shd w:val="clear" w:color="auto" w:fill="FFFFFF"/>
             <w:tcBorders>
               <w:top w:val="single" w:sz="4" w:space="0" w:color="AAAAAA"/>
@@ -3274,7 +3274,7 @@
       <w:tr>
         <w:tc>
           <w:tcPr>
-            <w:tcW w:type="dxa" w:w="283"/>
+            <w:tcW w:type="dxa" w:w="170"/>
             <w:shd w:val="clear" w:color="auto" w:fill="FFFFFF"/>
             <w:tcBorders>
               <w:top w:val="single" w:sz="4" w:space="0" w:color="AAAAAA"/>
@@ -3300,7 +3300,7 @@
         </w:tc>
         <w:tc>
           <w:tcPr>
-            <w:tcW w:type="dxa" w:w="4365"/>
+            <w:tcW w:type="dxa" w:w="4479"/>
             <w:shd w:val="clear" w:color="auto" w:fill="FFFFFF"/>
             <w:tcBorders>
               <w:top w:val="single" w:sz="4" w:space="0" w:color="AAAAAA"/>
@@ -3354,7 +3354,7 @@
       <w:tr>
         <w:tc>
           <w:tcPr>
-            <w:tcW w:type="dxa" w:w="283"/>
+            <w:tcW w:type="dxa" w:w="170"/>
             <w:shd w:val="clear" w:color="auto" w:fill="FFFFFF"/>
             <w:tcBorders>
               <w:top w:val="single" w:sz="4" w:space="0" w:color="AAAAAA"/>
@@ -3380,7 +3380,7 @@
         </w:tc>
         <w:tc>
           <w:tcPr>
-            <w:tcW w:type="dxa" w:w="4365"/>
+            <w:tcW w:type="dxa" w:w="4479"/>
             <w:shd w:val="clear" w:color="auto" w:fill="FFFFFF"/>
             <w:tcBorders>
               <w:top w:val="single" w:sz="4" w:space="0" w:color="AAAAAA"/>
@@ -3434,7 +3434,7 @@
       <w:tr>
         <w:tc>
           <w:tcPr>
-            <w:tcW w:type="dxa" w:w="283"/>
+            <w:tcW w:type="dxa" w:w="170"/>
             <w:shd w:val="clear" w:color="auto" w:fill="FFFFFF"/>
             <w:tcBorders>
               <w:top w:val="single" w:sz="4" w:space="0" w:color="AAAAAA"/>
@@ -3460,7 +3460,7 @@
         </w:tc>
         <w:tc>
           <w:tcPr>
-            <w:tcW w:type="dxa" w:w="4365"/>
+            <w:tcW w:type="dxa" w:w="4479"/>
             <w:shd w:val="clear" w:color="auto" w:fill="FFFFFF"/>
             <w:tcBorders>
               <w:top w:val="single" w:sz="4" w:space="0" w:color="AAAAAA"/>
@@ -3514,7 +3514,7 @@
       <w:tr>
         <w:tc>
           <w:tcPr>
-            <w:tcW w:type="dxa" w:w="283"/>
+            <w:tcW w:type="dxa" w:w="170"/>
             <w:shd w:val="clear" w:color="auto" w:fill="FFFFFF"/>
             <w:tcBorders>
               <w:top w:val="single" w:sz="4" w:space="0" w:color="AAAAAA"/>
@@ -3540,7 +3540,7 @@
         </w:tc>
         <w:tc>
           <w:tcPr>
-            <w:tcW w:type="dxa" w:w="4365"/>
+            <w:tcW w:type="dxa" w:w="4479"/>
             <w:shd w:val="clear" w:color="auto" w:fill="FFFFFF"/>
             <w:tcBorders>
               <w:top w:val="single" w:sz="4" w:space="0" w:color="AAAAAA"/>
@@ -3594,7 +3594,7 @@
       <w:tr>
         <w:tc>
           <w:tcPr>
-            <w:tcW w:type="dxa" w:w="283"/>
+            <w:tcW w:type="dxa" w:w="170"/>
             <w:shd w:val="clear" w:color="auto" w:fill="D6E4F0"/>
             <w:tcBorders>
               <w:top w:val="single" w:sz="4" w:space="0" w:color="AAAAAA"/>
@@ -3649,7 +3649,7 @@
       <w:tr>
         <w:tc>
           <w:tcPr>
-            <w:tcW w:type="dxa" w:w="283"/>
+            <w:tcW w:type="dxa" w:w="170"/>
             <w:shd w:val="clear" w:color="auto" w:fill="FFFFFF"/>
             <w:tcBorders>
               <w:top w:val="single" w:sz="4" w:space="0" w:color="AAAAAA"/>
@@ -3675,7 +3675,7 @@
         </w:tc>
         <w:tc>
           <w:tcPr>
-            <w:tcW w:type="dxa" w:w="4365"/>
+            <w:tcW w:type="dxa" w:w="4479"/>
             <w:shd w:val="clear" w:color="auto" w:fill="FFFFFF"/>
             <w:tcBorders>
               <w:top w:val="single" w:sz="4" w:space="0" w:color="AAAAAA"/>
@@ -3729,7 +3729,7 @@
       <w:tr>
         <w:tc>
           <w:tcPr>
-            <w:tcW w:type="dxa" w:w="283"/>
+            <w:tcW w:type="dxa" w:w="170"/>
             <w:shd w:val="clear" w:color="auto" w:fill="FFFFFF"/>
             <w:tcBorders>
               <w:top w:val="single" w:sz="4" w:space="0" w:color="AAAAAA"/>
@@ -3755,7 +3755,7 @@
         </w:tc>
         <w:tc>
           <w:tcPr>
-            <w:tcW w:type="dxa" w:w="4365"/>
+            <w:tcW w:type="dxa" w:w="4479"/>
             <w:shd w:val="clear" w:color="auto" w:fill="FFFFFF"/>
             <w:tcBorders>
               <w:top w:val="single" w:sz="4" w:space="0" w:color="AAAAAA"/>
@@ -3809,7 +3809,7 @@
       <w:tr>
         <w:tc>
           <w:tcPr>
-            <w:tcW w:type="dxa" w:w="283"/>
+            <w:tcW w:type="dxa" w:w="170"/>
             <w:shd w:val="clear" w:color="auto" w:fill="FFFFFF"/>
             <w:tcBorders>
               <w:top w:val="single" w:sz="4" w:space="0" w:color="AAAAAA"/>
@@ -3835,7 +3835,7 @@
         </w:tc>
         <w:tc>
           <w:tcPr>
-            <w:tcW w:type="dxa" w:w="4365"/>
+            <w:tcW w:type="dxa" w:w="4479"/>
             <w:shd w:val="clear" w:color="auto" w:fill="FFFFFF"/>
             <w:tcBorders>
               <w:top w:val="single" w:sz="4" w:space="0" w:color="AAAAAA"/>
@@ -3889,7 +3889,7 @@
       <w:tr>
         <w:tc>
           <w:tcPr>
-            <w:tcW w:type="dxa" w:w="283"/>
+            <w:tcW w:type="dxa" w:w="170"/>
             <w:shd w:val="clear" w:color="auto" w:fill="FFFFFF"/>
             <w:tcBorders>
               <w:top w:val="single" w:sz="4" w:space="0" w:color="AAAAAA"/>
@@ -3915,7 +3915,7 @@
         </w:tc>
         <w:tc>
           <w:tcPr>
-            <w:tcW w:type="dxa" w:w="4365"/>
+            <w:tcW w:type="dxa" w:w="4479"/>
             <w:shd w:val="clear" w:color="auto" w:fill="FFFFFF"/>
             <w:tcBorders>
               <w:top w:val="single" w:sz="4" w:space="0" w:color="AAAAAA"/>
@@ -3969,7 +3969,7 @@
       <w:tr>
         <w:tc>
           <w:tcPr>
-            <w:tcW w:type="dxa" w:w="283"/>
+            <w:tcW w:type="dxa" w:w="170"/>
             <w:shd w:val="clear" w:color="auto" w:fill="FFFFFF"/>
             <w:tcBorders>
               <w:top w:val="single" w:sz="4" w:space="0" w:color="AAAAAA"/>
@@ -3995,7 +3995,7 @@
         </w:tc>
         <w:tc>
           <w:tcPr>
-            <w:tcW w:type="dxa" w:w="4365"/>
+            <w:tcW w:type="dxa" w:w="4479"/>
             <w:shd w:val="clear" w:color="auto" w:fill="FFFFFF"/>
             <w:tcBorders>
               <w:top w:val="single" w:sz="4" w:space="0" w:color="AAAAAA"/>
@@ -4049,7 +4049,7 @@
       <w:tr>
         <w:tc>
           <w:tcPr>
-            <w:tcW w:type="dxa" w:w="283"/>
+            <w:tcW w:type="dxa" w:w="170"/>
             <w:shd w:val="clear" w:color="auto" w:fill="FFFFFF"/>
             <w:tcBorders>
               <w:top w:val="single" w:sz="4" w:space="0" w:color="AAAAAA"/>
@@ -4075,7 +4075,7 @@
         </w:tc>
         <w:tc>
           <w:tcPr>
-            <w:tcW w:type="dxa" w:w="4365"/>
+            <w:tcW w:type="dxa" w:w="4479"/>
             <w:shd w:val="clear" w:color="auto" w:fill="FFFFFF"/>
             <w:tcBorders>
               <w:top w:val="single" w:sz="4" w:space="0" w:color="AAAAAA"/>
@@ -4129,7 +4129,7 @@
       <w:tr>
         <w:tc>
           <w:tcPr>
-            <w:tcW w:type="dxa" w:w="283"/>
+            <w:tcW w:type="dxa" w:w="170"/>
             <w:shd w:val="clear" w:color="auto" w:fill="FFFFFF"/>
             <w:tcBorders>
               <w:top w:val="single" w:sz="4" w:space="0" w:color="AAAAAA"/>
@@ -4155,7 +4155,7 @@
         </w:tc>
         <w:tc>
           <w:tcPr>
-            <w:tcW w:type="dxa" w:w="4365"/>
+            <w:tcW w:type="dxa" w:w="4479"/>
             <w:shd w:val="clear" w:color="auto" w:fill="FFFFFF"/>
             <w:tcBorders>
               <w:top w:val="single" w:sz="4" w:space="0" w:color="AAAAAA"/>
@@ -4209,7 +4209,7 @@
       <w:tr>
         <w:tc>
           <w:tcPr>
-            <w:tcW w:type="dxa" w:w="283"/>
+            <w:tcW w:type="dxa" w:w="170"/>
             <w:shd w:val="clear" w:color="auto" w:fill="FFFFFF"/>
             <w:tcBorders>
               <w:top w:val="single" w:sz="4" w:space="0" w:color="AAAAAA"/>
@@ -4235,7 +4235,7 @@
         </w:tc>
         <w:tc>
           <w:tcPr>
-            <w:tcW w:type="dxa" w:w="4365"/>
+            <w:tcW w:type="dxa" w:w="4479"/>
             <w:shd w:val="clear" w:color="auto" w:fill="FFFFFF"/>
             <w:tcBorders>
               <w:top w:val="single" w:sz="4" w:space="0" w:color="AAAAAA"/>
@@ -4289,7 +4289,7 @@
       <w:tr>
         <w:tc>
           <w:tcPr>
-            <w:tcW w:type="dxa" w:w="283"/>
+            <w:tcW w:type="dxa" w:w="170"/>
             <w:shd w:val="clear" w:color="auto" w:fill="FFFFFF"/>
             <w:tcBorders>
               <w:top w:val="single" w:sz="4" w:space="0" w:color="AAAAAA"/>
@@ -4315,7 +4315,7 @@
         </w:tc>
         <w:tc>
           <w:tcPr>
-            <w:tcW w:type="dxa" w:w="4365"/>
+            <w:tcW w:type="dxa" w:w="4479"/>
             <w:shd w:val="clear" w:color="auto" w:fill="FFFFFF"/>
             <w:tcBorders>
               <w:top w:val="single" w:sz="4" w:space="0" w:color="AAAAAA"/>
@@ -4369,7 +4369,7 @@
       <w:tr>
         <w:tc>
           <w:tcPr>
-            <w:tcW w:type="dxa" w:w="283"/>
+            <w:tcW w:type="dxa" w:w="170"/>
             <w:shd w:val="clear" w:color="auto" w:fill="FFFFFF"/>
             <w:tcBorders>
               <w:top w:val="single" w:sz="4" w:space="0" w:color="AAAAAA"/>
@@ -4395,7 +4395,7 @@
         </w:tc>
         <w:tc>
           <w:tcPr>
-            <w:tcW w:type="dxa" w:w="4365"/>
+            <w:tcW w:type="dxa" w:w="4479"/>
             <w:shd w:val="clear" w:color="auto" w:fill="FFFFFF"/>
             <w:tcBorders>
               <w:top w:val="single" w:sz="4" w:space="0" w:color="AAAAAA"/>
@@ -4449,7 +4449,7 @@
       <w:tr>
         <w:tc>
           <w:tcPr>
-            <w:tcW w:type="dxa" w:w="283"/>
+            <w:tcW w:type="dxa" w:w="170"/>
             <w:shd w:val="clear" w:color="auto" w:fill="FFFFFF"/>
             <w:tcBorders>
               <w:top w:val="single" w:sz="4" w:space="0" w:color="AAAAAA"/>
@@ -4475,7 +4475,7 @@
         </w:tc>
         <w:tc>
           <w:tcPr>
-            <w:tcW w:type="dxa" w:w="4365"/>
+            <w:tcW w:type="dxa" w:w="4479"/>
             <w:shd w:val="clear" w:color="auto" w:fill="FFFFFF"/>
             <w:tcBorders>
               <w:top w:val="single" w:sz="4" w:space="0" w:color="AAAAAA"/>
@@ -4529,7 +4529,7 @@
       <w:tr>
         <w:tc>
           <w:tcPr>
-            <w:tcW w:type="dxa" w:w="283"/>
+            <w:tcW w:type="dxa" w:w="170"/>
             <w:shd w:val="clear" w:color="auto" w:fill="FFFFFF"/>
             <w:tcBorders>
               <w:top w:val="single" w:sz="4" w:space="0" w:color="AAAAAA"/>
@@ -4555,7 +4555,7 @@
         </w:tc>
         <w:tc>
           <w:tcPr>
-            <w:tcW w:type="dxa" w:w="4365"/>
+            <w:tcW w:type="dxa" w:w="4479"/>
             <w:shd w:val="clear" w:color="auto" w:fill="FFFFFF"/>
             <w:tcBorders>
               <w:top w:val="single" w:sz="4" w:space="0" w:color="AAAAAA"/>
@@ -4609,7 +4609,7 @@
       <w:tr>
         <w:tc>
           <w:tcPr>
-            <w:tcW w:type="dxa" w:w="283"/>
+            <w:tcW w:type="dxa" w:w="170"/>
             <w:shd w:val="clear" w:color="auto" w:fill="D6E4F0"/>
             <w:tcBorders>
               <w:top w:val="single" w:sz="4" w:space="0" w:color="AAAAAA"/>
@@ -4664,7 +4664,7 @@
       <w:tr>
         <w:tc>
           <w:tcPr>
-            <w:tcW w:type="dxa" w:w="283"/>
+            <w:tcW w:type="dxa" w:w="170"/>
             <w:shd w:val="clear" w:color="auto" w:fill="FFFFFF"/>
             <w:tcBorders>
               <w:top w:val="single" w:sz="4" w:space="0" w:color="AAAAAA"/>
@@ -4690,7 +4690,7 @@
         </w:tc>
         <w:tc>
           <w:tcPr>
-            <w:tcW w:type="dxa" w:w="4365"/>
+            <w:tcW w:type="dxa" w:w="4479"/>
             <w:shd w:val="clear" w:color="auto" w:fill="FFFFFF"/>
             <w:tcBorders>
               <w:top w:val="single" w:sz="4" w:space="0" w:color="AAAAAA"/>
@@ -4744,7 +4744,7 @@
       <w:tr>
         <w:tc>
           <w:tcPr>
-            <w:tcW w:type="dxa" w:w="283"/>
+            <w:tcW w:type="dxa" w:w="170"/>
             <w:shd w:val="clear" w:color="auto" w:fill="FFFFFF"/>
             <w:tcBorders>
               <w:top w:val="single" w:sz="4" w:space="0" w:color="AAAAAA"/>
@@ -4770,7 +4770,7 @@
         </w:tc>
         <w:tc>
           <w:tcPr>
-            <w:tcW w:type="dxa" w:w="4365"/>
+            <w:tcW w:type="dxa" w:w="4479"/>
             <w:shd w:val="clear" w:color="auto" w:fill="FFFFFF"/>
             <w:tcBorders>
               <w:top w:val="single" w:sz="4" w:space="0" w:color="AAAAAA"/>
@@ -4824,7 +4824,7 @@
       <w:tr>
         <w:tc>
           <w:tcPr>
-            <w:tcW w:type="dxa" w:w="283"/>
+            <w:tcW w:type="dxa" w:w="170"/>
             <w:shd w:val="clear" w:color="auto" w:fill="FFFFFF"/>
             <w:tcBorders>
               <w:top w:val="single" w:sz="4" w:space="0" w:color="AAAAAA"/>
@@ -4850,7 +4850,7 @@
         </w:tc>
         <w:tc>
           <w:tcPr>
-            <w:tcW w:type="dxa" w:w="4365"/>
+            <w:tcW w:type="dxa" w:w="4479"/>
             <w:shd w:val="clear" w:color="auto" w:fill="FFFFFF"/>
             <w:tcBorders>
               <w:top w:val="single" w:sz="4" w:space="0" w:color="AAAAAA"/>
@@ -4904,7 +4904,7 @@
       <w:tr>
         <w:tc>
           <w:tcPr>
-            <w:tcW w:type="dxa" w:w="283"/>
+            <w:tcW w:type="dxa" w:w="170"/>
             <w:shd w:val="clear" w:color="auto" w:fill="D6E4F0"/>
             <w:tcBorders>
               <w:top w:val="single" w:sz="4" w:space="0" w:color="AAAAAA"/>
@@ -4959,7 +4959,7 @@
       <w:tr>
         <w:tc>
           <w:tcPr>
-            <w:tcW w:type="dxa" w:w="283"/>
+            <w:tcW w:type="dxa" w:w="170"/>
             <w:shd w:val="clear" w:color="auto" w:fill="FFFFFF"/>
             <w:tcBorders>
               <w:top w:val="single" w:sz="4" w:space="0" w:color="AAAAAA"/>
@@ -4985,7 +4985,7 @@
         </w:tc>
         <w:tc>
           <w:tcPr>
-            <w:tcW w:type="dxa" w:w="4365"/>
+            <w:tcW w:type="dxa" w:w="4479"/>
             <w:shd w:val="clear" w:color="auto" w:fill="FFFFFF"/>
             <w:tcBorders>
               <w:top w:val="single" w:sz="4" w:space="0" w:color="AAAAAA"/>
@@ -5039,7 +5039,7 @@
       <w:tr>
         <w:tc>
           <w:tcPr>
-            <w:tcW w:type="dxa" w:w="283"/>
+            <w:tcW w:type="dxa" w:w="170"/>
             <w:shd w:val="clear" w:color="auto" w:fill="FFFFFF"/>
             <w:tcBorders>
               <w:top w:val="single" w:sz="4" w:space="0" w:color="AAAAAA"/>
@@ -5065,7 +5065,7 @@
         </w:tc>
         <w:tc>
           <w:tcPr>
-            <w:tcW w:type="dxa" w:w="4365"/>
+            <w:tcW w:type="dxa" w:w="4479"/>
             <w:shd w:val="clear" w:color="auto" w:fill="FFFFFF"/>
             <w:tcBorders>
               <w:top w:val="single" w:sz="4" w:space="0" w:color="AAAAAA"/>
@@ -5119,7 +5119,7 @@
       <w:tr>
         <w:tc>
           <w:tcPr>
-            <w:tcW w:type="dxa" w:w="283"/>
+            <w:tcW w:type="dxa" w:w="170"/>
             <w:shd w:val="clear" w:color="auto" w:fill="FFFFFF"/>
             <w:tcBorders>
               <w:top w:val="single" w:sz="4" w:space="0" w:color="AAAAAA"/>
@@ -5145,7 +5145,7 @@
         </w:tc>
         <w:tc>
           <w:tcPr>
-            <w:tcW w:type="dxa" w:w="4365"/>
+            <w:tcW w:type="dxa" w:w="4479"/>
             <w:shd w:val="clear" w:color="auto" w:fill="FFFFFF"/>
             <w:tcBorders>
               <w:top w:val="single" w:sz="4" w:space="0" w:color="AAAAAA"/>
@@ -5199,7 +5199,7 @@
       <w:tr>
         <w:tc>
           <w:tcPr>
-            <w:tcW w:type="dxa" w:w="283"/>
+            <w:tcW w:type="dxa" w:w="170"/>
             <w:shd w:val="clear" w:color="auto" w:fill="FFFFFF"/>
             <w:tcBorders>
               <w:top w:val="single" w:sz="4" w:space="0" w:color="AAAAAA"/>
@@ -5225,7 +5225,7 @@
         </w:tc>
         <w:tc>
           <w:tcPr>
-            <w:tcW w:type="dxa" w:w="4365"/>
+            <w:tcW w:type="dxa" w:w="4479"/>
             <w:shd w:val="clear" w:color="auto" w:fill="FFFFFF"/>
             <w:tcBorders>
               <w:top w:val="single" w:sz="4" w:space="0" w:color="AAAAAA"/>
@@ -5279,7 +5279,7 @@
       <w:tr>
         <w:tc>
           <w:tcPr>
-            <w:tcW w:type="dxa" w:w="283"/>
+            <w:tcW w:type="dxa" w:w="170"/>
             <w:shd w:val="clear" w:color="auto" w:fill="FFFFFF"/>
             <w:tcBorders>
               <w:top w:val="single" w:sz="4" w:space="0" w:color="AAAAAA"/>
@@ -5305,7 +5305,7 @@
         </w:tc>
         <w:tc>
           <w:tcPr>
-            <w:tcW w:type="dxa" w:w="4365"/>
+            <w:tcW w:type="dxa" w:w="4479"/>
             <w:shd w:val="clear" w:color="auto" w:fill="FFFFFF"/>
             <w:tcBorders>
               <w:top w:val="single" w:sz="4" w:space="0" w:color="AAAAAA"/>
@@ -5359,7 +5359,7 @@
       <w:tr>
         <w:tc>
           <w:tcPr>
-            <w:tcW w:type="dxa" w:w="283"/>
+            <w:tcW w:type="dxa" w:w="170"/>
             <w:shd w:val="clear" w:color="auto" w:fill="D6E4F0"/>
             <w:tcBorders>
               <w:top w:val="single" w:sz="4" w:space="0" w:color="AAAAAA"/>
@@ -5414,7 +5414,7 @@
       <w:tr>
         <w:tc>
           <w:tcPr>
-            <w:tcW w:type="dxa" w:w="283"/>
+            <w:tcW w:type="dxa" w:w="170"/>
             <w:shd w:val="clear" w:color="auto" w:fill="FFFFFF"/>
             <w:tcBorders>
               <w:top w:val="single" w:sz="4" w:space="0" w:color="AAAAAA"/>
@@ -5440,7 +5440,7 @@
         </w:tc>
         <w:tc>
           <w:tcPr>
-            <w:tcW w:type="dxa" w:w="4365"/>
+            <w:tcW w:type="dxa" w:w="4479"/>
             <w:shd w:val="clear" w:color="auto" w:fill="FFFFFF"/>
             <w:tcBorders>
               <w:top w:val="single" w:sz="4" w:space="0" w:color="AAAAAA"/>
@@ -5494,7 +5494,7 @@
       <w:tr>
         <w:tc>
           <w:tcPr>
-            <w:tcW w:type="dxa" w:w="283"/>
+            <w:tcW w:type="dxa" w:w="170"/>
             <w:shd w:val="clear" w:color="auto" w:fill="FFFFFF"/>
             <w:tcBorders>
               <w:top w:val="single" w:sz="4" w:space="0" w:color="AAAAAA"/>
@@ -5520,7 +5520,7 @@
         </w:tc>
         <w:tc>
           <w:tcPr>
-            <w:tcW w:type="dxa" w:w="4365"/>
+            <w:tcW w:type="dxa" w:w="4479"/>
             <w:shd w:val="clear" w:color="auto" w:fill="FFFFFF"/>
             <w:tcBorders>
               <w:top w:val="single" w:sz="4" w:space="0" w:color="AAAAAA"/>
@@ -5574,7 +5574,7 @@
       <w:tr>
         <w:tc>
           <w:tcPr>
-            <w:tcW w:type="dxa" w:w="283"/>
+            <w:tcW w:type="dxa" w:w="170"/>
             <w:shd w:val="clear" w:color="auto" w:fill="FFFFFF"/>
             <w:tcBorders>
               <w:top w:val="single" w:sz="4" w:space="0" w:color="AAAAAA"/>
@@ -5600,7 +5600,7 @@
         </w:tc>
         <w:tc>
           <w:tcPr>
-            <w:tcW w:type="dxa" w:w="4365"/>
+            <w:tcW w:type="dxa" w:w="4479"/>
             <w:shd w:val="clear" w:color="auto" w:fill="FFFFFF"/>
             <w:tcBorders>
               <w:top w:val="single" w:sz="4" w:space="0" w:color="AAAAAA"/>
@@ -5683,7 +5683,7 @@
       <w:tr>
         <w:tc>
           <w:tcPr>
-            <w:tcW w:type="dxa" w:w="283"/>
+            <w:tcW w:type="dxa" w:w="170"/>
             <w:shd w:val="clear" w:color="auto" w:fill="FFFFFF"/>
             <w:tcBorders>
               <w:top w:val="single" w:sz="4" w:space="0" w:color="AAAAAA"/>
@@ -5709,7 +5709,7 @@
         </w:tc>
         <w:tc>
           <w:tcPr>
-            <w:tcW w:type="dxa" w:w="4365"/>
+            <w:tcW w:type="dxa" w:w="4479"/>
             <w:shd w:val="clear" w:color="auto" w:fill="FFFFFF"/>
             <w:tcBorders>
               <w:top w:val="single" w:sz="4" w:space="0" w:color="AAAAAA"/>
@@ -5824,7 +5824,7 @@
       <w:tr>
         <w:tc>
           <w:tcPr>
-            <w:tcW w:type="dxa" w:w="283"/>
+            <w:tcW w:type="dxa" w:w="170"/>
             <w:shd w:val="clear" w:color="auto" w:fill="FFFFFF"/>
             <w:tcBorders>
               <w:top w:val="single" w:sz="4" w:space="0" w:color="AAAAAA"/>
@@ -5850,7 +5850,7 @@
         </w:tc>
         <w:tc>
           <w:tcPr>
-            <w:tcW w:type="dxa" w:w="4365"/>
+            <w:tcW w:type="dxa" w:w="4479"/>
             <w:shd w:val="clear" w:color="auto" w:fill="FFFFFF"/>
             <w:tcBorders>
               <w:top w:val="single" w:sz="4" w:space="0" w:color="AAAAAA"/>
@@ -5904,7 +5904,7 @@
       <w:tr>
         <w:tc>
           <w:tcPr>
-            <w:tcW w:type="dxa" w:w="283"/>
+            <w:tcW w:type="dxa" w:w="170"/>
             <w:shd w:val="clear" w:color="auto" w:fill="FFFFFF"/>
             <w:tcBorders>
               <w:top w:val="single" w:sz="4" w:space="0" w:color="AAAAAA"/>
@@ -5930,7 +5930,7 @@
         </w:tc>
         <w:tc>
           <w:tcPr>
-            <w:tcW w:type="dxa" w:w="4365"/>
+            <w:tcW w:type="dxa" w:w="4479"/>
             <w:shd w:val="clear" w:color="auto" w:fill="FFFFFF"/>
             <w:tcBorders>
               <w:top w:val="single" w:sz="4" w:space="0" w:color="AAAAAA"/>
@@ -5984,7 +5984,7 @@
       <w:tr>
         <w:tc>
           <w:tcPr>
-            <w:tcW w:type="dxa" w:w="283"/>
+            <w:tcW w:type="dxa" w:w="170"/>
             <w:shd w:val="clear" w:color="auto" w:fill="FFFFFF"/>
             <w:tcBorders>
               <w:top w:val="single" w:sz="4" w:space="0" w:color="AAAAAA"/>
@@ -6010,7 +6010,7 @@
         </w:tc>
         <w:tc>
           <w:tcPr>
-            <w:tcW w:type="dxa" w:w="4365"/>
+            <w:tcW w:type="dxa" w:w="4479"/>
             <w:shd w:val="clear" w:color="auto" w:fill="FFFFFF"/>
             <w:tcBorders>
               <w:top w:val="single" w:sz="4" w:space="0" w:color="AAAAAA"/>
@@ -6064,7 +6064,7 @@
       <w:tr>
         <w:tc>
           <w:tcPr>
-            <w:tcW w:type="dxa" w:w="283"/>
+            <w:tcW w:type="dxa" w:w="170"/>
             <w:shd w:val="clear" w:color="auto" w:fill="FFFFFF"/>
             <w:tcBorders>
               <w:top w:val="single" w:sz="4" w:space="0" w:color="AAAAAA"/>
@@ -6090,7 +6090,7 @@
         </w:tc>
         <w:tc>
           <w:tcPr>
-            <w:tcW w:type="dxa" w:w="4365"/>
+            <w:tcW w:type="dxa" w:w="4479"/>
             <w:shd w:val="clear" w:color="auto" w:fill="FFFFFF"/>
             <w:tcBorders>
               <w:top w:val="single" w:sz="4" w:space="0" w:color="AAAAAA"/>
@@ -6144,7 +6144,7 @@
       <w:tr>
         <w:tc>
           <w:tcPr>
-            <w:tcW w:type="dxa" w:w="283"/>
+            <w:tcW w:type="dxa" w:w="170"/>
             <w:shd w:val="clear" w:color="auto" w:fill="FFFFFF"/>
             <w:tcBorders>
               <w:top w:val="single" w:sz="4" w:space="0" w:color="AAAAAA"/>
@@ -6170,7 +6170,7 @@
         </w:tc>
         <w:tc>
           <w:tcPr>
-            <w:tcW w:type="dxa" w:w="4365"/>
+            <w:tcW w:type="dxa" w:w="4479"/>
             <w:shd w:val="clear" w:color="auto" w:fill="FFFFFF"/>
             <w:tcBorders>
               <w:top w:val="single" w:sz="4" w:space="0" w:color="AAAAAA"/>
@@ -6224,7 +6224,7 @@
       <w:tr>
         <w:tc>
           <w:tcPr>
-            <w:tcW w:type="dxa" w:w="283"/>
+            <w:tcW w:type="dxa" w:w="170"/>
             <w:shd w:val="clear" w:color="auto" w:fill="FFFFFF"/>
             <w:tcBorders>
               <w:top w:val="single" w:sz="4" w:space="0" w:color="AAAAAA"/>
@@ -6250,7 +6250,7 @@
         </w:tc>
         <w:tc>
           <w:tcPr>
-            <w:tcW w:type="dxa" w:w="4365"/>
+            <w:tcW w:type="dxa" w:w="4479"/>
             <w:shd w:val="clear" w:color="auto" w:fill="FFFFFF"/>
             <w:tcBorders>
               <w:top w:val="single" w:sz="4" w:space="0" w:color="AAAAAA"/>
@@ -6304,7 +6304,7 @@
       <w:tr>
         <w:tc>
           <w:tcPr>
-            <w:tcW w:type="dxa" w:w="283"/>
+            <w:tcW w:type="dxa" w:w="170"/>
             <w:shd w:val="clear" w:color="auto" w:fill="FFFFFF"/>
             <w:tcBorders>
               <w:top w:val="single" w:sz="4" w:space="0" w:color="AAAAAA"/>
@@ -6330,7 +6330,7 @@
         </w:tc>
         <w:tc>
           <w:tcPr>
-            <w:tcW w:type="dxa" w:w="4365"/>
+            <w:tcW w:type="dxa" w:w="4479"/>
             <w:shd w:val="clear" w:color="auto" w:fill="FFFFFF"/>
             <w:tcBorders>
               <w:top w:val="single" w:sz="4" w:space="0" w:color="AAAAAA"/>
@@ -6412,7 +6412,7 @@
       <w:tr>
         <w:tc>
           <w:tcPr>
-            <w:tcW w:type="dxa" w:w="283"/>
+            <w:tcW w:type="dxa" w:w="170"/>
             <w:shd w:val="clear" w:color="auto" w:fill="FFFFFF"/>
             <w:tcBorders>
               <w:top w:val="single" w:sz="4" w:space="0" w:color="AAAAAA"/>
@@ -6438,7 +6438,7 @@
         </w:tc>
         <w:tc>
           <w:tcPr>
-            <w:tcW w:type="dxa" w:w="4365"/>
+            <w:tcW w:type="dxa" w:w="4479"/>
             <w:shd w:val="clear" w:color="auto" w:fill="FFFFFF"/>
             <w:tcBorders>
               <w:top w:val="single" w:sz="4" w:space="0" w:color="AAAAAA"/>
@@ -6494,7 +6494,7 @@
       <w:tr>
         <w:tc>
           <w:tcPr>
-            <w:tcW w:type="dxa" w:w="283"/>
+            <w:tcW w:type="dxa" w:w="170"/>
             <w:shd w:val="clear" w:color="auto" w:fill="FFFFFF"/>
             <w:tcBorders>
               <w:top w:val="single" w:sz="4" w:space="0" w:color="AAAAAA"/>
@@ -6520,7 +6520,7 @@
         </w:tc>
         <w:tc>
           <w:tcPr>
-            <w:tcW w:type="dxa" w:w="4365"/>
+            <w:tcW w:type="dxa" w:w="4479"/>
             <w:shd w:val="clear" w:color="auto" w:fill="FFFFFF"/>
             <w:tcBorders>
               <w:top w:val="single" w:sz="4" w:space="0" w:color="AAAAAA"/>
@@ -6576,7 +6576,7 @@
       <w:tr>
         <w:tc>
           <w:tcPr>
-            <w:tcW w:type="dxa" w:w="283"/>
+            <w:tcW w:type="dxa" w:w="170"/>
             <w:shd w:val="clear" w:color="auto" w:fill="FFFFFF"/>
             <w:tcBorders>
               <w:top w:val="single" w:sz="4" w:space="0" w:color="AAAAAA"/>
@@ -6601,7 +6601,7 @@
         </w:tc>
         <w:tc>
           <w:tcPr>
-            <w:tcW w:type="dxa" w:w="4365"/>
+            <w:tcW w:type="dxa" w:w="4479"/>
             <w:shd w:val="clear" w:color="auto" w:fill="FFFFFF"/>
             <w:tcBorders>
               <w:top w:val="single" w:sz="4" w:space="0" w:color="AAAAAA"/>
@@ -6655,7 +6655,7 @@
       <w:tr>
         <w:tc>
           <w:tcPr>
-            <w:tcW w:type="dxa" w:w="283"/>
+            <w:tcW w:type="dxa" w:w="170"/>
             <w:shd w:val="clear" w:color="auto" w:fill="FFFFFF"/>
             <w:tcBorders>
               <w:top w:val="single" w:sz="4" w:space="0" w:color="AAAAAA"/>
@@ -6681,7 +6681,7 @@
         </w:tc>
         <w:tc>
           <w:tcPr>
-            <w:tcW w:type="dxa" w:w="4365"/>
+            <w:tcW w:type="dxa" w:w="4479"/>
             <w:shd w:val="clear" w:color="auto" w:fill="FFFFFF"/>
             <w:tcBorders>
               <w:top w:val="single" w:sz="4" w:space="0" w:color="AAAAAA"/>
@@ -6735,7 +6735,7 @@
       <w:tr>
         <w:tc>
           <w:tcPr>
-            <w:tcW w:type="dxa" w:w="283"/>
+            <w:tcW w:type="dxa" w:w="170"/>
             <w:shd w:val="clear" w:color="auto" w:fill="FFFFFF"/>
             <w:tcBorders>
               <w:top w:val="single" w:sz="4" w:space="0" w:color="AAAAAA"/>
@@ -6761,7 +6761,7 @@
         </w:tc>
         <w:tc>
           <w:tcPr>
-            <w:tcW w:type="dxa" w:w="4365"/>
+            <w:tcW w:type="dxa" w:w="4479"/>
             <w:shd w:val="clear" w:color="auto" w:fill="FFFFFF"/>
             <w:tcBorders>
               <w:top w:val="single" w:sz="4" w:space="0" w:color="AAAAAA"/>
@@ -6843,7 +6843,7 @@
       <w:tr>
         <w:tc>
           <w:tcPr>
-            <w:tcW w:type="dxa" w:w="283"/>
+            <w:tcW w:type="dxa" w:w="170"/>
             <w:shd w:val="clear" w:color="auto" w:fill="FFFFFF"/>
             <w:tcBorders>
               <w:top w:val="single" w:sz="4" w:space="0" w:color="AAAAAA"/>
@@ -6868,7 +6868,7 @@
         </w:tc>
         <w:tc>
           <w:tcPr>
-            <w:tcW w:type="dxa" w:w="4365"/>
+            <w:tcW w:type="dxa" w:w="4479"/>
             <w:shd w:val="clear" w:color="auto" w:fill="FFFFFF"/>
             <w:tcBorders>
               <w:top w:val="single" w:sz="4" w:space="0" w:color="AAAAAA"/>
@@ -6924,7 +6924,7 @@
       <w:tr>
         <w:tc>
           <w:tcPr>
-            <w:tcW w:type="dxa" w:w="283"/>
+            <w:tcW w:type="dxa" w:w="170"/>
             <w:shd w:val="clear" w:color="auto" w:fill="FFFFFF"/>
             <w:tcBorders>
               <w:top w:val="single" w:sz="4" w:space="0" w:color="AAAAAA"/>
@@ -6949,7 +6949,7 @@
         </w:tc>
         <w:tc>
           <w:tcPr>
-            <w:tcW w:type="dxa" w:w="4365"/>
+            <w:tcW w:type="dxa" w:w="4479"/>
             <w:shd w:val="clear" w:color="auto" w:fill="FFFFFF"/>
             <w:tcBorders>
               <w:top w:val="single" w:sz="4" w:space="0" w:color="AAAAAA"/>

</xml_diff>

<commit_message>
Fix SR column width: write tblGrid + tblW + tcW in proper DXA units
python-docx's cell.width doesn't write tblGrid (which Word requires for
tblLayout=fixed to enforce column widths). Now explicitly set:
  - w:tblW (total width, 9638 DXA / 17 cm)
  - w:tblGrid with gridCol for each column (170 / 4479 / 4989 DXA)
  - w:tcW on every w:tc, handling merged cells by summing spanned cols

SR column is now 0.3 cm as intended.

Co-Authored-By: Claude Sonnet 4.6 <noreply@anthropic.com>
</commit_message>
<xml_diff>
--- a/casad_template.docx
+++ b/casad_template.docx
@@ -33,14 +33,14 @@
     <w:tbl>
       <w:tblPr>
         <w:tblStyle w:val="TableGrid"/>
-        <w:tblW w:type="auto" w:w="0"/>
         <w:tblLook w:firstColumn="1" w:firstRow="1" w:lastColumn="0" w:lastRow="0" w:noHBand="0" w:noVBand="1" w:val="04A0"/>
+        <w:tblW w:w="9638" w:type="dxa"/>
         <w:tblLayout w:type="fixed"/>
       </w:tblPr>
       <w:tblGrid>
-        <w:gridCol w:w="3213"/>
-        <w:gridCol w:w="3213"/>
-        <w:gridCol w:w="3213"/>
+        <w:gridCol w:w="170"/>
+        <w:gridCol w:w="4479"/>
+        <w:gridCol w:w="4989"/>
       </w:tblGrid>
       <w:tr>
         <w:tc>
@@ -127,7 +127,7 @@
       <w:tr>
         <w:tc>
           <w:tcPr>
-            <w:tcW w:type="dxa" w:w="4989"/>
+            <w:tcW w:type="dxa" w:w="9638"/>
             <w:gridSpan w:val="3"/>
             <w:shd w:val="clear" w:color="auto" w:fill="1F3864"/>
             <w:tcBorders>
@@ -1776,7 +1776,7 @@
       <w:tr>
         <w:tc>
           <w:tcPr>
-            <w:tcW w:type="dxa" w:w="4989"/>
+            <w:tcW w:type="dxa" w:w="9638"/>
             <w:gridSpan w:val="3"/>
             <w:shd w:val="clear" w:color="auto" w:fill="1F3864"/>
             <w:tcBorders>
@@ -1911,7 +1911,7 @@
         </w:tc>
         <w:tc>
           <w:tcPr>
-            <w:tcW w:type="dxa" w:w="4989"/>
+            <w:tcW w:type="dxa" w:w="9468"/>
             <w:gridSpan w:val="2"/>
             <w:shd w:val="clear" w:color="auto" w:fill="D6E4F0"/>
             <w:tcBorders>
@@ -2766,7 +2766,7 @@
         </w:tc>
         <w:tc>
           <w:tcPr>
-            <w:tcW w:type="dxa" w:w="4989"/>
+            <w:tcW w:type="dxa" w:w="9468"/>
             <w:gridSpan w:val="2"/>
             <w:shd w:val="clear" w:color="auto" w:fill="D6E4F0"/>
             <w:tcBorders>
@@ -3621,7 +3621,7 @@
         </w:tc>
         <w:tc>
           <w:tcPr>
-            <w:tcW w:type="dxa" w:w="4989"/>
+            <w:tcW w:type="dxa" w:w="9468"/>
             <w:gridSpan w:val="2"/>
             <w:shd w:val="clear" w:color="auto" w:fill="D6E4F0"/>
             <w:tcBorders>
@@ -4636,7 +4636,7 @@
         </w:tc>
         <w:tc>
           <w:tcPr>
-            <w:tcW w:type="dxa" w:w="4989"/>
+            <w:tcW w:type="dxa" w:w="9468"/>
             <w:gridSpan w:val="2"/>
             <w:shd w:val="clear" w:color="auto" w:fill="D6E4F0"/>
             <w:tcBorders>
@@ -4931,7 +4931,7 @@
         </w:tc>
         <w:tc>
           <w:tcPr>
-            <w:tcW w:type="dxa" w:w="4989"/>
+            <w:tcW w:type="dxa" w:w="9468"/>
             <w:gridSpan w:val="2"/>
             <w:shd w:val="clear" w:color="auto" w:fill="D6E4F0"/>
             <w:tcBorders>
@@ -5386,7 +5386,7 @@
         </w:tc>
         <w:tc>
           <w:tcPr>
-            <w:tcW w:type="dxa" w:w="4989"/>
+            <w:tcW w:type="dxa" w:w="9468"/>
             <w:gridSpan w:val="2"/>
             <w:shd w:val="clear" w:color="auto" w:fill="D6E4F0"/>
             <w:tcBorders>
@@ -5655,7 +5655,7 @@
       <w:tr>
         <w:tc>
           <w:tcPr>
-            <w:tcW w:type="dxa" w:w="4989"/>
+            <w:tcW w:type="dxa" w:w="9638"/>
             <w:gridSpan w:val="3"/>
             <w:shd w:val="clear" w:color="auto" w:fill="1F3864"/>
             <w:tcBorders>
@@ -5766,7 +5766,7 @@
       <w:tr>
         <w:tc>
           <w:tcPr>
-            <w:tcW w:type="dxa" w:w="4989"/>
+            <w:tcW w:type="dxa" w:w="9638"/>
             <w:gridSpan w:val="3"/>
             <w:shd w:val="clear" w:color="auto" w:fill="1F3864"/>
             <w:tcBorders>
@@ -5797,7 +5797,7 @@
       <w:tr>
         <w:tc>
           <w:tcPr>
-            <w:tcW w:type="dxa" w:w="4989"/>
+            <w:tcW w:type="dxa" w:w="9638"/>
             <w:gridSpan w:val="3"/>
             <w:shd w:val="clear" w:color="auto" w:fill="D6E4F0"/>
             <w:tcBorders>
@@ -6385,7 +6385,7 @@
       <w:tr>
         <w:tc>
           <w:tcPr>
-            <w:tcW w:type="dxa" w:w="4989"/>
+            <w:tcW w:type="dxa" w:w="9638"/>
             <w:gridSpan w:val="3"/>
             <w:shd w:val="clear" w:color="auto" w:fill="D6E4F0"/>
             <w:tcBorders>
@@ -6816,7 +6816,7 @@
       <w:tr>
         <w:tc>
           <w:tcPr>
-            <w:tcW w:type="dxa" w:w="4989"/>
+            <w:tcW w:type="dxa" w:w="9638"/>
             <w:gridSpan w:val="3"/>
             <w:shd w:val="clear" w:color="auto" w:fill="D6E4F0"/>
             <w:tcBorders>

</xml_diff>